<commit_message>
added paper trails for auditing
</commit_message>
<xml_diff>
--- a/bachelor-projekt-rapport-munchora.docx
+++ b/bachelor-projekt-rapport-munchora.docx
@@ -290,7 +290,6 @@
           <w:rFonts w:eastAsia="Times New Roman" w:cs="Arial"/>
           <w:color w:val="000000" w:themeColor="text1"/>
           <w:kern w:val="0"/>
-          <w:lang w:val="da-DK"/>
           <w14:ligatures w14:val="none"/>
         </w:rPr>
       </w:pPr>
@@ -301,7 +300,6 @@
           <w:bCs/>
           <w:color w:val="000000" w:themeColor="text1"/>
           <w:kern w:val="0"/>
-          <w:lang w:val="da-DK"/>
           <w14:ligatures w14:val="none"/>
         </w:rPr>
         <w:t>Site</w:t>
@@ -315,7 +313,6 @@
           <w:kern w:val="0"/>
           <w:sz w:val="28"/>
           <w:szCs w:val="28"/>
-          <w:lang w:val="da-DK"/>
           <w14:ligatures w14:val="none"/>
         </w:rPr>
         <w:tab/>
@@ -329,7 +326,6 @@
           <w:kern w:val="0"/>
           <w:sz w:val="28"/>
           <w:szCs w:val="28"/>
-          <w:lang w:val="da-DK"/>
           <w14:ligatures w14:val="none"/>
         </w:rPr>
         <w:tab/>
@@ -343,7 +339,6 @@
           <w:kern w:val="0"/>
           <w:sz w:val="28"/>
           <w:szCs w:val="28"/>
-          <w:lang w:val="da-DK"/>
           <w14:ligatures w14:val="none"/>
         </w:rPr>
         <w:tab/>
@@ -357,7 +352,6 @@
           <w:kern w:val="0"/>
           <w:sz w:val="28"/>
           <w:szCs w:val="28"/>
-          <w:lang w:val="da-DK"/>
           <w14:ligatures w14:val="none"/>
         </w:rPr>
         <w:tab/>
@@ -368,7 +362,6 @@
             <w:rStyle w:val="Hyperlink"/>
             <w:rFonts w:eastAsia="Times New Roman" w:cs="Arial"/>
             <w:kern w:val="0"/>
-            <w:lang w:val="da-DK"/>
             <w14:ligatures w14:val="none"/>
           </w:rPr>
           <w:t>https://munchora.pro</w:t>
@@ -384,7 +377,6 @@
           <w:bCs/>
           <w:color w:val="000000" w:themeColor="text1"/>
           <w:kern w:val="0"/>
-          <w:lang w:val="da-DK"/>
           <w14:ligatures w14:val="none"/>
         </w:rPr>
       </w:pPr>
@@ -396,7 +388,6 @@
           <w:rFonts w:eastAsia="Times New Roman" w:cs="Arial"/>
           <w:color w:val="000000" w:themeColor="text1"/>
           <w:kern w:val="0"/>
-          <w:lang w:val="da-DK"/>
           <w14:ligatures w14:val="none"/>
         </w:rPr>
       </w:pPr>
@@ -409,7 +400,6 @@
           <w:iCs/>
           <w:color w:val="000000" w:themeColor="text1"/>
           <w:kern w:val="0"/>
-          <w:lang w:val="da-DK"/>
           <w14:ligatures w14:val="none"/>
         </w:rPr>
         <w:t>Alexander Christensen</w:t>
@@ -419,7 +409,6 @@
           <w:rFonts w:eastAsia="Times New Roman" w:cs="Arial"/>
           <w:color w:val="000000" w:themeColor="text1"/>
           <w:kern w:val="0"/>
-          <w:lang w:val="da-DK"/>
           <w14:ligatures w14:val="none"/>
         </w:rPr>
         <w:t xml:space="preserve"> </w:t>
@@ -429,7 +418,6 @@
           <w:rFonts w:eastAsia="Times New Roman" w:cs="Arial"/>
           <w:color w:val="000000" w:themeColor="text1"/>
           <w:kern w:val="0"/>
-          <w:lang w:val="da-DK"/>
           <w14:ligatures w14:val="none"/>
         </w:rPr>
         <w:tab/>
@@ -440,7 +428,6 @@
             <w:rStyle w:val="Hyperlink"/>
             <w:rFonts w:eastAsia="Times New Roman" w:cs="Arial"/>
             <w:kern w:val="0"/>
-            <w:lang w:val="da-DK"/>
             <w14:ligatures w14:val="none"/>
           </w:rPr>
           <w:t>https://github.com/realkoder</w:t>
@@ -454,7 +441,6 @@
           <w:rFonts w:eastAsia="Times New Roman" w:cs="Arial"/>
           <w:color w:val="000000" w:themeColor="text1"/>
           <w:kern w:val="0"/>
-          <w:lang w:val="da-DK"/>
           <w14:ligatures w14:val="none"/>
         </w:rPr>
       </w:pPr>
@@ -681,7 +667,7 @@
             </w:rPr>
             <w:fldChar w:fldCharType="separate"/>
           </w:r>
-          <w:hyperlink w:anchor="_Toc224464547" w:history="1">
+          <w:hyperlink w:anchor="_Toc224764703" w:history="1">
             <w:r>
               <w:rPr>
                 <w:rStyle w:val="Hyperlink"/>
@@ -709,7 +695,7 @@
                 <w:noProof/>
                 <w:webHidden/>
               </w:rPr>
-              <w:instrText xml:space="preserve"> PAGEREF _Toc224464547 \h </w:instrText>
+              <w:instrText xml:space="preserve"> PAGEREF _Toc224764703 \h </w:instrText>
             </w:r>
             <w:r>
               <w:rPr>
@@ -756,7 +742,7 @@
               <w:szCs w:val="24"/>
             </w:rPr>
           </w:pPr>
-          <w:hyperlink w:anchor="_Toc224464548" w:history="1">
+          <w:hyperlink w:anchor="_Toc224764704" w:history="1">
             <w:r>
               <w:rPr>
                 <w:rStyle w:val="Hyperlink"/>
@@ -784,7 +770,7 @@
                 <w:noProof/>
                 <w:webHidden/>
               </w:rPr>
-              <w:instrText xml:space="preserve"> PAGEREF _Toc224464548 \h </w:instrText>
+              <w:instrText xml:space="preserve"> PAGEREF _Toc224764704 \h </w:instrText>
             </w:r>
             <w:r>
               <w:rPr>
@@ -831,7 +817,7 @@
               <w:color w:val="auto"/>
             </w:rPr>
           </w:pPr>
-          <w:hyperlink w:anchor="_Toc224464549" w:history="1">
+          <w:hyperlink w:anchor="_Toc224764705" w:history="1">
             <w:r>
               <w:rPr>
                 <w:rStyle w:val="Hyperlink"/>
@@ -859,7 +845,7 @@
                 <w:noProof/>
                 <w:webHidden/>
               </w:rPr>
-              <w:instrText xml:space="preserve"> PAGEREF _Toc224464549 \h </w:instrText>
+              <w:instrText xml:space="preserve"> PAGEREF _Toc224764705 \h </w:instrText>
             </w:r>
             <w:r>
               <w:rPr>
@@ -906,7 +892,7 @@
               <w:szCs w:val="24"/>
             </w:rPr>
           </w:pPr>
-          <w:hyperlink w:anchor="_Toc224464550" w:history="1">
+          <w:hyperlink w:anchor="_Toc224764706" w:history="1">
             <w:r>
               <w:rPr>
                 <w:rStyle w:val="Hyperlink"/>
@@ -934,7 +920,7 @@
                 <w:noProof/>
                 <w:webHidden/>
               </w:rPr>
-              <w:instrText xml:space="preserve"> PAGEREF _Toc224464550 \h </w:instrText>
+              <w:instrText xml:space="preserve"> PAGEREF _Toc224764706 \h </w:instrText>
             </w:r>
             <w:r>
               <w:rPr>
@@ -979,7 +965,7 @@
               <w:szCs w:val="24"/>
             </w:rPr>
           </w:pPr>
-          <w:hyperlink w:anchor="_Toc224464551" w:history="1">
+          <w:hyperlink w:anchor="_Toc224764707" w:history="1">
             <w:r>
               <w:rPr>
                 <w:rStyle w:val="Hyperlink"/>
@@ -1006,7 +992,7 @@
                 <w:noProof/>
                 <w:webHidden/>
               </w:rPr>
-              <w:instrText xml:space="preserve"> PAGEREF _Toc224464551 \h </w:instrText>
+              <w:instrText xml:space="preserve"> PAGEREF _Toc224764707 \h </w:instrText>
             </w:r>
             <w:r>
               <w:rPr>
@@ -1051,7 +1037,7 @@
               <w:szCs w:val="24"/>
             </w:rPr>
           </w:pPr>
-          <w:hyperlink w:anchor="_Toc224464552" w:history="1">
+          <w:hyperlink w:anchor="_Toc224764708" w:history="1">
             <w:r>
               <w:rPr>
                 <w:rStyle w:val="Hyperlink"/>
@@ -1078,7 +1064,7 @@
                 <w:noProof/>
                 <w:webHidden/>
               </w:rPr>
-              <w:instrText xml:space="preserve"> PAGEREF _Toc224464552 \h </w:instrText>
+              <w:instrText xml:space="preserve"> PAGEREF _Toc224764708 \h </w:instrText>
             </w:r>
             <w:r>
               <w:rPr>
@@ -1123,7 +1109,7 @@
               <w:szCs w:val="24"/>
             </w:rPr>
           </w:pPr>
-          <w:hyperlink w:anchor="_Toc224464553" w:history="1">
+          <w:hyperlink w:anchor="_Toc224764709" w:history="1">
             <w:r>
               <w:rPr>
                 <w:rStyle w:val="Hyperlink"/>
@@ -1150,7 +1136,7 @@
                 <w:noProof/>
                 <w:webHidden/>
               </w:rPr>
-              <w:instrText xml:space="preserve"> PAGEREF _Toc224464553 \h </w:instrText>
+              <w:instrText xml:space="preserve"> PAGEREF _Toc224764709 \h </w:instrText>
             </w:r>
             <w:r>
               <w:rPr>
@@ -1195,14 +1181,131 @@
               <w:szCs w:val="24"/>
             </w:rPr>
           </w:pPr>
-          <w:hyperlink w:anchor="_Toc224464554" w:history="1">
+          <w:r>
+            <w:rPr>
+              <w:rStyle w:val="Hyperlink"/>
+              <w:noProof/>
+            </w:rPr>
+            <w:fldChar w:fldCharType="begin"/>
+          </w:r>
+          <w:r>
+            <w:rPr>
+              <w:rStyle w:val="Hyperlink"/>
+              <w:noProof/>
+            </w:rPr>
+            <w:instrText xml:space="preserve"> </w:instrText>
+          </w:r>
+          <w:r>
+            <w:rPr>
+              <w:noProof/>
+            </w:rPr>
+            <w:instrText>HYPERLINK \l "_Toc224764710"</w:instrText>
+          </w:r>
+          <w:r>
+            <w:rPr>
+              <w:rStyle w:val="Hyperlink"/>
+              <w:noProof/>
+            </w:rPr>
+            <w:instrText xml:space="preserve"> </w:instrText>
+          </w:r>
+          <w:r>
+            <w:rPr>
+              <w:rStyle w:val="Hyperlink"/>
+              <w:noProof/>
+            </w:rPr>
+          </w:r>
+          <w:r>
+            <w:rPr>
+              <w:rStyle w:val="Hyperlink"/>
+              <w:noProof/>
+            </w:rPr>
+            <w:fldChar w:fldCharType="separate"/>
+          </w:r>
+          <w:r>
+            <w:rPr>
+              <w:rStyle w:val="Hyperlink"/>
+              <w:noProof/>
+              <w:lang w:val="da-DK"/>
+            </w:rPr>
+            <w:t>2.1.4 Service til service kommunikation</w:t>
+          </w:r>
+          <w:r>
+            <w:rPr>
+              <w:noProof/>
+              <w:webHidden/>
+            </w:rPr>
+            <w:tab/>
+          </w:r>
+          <w:r>
+            <w:rPr>
+              <w:noProof/>
+              <w:webHidden/>
+            </w:rPr>
+            <w:fldChar w:fldCharType="begin"/>
+          </w:r>
+          <w:r>
+            <w:rPr>
+              <w:noProof/>
+              <w:webHidden/>
+            </w:rPr>
+            <w:instrText xml:space="preserve"> PAGEREF _Toc224764710 \h </w:instrText>
+          </w:r>
+          <w:r>
+            <w:rPr>
+              <w:noProof/>
+              <w:webHidden/>
+            </w:rPr>
+          </w:r>
+          <w:r>
+            <w:rPr>
+              <w:noProof/>
+              <w:webHidden/>
+            </w:rPr>
+            <w:fldChar w:fldCharType="separate"/>
+          </w:r>
+          <w:r>
+            <w:rPr>
+              <w:noProof/>
+              <w:webHidden/>
+            </w:rPr>
+            <w:t>6</w:t>
+          </w:r>
+          <w:r>
+            <w:rPr>
+              <w:noProof/>
+              <w:webHidden/>
+            </w:rPr>
+            <w:fldChar w:fldCharType="end"/>
+          </w:r>
+          <w:r>
+            <w:rPr>
+              <w:rStyle w:val="Hyperlink"/>
+              <w:noProof/>
+            </w:rPr>
+            <w:fldChar w:fldCharType="end"/>
+          </w:r>
+        </w:p>
+        <w:p>
+          <w:pPr>
+            <w:pStyle w:val="TOC3"/>
+            <w:tabs>
+              <w:tab w:val="right" w:leader="dot" w:pos="9350"/>
+            </w:tabs>
+            <w:rPr>
+              <w:rFonts w:eastAsiaTheme="minorEastAsia"/>
+              <w:noProof/>
+              <w:color w:val="auto"/>
+              <w:sz w:val="24"/>
+              <w:szCs w:val="24"/>
+            </w:rPr>
+          </w:pPr>
+          <w:hyperlink w:anchor="_Toc224764711" w:history="1">
             <w:r>
               <w:rPr>
                 <w:rStyle w:val="Hyperlink"/>
                 <w:noProof/>
-                <w:lang w:val="da-DK"/>
-              </w:rPr>
-              <w:t>2.1.4 Service til service kommunikation</w:t>
+              </w:rPr>
+              <w:t>2.1.5 Databases</w:t>
             </w:r>
             <w:r>
               <w:rPr>
@@ -1223,7 +1326,7 @@
                 <w:noProof/>
                 <w:webHidden/>
               </w:rPr>
-              <w:instrText xml:space="preserve"> PAGEREF _Toc224464554 \h </w:instrText>
+              <w:instrText xml:space="preserve"> PAGEREF _Toc224764711 \h </w:instrText>
             </w:r>
             <w:r>
               <w:rPr>
@@ -1243,7 +1346,7 @@
                 <w:noProof/>
                 <w:webHidden/>
               </w:rPr>
-              <w:t>5</w:t>
+              <w:t>6</w:t>
             </w:r>
             <w:r>
               <w:rPr>
@@ -1268,13 +1371,14 @@
               <w:szCs w:val="24"/>
             </w:rPr>
           </w:pPr>
-          <w:hyperlink w:anchor="_Toc224464555" w:history="1">
+          <w:hyperlink w:anchor="_Toc224764712" w:history="1">
             <w:r>
               <w:rPr>
                 <w:rStyle w:val="Hyperlink"/>
                 <w:noProof/>
-              </w:rPr>
-              <w:t>2.1.5 Databases</w:t>
+                <w:lang w:val="da-DK"/>
+              </w:rPr>
+              <w:t>2.1.6 Frontend</w:t>
             </w:r>
             <w:r>
               <w:rPr>
@@ -1295,79 +1399,7 @@
                 <w:noProof/>
                 <w:webHidden/>
               </w:rPr>
-              <w:instrText xml:space="preserve"> PAGEREF _Toc224464555 \h </w:instrText>
-            </w:r>
-            <w:r>
-              <w:rPr>
-                <w:noProof/>
-                <w:webHidden/>
-              </w:rPr>
-            </w:r>
-            <w:r>
-              <w:rPr>
-                <w:noProof/>
-                <w:webHidden/>
-              </w:rPr>
-              <w:fldChar w:fldCharType="separate"/>
-            </w:r>
-            <w:r>
-              <w:rPr>
-                <w:noProof/>
-                <w:webHidden/>
-              </w:rPr>
-              <w:t>6</w:t>
-            </w:r>
-            <w:r>
-              <w:rPr>
-                <w:noProof/>
-                <w:webHidden/>
-              </w:rPr>
-              <w:fldChar w:fldCharType="end"/>
-            </w:r>
-          </w:hyperlink>
-        </w:p>
-        <w:p>
-          <w:pPr>
-            <w:pStyle w:val="TOC3"/>
-            <w:tabs>
-              <w:tab w:val="right" w:leader="dot" w:pos="9350"/>
-            </w:tabs>
-            <w:rPr>
-              <w:rFonts w:eastAsiaTheme="minorEastAsia"/>
-              <w:noProof/>
-              <w:color w:val="auto"/>
-              <w:sz w:val="24"/>
-              <w:szCs w:val="24"/>
-            </w:rPr>
-          </w:pPr>
-          <w:hyperlink w:anchor="_Toc224464556" w:history="1">
-            <w:r>
-              <w:rPr>
-                <w:rStyle w:val="Hyperlink"/>
-                <w:noProof/>
-              </w:rPr>
-              <w:t>2.1.6 Frontend</w:t>
-            </w:r>
-            <w:r>
-              <w:rPr>
-                <w:noProof/>
-                <w:webHidden/>
-              </w:rPr>
-              <w:tab/>
-            </w:r>
-            <w:r>
-              <w:rPr>
-                <w:noProof/>
-                <w:webHidden/>
-              </w:rPr>
-              <w:fldChar w:fldCharType="begin"/>
-            </w:r>
-            <w:r>
-              <w:rPr>
-                <w:noProof/>
-                <w:webHidden/>
-              </w:rPr>
-              <w:instrText xml:space="preserve"> PAGEREF _Toc224464556 \h </w:instrText>
+              <w:instrText xml:space="preserve"> PAGEREF _Toc224764712 \h </w:instrText>
             </w:r>
             <w:r>
               <w:rPr>
@@ -1414,11 +1446,12 @@
               <w:szCs w:val="24"/>
             </w:rPr>
           </w:pPr>
-          <w:hyperlink w:anchor="_Toc224464557" w:history="1">
+          <w:hyperlink w:anchor="_Toc224764713" w:history="1">
             <w:r>
               <w:rPr>
                 <w:rStyle w:val="Hyperlink"/>
                 <w:noProof/>
+                <w:lang w:val="da-DK"/>
               </w:rPr>
               <w:t>2.2 Environments</w:t>
             </w:r>
@@ -1441,7 +1474,7 @@
                 <w:noProof/>
                 <w:webHidden/>
               </w:rPr>
-              <w:instrText xml:space="preserve"> PAGEREF _Toc224464557 \h </w:instrText>
+              <w:instrText xml:space="preserve"> PAGEREF _Toc224764713 \h </w:instrText>
             </w:r>
             <w:r>
               <w:rPr>
@@ -1486,12 +1519,11 @@
               <w:szCs w:val="24"/>
             </w:rPr>
           </w:pPr>
-          <w:hyperlink w:anchor="_Toc224464558" w:history="1">
+          <w:hyperlink w:anchor="_Toc224764714" w:history="1">
             <w:r>
               <w:rPr>
                 <w:rStyle w:val="Hyperlink"/>
                 <w:noProof/>
-                <w:lang w:val="da-DK"/>
               </w:rPr>
               <w:t>2.2.1 Development</w:t>
             </w:r>
@@ -1514,7 +1546,7 @@
                 <w:noProof/>
                 <w:webHidden/>
               </w:rPr>
-              <w:instrText xml:space="preserve"> PAGEREF _Toc224464558 \h </w:instrText>
+              <w:instrText xml:space="preserve"> PAGEREF _Toc224764714 \h </w:instrText>
             </w:r>
             <w:r>
               <w:rPr>
@@ -1559,12 +1591,11 @@
               <w:szCs w:val="24"/>
             </w:rPr>
           </w:pPr>
-          <w:hyperlink w:anchor="_Toc224464559" w:history="1">
+          <w:hyperlink w:anchor="_Toc224764715" w:history="1">
             <w:r>
               <w:rPr>
                 <w:rStyle w:val="Hyperlink"/>
                 <w:noProof/>
-                <w:lang w:val="da-DK"/>
               </w:rPr>
               <w:t>2.2.2 Production</w:t>
             </w:r>
@@ -1587,7 +1618,7 @@
                 <w:noProof/>
                 <w:webHidden/>
               </w:rPr>
-              <w:instrText xml:space="preserve"> PAGEREF _Toc224464559 \h </w:instrText>
+              <w:instrText xml:space="preserve"> PAGEREF _Toc224764715 \h </w:instrText>
             </w:r>
             <w:r>
               <w:rPr>
@@ -1634,7 +1665,7 @@
               <w:color w:val="auto"/>
             </w:rPr>
           </w:pPr>
-          <w:hyperlink w:anchor="_Toc224464560" w:history="1">
+          <w:hyperlink w:anchor="_Toc224764716" w:history="1">
             <w:r>
               <w:rPr>
                 <w:rStyle w:val="Hyperlink"/>
@@ -1662,7 +1693,7 @@
                 <w:noProof/>
                 <w:webHidden/>
               </w:rPr>
-              <w:instrText xml:space="preserve"> PAGEREF _Toc224464560 \h </w:instrText>
+              <w:instrText xml:space="preserve"> PAGEREF _Toc224764716 \h </w:instrText>
             </w:r>
             <w:r>
               <w:rPr>
@@ -1709,7 +1740,7 @@
               <w:szCs w:val="24"/>
             </w:rPr>
           </w:pPr>
-          <w:hyperlink w:anchor="_Toc224464561" w:history="1">
+          <w:hyperlink w:anchor="_Toc224764717" w:history="1">
             <w:r>
               <w:rPr>
                 <w:rStyle w:val="Hyperlink"/>
@@ -1737,7 +1768,7 @@
                 <w:noProof/>
                 <w:webHidden/>
               </w:rPr>
-              <w:instrText xml:space="preserve"> PAGEREF _Toc224464561 \h </w:instrText>
+              <w:instrText xml:space="preserve"> PAGEREF _Toc224764717 \h </w:instrText>
             </w:r>
             <w:r>
               <w:rPr>
@@ -1782,7 +1813,7 @@
               <w:szCs w:val="24"/>
             </w:rPr>
           </w:pPr>
-          <w:hyperlink w:anchor="_Toc224464562" w:history="1">
+          <w:hyperlink w:anchor="_Toc224764718" w:history="1">
             <w:r>
               <w:rPr>
                 <w:rStyle w:val="Hyperlink"/>
@@ -1810,7 +1841,7 @@
                 <w:noProof/>
                 <w:webHidden/>
               </w:rPr>
-              <w:instrText xml:space="preserve"> PAGEREF _Toc224464562 \h </w:instrText>
+              <w:instrText xml:space="preserve"> PAGEREF _Toc224764718 \h </w:instrText>
             </w:r>
             <w:r>
               <w:rPr>
@@ -1855,7 +1886,7 @@
               <w:szCs w:val="24"/>
             </w:rPr>
           </w:pPr>
-          <w:hyperlink w:anchor="_Toc224464563" w:history="1">
+          <w:hyperlink w:anchor="_Toc224764719" w:history="1">
             <w:r>
               <w:rPr>
                 <w:rStyle w:val="Hyperlink"/>
@@ -1883,7 +1914,7 @@
                 <w:noProof/>
                 <w:webHidden/>
               </w:rPr>
-              <w:instrText xml:space="preserve"> PAGEREF _Toc224464563 \h </w:instrText>
+              <w:instrText xml:space="preserve"> PAGEREF _Toc224764719 \h </w:instrText>
             </w:r>
             <w:r>
               <w:rPr>
@@ -1930,7 +1961,7 @@
               <w:szCs w:val="24"/>
             </w:rPr>
           </w:pPr>
-          <w:hyperlink w:anchor="_Toc224464564" w:history="1">
+          <w:hyperlink w:anchor="_Toc224764720" w:history="1">
             <w:r>
               <w:rPr>
                 <w:rStyle w:val="Hyperlink"/>
@@ -1957,7 +1988,7 @@
                 <w:noProof/>
                 <w:webHidden/>
               </w:rPr>
-              <w:instrText xml:space="preserve"> PAGEREF _Toc224464564 \h </w:instrText>
+              <w:instrText xml:space="preserve"> PAGEREF _Toc224764720 \h </w:instrText>
             </w:r>
             <w:r>
               <w:rPr>
@@ -2004,7 +2035,7 @@
               <w:color w:val="auto"/>
             </w:rPr>
           </w:pPr>
-          <w:hyperlink w:anchor="_Toc224464565" w:history="1">
+          <w:hyperlink w:anchor="_Toc224764721" w:history="1">
             <w:r>
               <w:rPr>
                 <w:rStyle w:val="Hyperlink"/>
@@ -2031,7 +2062,7 @@
                 <w:noProof/>
                 <w:webHidden/>
               </w:rPr>
-              <w:instrText xml:space="preserve"> PAGEREF _Toc224464565 \h </w:instrText>
+              <w:instrText xml:space="preserve"> PAGEREF _Toc224764721 \h </w:instrText>
             </w:r>
             <w:r>
               <w:rPr>
@@ -2078,7 +2109,7 @@
               <w:szCs w:val="24"/>
             </w:rPr>
           </w:pPr>
-          <w:hyperlink w:anchor="_Toc224464566" w:history="1">
+          <w:hyperlink w:anchor="_Toc224764722" w:history="1">
             <w:r>
               <w:rPr>
                 <w:rStyle w:val="Hyperlink"/>
@@ -2105,7 +2136,7 @@
                 <w:noProof/>
                 <w:webHidden/>
               </w:rPr>
-              <w:instrText xml:space="preserve"> PAGEREF _Toc224464566 \h </w:instrText>
+              <w:instrText xml:space="preserve"> PAGEREF _Toc224764722 \h </w:instrText>
             </w:r>
             <w:r>
               <w:rPr>
@@ -2152,7 +2183,7 @@
               <w:szCs w:val="24"/>
             </w:rPr>
           </w:pPr>
-          <w:hyperlink w:anchor="_Toc224464567" w:history="1">
+          <w:hyperlink w:anchor="_Toc224764723" w:history="1">
             <w:r>
               <w:rPr>
                 <w:rStyle w:val="Hyperlink"/>
@@ -2179,7 +2210,7 @@
                 <w:noProof/>
                 <w:webHidden/>
               </w:rPr>
-              <w:instrText xml:space="preserve"> PAGEREF _Toc224464567 \h </w:instrText>
+              <w:instrText xml:space="preserve"> PAGEREF _Toc224764723 \h </w:instrText>
             </w:r>
             <w:r>
               <w:rPr>
@@ -2226,7 +2257,7 @@
               <w:szCs w:val="24"/>
             </w:rPr>
           </w:pPr>
-          <w:hyperlink w:anchor="_Toc224464568" w:history="1">
+          <w:hyperlink w:anchor="_Toc224764724" w:history="1">
             <w:r>
               <w:rPr>
                 <w:rStyle w:val="Hyperlink"/>
@@ -2253,7 +2284,7 @@
                 <w:noProof/>
                 <w:webHidden/>
               </w:rPr>
-              <w:instrText xml:space="preserve"> PAGEREF _Toc224464568 \h </w:instrText>
+              <w:instrText xml:space="preserve"> PAGEREF _Toc224764724 \h </w:instrText>
             </w:r>
             <w:r>
               <w:rPr>
@@ -2300,7 +2331,7 @@
               <w:szCs w:val="24"/>
             </w:rPr>
           </w:pPr>
-          <w:hyperlink w:anchor="_Toc224464569" w:history="1">
+          <w:hyperlink w:anchor="_Toc224764725" w:history="1">
             <w:r>
               <w:rPr>
                 <w:rStyle w:val="Hyperlink"/>
@@ -2327,7 +2358,7 @@
                 <w:noProof/>
                 <w:webHidden/>
               </w:rPr>
-              <w:instrText xml:space="preserve"> PAGEREF _Toc224464569 \h </w:instrText>
+              <w:instrText xml:space="preserve"> PAGEREF _Toc224764725 \h </w:instrText>
             </w:r>
             <w:r>
               <w:rPr>
@@ -2374,7 +2405,7 @@
               <w:szCs w:val="24"/>
             </w:rPr>
           </w:pPr>
-          <w:hyperlink w:anchor="_Toc224464570" w:history="1">
+          <w:hyperlink w:anchor="_Toc224764726" w:history="1">
             <w:r>
               <w:rPr>
                 <w:rStyle w:val="Hyperlink"/>
@@ -2402,7 +2433,7 @@
                 <w:noProof/>
                 <w:webHidden/>
               </w:rPr>
-              <w:instrText xml:space="preserve"> PAGEREF _Toc224464570 \h </w:instrText>
+              <w:instrText xml:space="preserve"> PAGEREF _Toc224764726 \h </w:instrText>
             </w:r>
             <w:r>
               <w:rPr>
@@ -2449,7 +2480,7 @@
               <w:color w:val="auto"/>
             </w:rPr>
           </w:pPr>
-          <w:hyperlink w:anchor="_Toc224464571" w:history="1">
+          <w:hyperlink w:anchor="_Toc224764727" w:history="1">
             <w:r>
               <w:rPr>
                 <w:rStyle w:val="Hyperlink"/>
@@ -2477,7 +2508,7 @@
                 <w:noProof/>
                 <w:webHidden/>
               </w:rPr>
-              <w:instrText xml:space="preserve"> PAGEREF _Toc224464571 \h </w:instrText>
+              <w:instrText xml:space="preserve"> PAGEREF _Toc224764727 \h </w:instrText>
             </w:r>
             <w:r>
               <w:rPr>
@@ -2497,7 +2528,7 @@
                 <w:noProof/>
                 <w:webHidden/>
               </w:rPr>
-              <w:t>8</w:t>
+              <w:t>9</w:t>
             </w:r>
             <w:r>
               <w:rPr>
@@ -2524,7 +2555,7 @@
               <w:color w:val="auto"/>
             </w:rPr>
           </w:pPr>
-          <w:hyperlink w:anchor="_Toc224464572" w:history="1">
+          <w:hyperlink w:anchor="_Toc224764728" w:history="1">
             <w:r>
               <w:rPr>
                 <w:rStyle w:val="Hyperlink"/>
@@ -2552,7 +2583,7 @@
                 <w:noProof/>
                 <w:webHidden/>
               </w:rPr>
-              <w:instrText xml:space="preserve"> PAGEREF _Toc224464572 \h </w:instrText>
+              <w:instrText xml:space="preserve"> PAGEREF _Toc224764728 \h </w:instrText>
             </w:r>
             <w:r>
               <w:rPr>
@@ -2599,7 +2630,7 @@
               <w:color w:val="auto"/>
             </w:rPr>
           </w:pPr>
-          <w:hyperlink w:anchor="_Toc224464573" w:history="1">
+          <w:hyperlink w:anchor="_Toc224764729" w:history="1">
             <w:r>
               <w:rPr>
                 <w:rStyle w:val="Hyperlink"/>
@@ -2627,7 +2658,7 @@
                 <w:noProof/>
                 <w:webHidden/>
               </w:rPr>
-              <w:instrText xml:space="preserve"> PAGEREF _Toc224464573 \h </w:instrText>
+              <w:instrText xml:space="preserve"> PAGEREF _Toc224764729 \h </w:instrText>
             </w:r>
             <w:r>
               <w:rPr>
@@ -2685,7 +2716,7 @@
           <w:lang w:val="da-DK"/>
         </w:rPr>
       </w:pPr>
-      <w:bookmarkStart w:id="0" w:name="_Toc224464547"/>
+      <w:bookmarkStart w:id="0" w:name="_Toc224764703"/>
       <w:r>
         <w:rPr>
           <w:lang w:val="da-DK"/>
@@ -2900,7 +2931,7 @@
           <w:lang w:val="da-DK"/>
         </w:rPr>
       </w:pPr>
-      <w:bookmarkStart w:id="1" w:name="_Toc224464548"/>
+      <w:bookmarkStart w:id="1" w:name="_Toc224764704"/>
       <w:r>
         <w:rPr>
           <w:lang w:val="da-DK"/>
@@ -3126,7 +3157,7 @@
           <w:lang w:val="da-DK"/>
         </w:rPr>
       </w:pPr>
-      <w:bookmarkStart w:id="2" w:name="_Toc224464549"/>
+      <w:bookmarkStart w:id="2" w:name="_Toc224764705"/>
       <w:r>
         <w:rPr>
           <w:lang w:val="da-DK"/>
@@ -3407,7 +3438,7 @@
           <w:lang w:val="da-DK"/>
         </w:rPr>
       </w:pPr>
-      <w:bookmarkStart w:id="3" w:name="_Toc224464550"/>
+      <w:bookmarkStart w:id="3" w:name="_Toc224764706"/>
       <w:r>
         <w:rPr>
           <w:lang w:val="da-DK"/>
@@ -3539,7 +3570,7 @@
       <w:pPr>
         <w:pStyle w:val="Heading3"/>
       </w:pPr>
-      <w:bookmarkStart w:id="4" w:name="_Toc224464551"/>
+      <w:bookmarkStart w:id="4" w:name="_Toc224764707"/>
       <w:r>
         <w:lastRenderedPageBreak/>
         <w:t xml:space="preserve">2.1.1 </w:t>
@@ -3551,25 +3582,447 @@
     </w:p>
     <w:p>
       <w:pPr>
+        <w:rPr>
+          <w:lang w:val="da-DK"/>
+        </w:rPr>
+      </w:pPr>
+      <w:r>
+        <w:rPr>
+          <w:lang w:val="da-DK"/>
+        </w:rPr>
+        <w:t xml:space="preserve">Dette afsnit beskriver </w:t>
+      </w:r>
+      <w:r>
+        <w:rPr>
+          <w:lang w:val="da-DK"/>
+        </w:rPr>
+        <w:t xml:space="preserve">de forskellige </w:t>
+      </w:r>
+      <w:proofErr w:type="spellStart"/>
+      <w:r>
+        <w:rPr>
+          <w:lang w:val="da-DK"/>
+        </w:rPr>
+        <w:t>backend</w:t>
+      </w:r>
+      <w:proofErr w:type="spellEnd"/>
+      <w:r>
+        <w:rPr>
+          <w:lang w:val="da-DK"/>
+        </w:rPr>
+        <w:t xml:space="preserve"> </w:t>
+      </w:r>
+      <w:r>
+        <w:rPr>
+          <w:lang w:val="da-DK"/>
+        </w:rPr>
+        <w:t>services</w:t>
+      </w:r>
+      <w:r>
+        <w:rPr>
+          <w:lang w:val="da-DK"/>
+        </w:rPr>
+        <w:t xml:space="preserve"> for Munchora</w:t>
+      </w:r>
+      <w:r>
+        <w:rPr>
+          <w:lang w:val="da-DK"/>
+        </w:rPr>
+        <w:t xml:space="preserve"> herunder deres ansvar, opbygning og samspil i systemets samlede arkitektur.</w:t>
+      </w:r>
+    </w:p>
+    <w:p>
+      <w:pPr>
+        <w:rPr>
+          <w:lang w:val="da-DK"/>
+        </w:rPr>
+      </w:pPr>
+    </w:p>
+    <w:p>
+      <w:pPr>
         <w:pStyle w:val="Heading4"/>
-      </w:pPr>
-      <w:r>
+        <w:rPr>
+          <w:lang w:val="da-DK"/>
+        </w:rPr>
+      </w:pPr>
+      <w:proofErr w:type="spellStart"/>
+      <w:r>
+        <w:rPr>
+          <w:lang w:val="da-DK"/>
+        </w:rPr>
         <w:t>A</w:t>
       </w:r>
       <w:r>
+        <w:rPr>
+          <w:lang w:val="da-DK"/>
+        </w:rPr>
         <w:t>uth</w:t>
       </w:r>
-      <w:r>
+      <w:proofErr w:type="spellEnd"/>
+      <w:r>
+        <w:rPr>
+          <w:lang w:val="da-DK"/>
+        </w:rPr>
         <w:t>-service</w:t>
       </w:r>
     </w:p>
+    <w:p>
+      <w:pPr>
+        <w:rPr>
+          <w:lang w:val="da-DK"/>
+        </w:rPr>
+      </w:pPr>
+      <w:r>
+        <w:rPr>
+          <w:lang w:val="da-DK"/>
+        </w:rPr>
+        <w:t>Oprettelse af brugere og bruger ændringer håndteres af denne service, og derfor også Munchora’s ”</w:t>
+      </w:r>
+      <w:r>
+        <w:rPr>
+          <w:lang w:val="da-DK"/>
+        </w:rPr>
+        <w:t xml:space="preserve">single source of </w:t>
+      </w:r>
+      <w:proofErr w:type="spellStart"/>
+      <w:r>
+        <w:rPr>
+          <w:lang w:val="da-DK"/>
+        </w:rPr>
+        <w:t>truth</w:t>
+      </w:r>
+      <w:proofErr w:type="spellEnd"/>
+      <w:r>
+        <w:rPr>
+          <w:lang w:val="da-DK"/>
+        </w:rPr>
+        <w:t>”</w:t>
+      </w:r>
+      <w:r>
+        <w:rPr>
+          <w:lang w:val="da-DK"/>
+        </w:rPr>
+        <w:t xml:space="preserve"> for autentificering og autorisation af brugere. Det er udelukkende denne service, der er ansvarlig for at udstede JWT</w:t>
+      </w:r>
+      <w:r>
+        <w:rPr>
+          <w:lang w:val="da-DK"/>
+        </w:rPr>
+        <w:t xml:space="preserve"> </w:t>
+      </w:r>
+      <w:proofErr w:type="spellStart"/>
+      <w:r>
+        <w:rPr>
+          <w:lang w:val="da-DK"/>
+        </w:rPr>
+        <w:t>tokens</w:t>
+      </w:r>
+      <w:proofErr w:type="spellEnd"/>
+      <w:r>
+        <w:rPr>
+          <w:lang w:val="da-DK"/>
+        </w:rPr>
+        <w:t xml:space="preserve">, som de øvrige services benytter til at validere, om en bruger er autentificeret og har adgang til givne ressourcer. Servicen håndterer </w:t>
+      </w:r>
+      <w:r>
+        <w:rPr>
+          <w:lang w:val="da-DK"/>
+        </w:rPr>
+        <w:t xml:space="preserve">også </w:t>
+      </w:r>
+      <w:r>
+        <w:rPr>
+          <w:lang w:val="da-DK"/>
+        </w:rPr>
+        <w:t xml:space="preserve">login via Google </w:t>
+      </w:r>
+      <w:r>
+        <w:rPr>
+          <w:lang w:val="da-DK"/>
+        </w:rPr>
+        <w:t>single sign on (</w:t>
+      </w:r>
+      <w:r>
+        <w:rPr>
+          <w:lang w:val="da-DK"/>
+        </w:rPr>
+        <w:t>SSO</w:t>
+      </w:r>
+      <w:r>
+        <w:rPr>
+          <w:lang w:val="da-DK"/>
+        </w:rPr>
+        <w:t>)</w:t>
+      </w:r>
+      <w:r>
+        <w:rPr>
+          <w:lang w:val="da-DK"/>
+        </w:rPr>
+        <w:t xml:space="preserve"> samt oprettelse og vedligeholdelse af brugere. Ved succesfuld autentificering genererer </w:t>
+      </w:r>
+      <w:proofErr w:type="spellStart"/>
+      <w:r>
+        <w:rPr>
+          <w:lang w:val="da-DK"/>
+        </w:rPr>
+        <w:t>a</w:t>
+      </w:r>
+      <w:r>
+        <w:rPr>
+          <w:lang w:val="da-DK"/>
+        </w:rPr>
+        <w:t>uth</w:t>
+      </w:r>
+      <w:proofErr w:type="spellEnd"/>
+      <w:r>
+        <w:rPr>
+          <w:lang w:val="da-DK"/>
+        </w:rPr>
+        <w:t>-service e</w:t>
+      </w:r>
+      <w:r>
+        <w:rPr>
+          <w:lang w:val="da-DK"/>
+        </w:rPr>
+        <w:t>n</w:t>
+      </w:r>
+      <w:r>
+        <w:rPr>
+          <w:lang w:val="da-DK"/>
+        </w:rPr>
+        <w:t xml:space="preserve"> JWT-</w:t>
+      </w:r>
+      <w:proofErr w:type="spellStart"/>
+      <w:r>
+        <w:rPr>
+          <w:lang w:val="da-DK"/>
+        </w:rPr>
+        <w:t>token</w:t>
+      </w:r>
+      <w:proofErr w:type="spellEnd"/>
+      <w:r>
+        <w:rPr>
+          <w:lang w:val="da-DK"/>
+        </w:rPr>
+        <w:t>, som indeholder de nødvendige oplysninger til identifikation og autorisation, og som efterfølgende anvendes af andre services til at sikre en konsistent og sikker adgangskontrol på tværs af systemet.</w:t>
+      </w:r>
+    </w:p>
+    <w:p>
+      <w:pPr>
+        <w:rPr>
+          <w:lang w:val="da-DK"/>
+        </w:rPr>
+      </w:pPr>
+    </w:p>
+    <w:p>
+      <w:pPr>
+        <w:pStyle w:val="Heading4"/>
+      </w:pPr>
+      <w:r>
+        <w:t>recipes</w:t>
+      </w:r>
+      <w:r>
+        <w:t>-service</w:t>
+      </w:r>
+    </w:p>
+    <w:p>
+      <w:pPr>
+        <w:rPr>
+          <w:lang w:val="da-DK"/>
+        </w:rPr>
+      </w:pPr>
+      <w:proofErr w:type="spellStart"/>
+      <w:r>
+        <w:rPr>
+          <w:lang w:val="da-DK"/>
+        </w:rPr>
+        <w:t>Recipes</w:t>
+      </w:r>
+      <w:proofErr w:type="spellEnd"/>
+      <w:r>
+        <w:rPr>
+          <w:lang w:val="da-DK"/>
+        </w:rPr>
+        <w:t>-service er ansvarlig for håndtering af opskrifter i systemet, herunder oprettelse</w:t>
+      </w:r>
+      <w:r>
+        <w:rPr>
+          <w:lang w:val="da-DK"/>
+        </w:rPr>
+        <w:t xml:space="preserve"> ved hjælp af AI eller manuelle ændringer og sletning</w:t>
+      </w:r>
+      <w:r>
+        <w:rPr>
+          <w:lang w:val="da-DK"/>
+        </w:rPr>
+        <w:t xml:space="preserve">. Servicen kan igangsætte generering af opskrifter </w:t>
+      </w:r>
+      <w:r>
+        <w:rPr>
+          <w:lang w:val="da-DK"/>
+        </w:rPr>
+        <w:t>ved at bruge</w:t>
+      </w:r>
+      <w:r>
+        <w:rPr>
+          <w:lang w:val="da-DK"/>
+        </w:rPr>
+        <w:t xml:space="preserve"> </w:t>
+      </w:r>
+      <w:proofErr w:type="spellStart"/>
+      <w:r>
+        <w:rPr>
+          <w:lang w:val="da-DK"/>
+        </w:rPr>
+        <w:t>ai</w:t>
+      </w:r>
+      <w:proofErr w:type="spellEnd"/>
+      <w:r>
+        <w:rPr>
+          <w:lang w:val="da-DK"/>
+        </w:rPr>
+        <w:t xml:space="preserve">-service, som kommunikeres asynkront gennem </w:t>
+      </w:r>
+      <w:proofErr w:type="spellStart"/>
+      <w:r>
+        <w:rPr>
+          <w:lang w:val="da-DK"/>
+        </w:rPr>
+        <w:t>RabbitMQ</w:t>
+      </w:r>
+      <w:proofErr w:type="spellEnd"/>
+      <w:r>
+        <w:rPr>
+          <w:lang w:val="da-DK"/>
+        </w:rPr>
+        <w:t xml:space="preserve">. Når </w:t>
+      </w:r>
+      <w:proofErr w:type="spellStart"/>
+      <w:r>
+        <w:rPr>
+          <w:lang w:val="da-DK"/>
+        </w:rPr>
+        <w:t>ai</w:t>
+      </w:r>
+      <w:proofErr w:type="spellEnd"/>
+      <w:r>
+        <w:rPr>
+          <w:lang w:val="da-DK"/>
+        </w:rPr>
+        <w:t xml:space="preserve">-service har genereret en opskrift, sendes </w:t>
+      </w:r>
+      <w:r>
+        <w:rPr>
+          <w:lang w:val="da-DK"/>
+        </w:rPr>
+        <w:t xml:space="preserve">denne </w:t>
+      </w:r>
+      <w:proofErr w:type="spellStart"/>
+      <w:r>
+        <w:rPr>
+          <w:lang w:val="da-DK"/>
+        </w:rPr>
+        <w:t>ai</w:t>
+      </w:r>
+      <w:proofErr w:type="spellEnd"/>
+      <w:r>
+        <w:rPr>
+          <w:lang w:val="da-DK"/>
+        </w:rPr>
+        <w:t xml:space="preserve"> generede opskrift </w:t>
+      </w:r>
+      <w:r>
+        <w:rPr>
+          <w:lang w:val="da-DK"/>
+        </w:rPr>
+        <w:t xml:space="preserve">tilbage til </w:t>
+      </w:r>
+      <w:proofErr w:type="spellStart"/>
+      <w:r>
+        <w:rPr>
+          <w:lang w:val="da-DK"/>
+        </w:rPr>
+        <w:t>r</w:t>
+      </w:r>
+      <w:r>
+        <w:rPr>
+          <w:lang w:val="da-DK"/>
+        </w:rPr>
+        <w:t>ecipes</w:t>
+      </w:r>
+      <w:proofErr w:type="spellEnd"/>
+      <w:r>
+        <w:rPr>
+          <w:lang w:val="da-DK"/>
+        </w:rPr>
+        <w:t xml:space="preserve">-service, som herefter persisterer </w:t>
+      </w:r>
+      <w:proofErr w:type="spellStart"/>
+      <w:r>
+        <w:rPr>
+          <w:lang w:val="da-DK"/>
+        </w:rPr>
+        <w:t>dataen</w:t>
+      </w:r>
+      <w:proofErr w:type="spellEnd"/>
+      <w:r>
+        <w:rPr>
+          <w:lang w:val="da-DK"/>
+        </w:rPr>
+        <w:t>. Derudover anvender servicen JWT-</w:t>
+      </w:r>
+      <w:proofErr w:type="spellStart"/>
+      <w:r>
+        <w:rPr>
+          <w:lang w:val="da-DK"/>
+        </w:rPr>
+        <w:t>tokens</w:t>
+      </w:r>
+      <w:proofErr w:type="spellEnd"/>
+      <w:r>
+        <w:rPr>
+          <w:lang w:val="da-DK"/>
+        </w:rPr>
+        <w:t xml:space="preserve"> til at validere, om en bruger har adgang til de ønskede opskrifter</w:t>
+      </w:r>
+      <w:r>
+        <w:rPr>
+          <w:lang w:val="da-DK"/>
+        </w:rPr>
+        <w:t>, hvis ikke public</w:t>
+      </w:r>
+      <w:r>
+        <w:rPr>
+          <w:lang w:val="da-DK"/>
+        </w:rPr>
+        <w:t>, og sikrer dermed korrekt autorisation i forhold til brugerens rettigheder.</w:t>
+      </w:r>
+    </w:p>
+    <w:p>
+      <w:pPr>
+        <w:rPr>
+          <w:lang w:val="da-DK"/>
+        </w:rPr>
+      </w:pPr>
+    </w:p>
+    <w:p>
+      <w:pPr>
+        <w:pStyle w:val="Heading4"/>
+      </w:pPr>
+      <w:r>
+        <w:t>ai</w:t>
+      </w:r>
+      <w:r>
+        <w:t>-service</w:t>
+      </w:r>
+    </w:p>
     <w:p/>
     <w:p>
       <w:pPr>
         <w:pStyle w:val="Heading4"/>
       </w:pPr>
       <w:r>
-        <w:t>recipes</w:t>
+        <w:t>shopping-lists</w:t>
       </w:r>
       <w:r>
         <w:t>-service</w:t>
@@ -3581,7 +4034,8 @@
         <w:pStyle w:val="Heading4"/>
       </w:pPr>
       <w:r>
-        <w:t>ai</w:t>
+        <w:lastRenderedPageBreak/>
+        <w:t>notifications</w:t>
       </w:r>
       <w:r>
         <w:t>-service</w:t>
@@ -3590,13 +4044,244 @@
     <w:p/>
     <w:p>
       <w:pPr>
+        <w:pStyle w:val="Heading3"/>
+      </w:pPr>
+      <w:bookmarkStart w:id="5" w:name="_Toc224764708"/>
+      <w:r>
+        <w:t>2.</w:t>
+      </w:r>
+      <w:r>
+        <w:t>1.</w:t>
+      </w:r>
+      <w:r>
+        <w:t>2</w:t>
+      </w:r>
+      <w:r>
+        <w:t xml:space="preserve"> </w:t>
+      </w:r>
+      <w:r>
+        <w:t xml:space="preserve">Request </w:t>
+      </w:r>
+      <w:r>
+        <w:t>Routing</w:t>
+      </w:r>
+      <w:bookmarkEnd w:id="5"/>
+    </w:p>
+    <w:p>
+      <w:r>
+        <w:t>Nginx</w:t>
+      </w:r>
+    </w:p>
+    <w:p/>
+    <w:p>
+      <w:pPr>
+        <w:pStyle w:val="Heading3"/>
+      </w:pPr>
+      <w:bookmarkStart w:id="6" w:name="_Toc224764709"/>
+      <w:r>
+        <w:t>2.1.3 DLS Patterns</w:t>
+      </w:r>
+      <w:bookmarkEnd w:id="6"/>
+    </w:p>
+    <w:p>
+      <w:pPr>
         <w:pStyle w:val="Heading4"/>
       </w:pPr>
       <w:r>
-        <w:t>shopping-lists</w:t>
-      </w:r>
-      <w:r>
-        <w:t>-service</w:t>
+        <w:t>Immutable data (Tombstone and snapshot pattern)</w:t>
+      </w:r>
+    </w:p>
+    <w:p>
+      <w:proofErr w:type="spellStart"/>
+      <w:r>
+        <w:t>Papertrails</w:t>
+      </w:r>
+      <w:proofErr w:type="spellEnd"/>
+      <w:r>
+        <w:t xml:space="preserve"> gem for ruby</w:t>
+      </w:r>
+    </w:p>
+    <w:p>
+      <w:pPr>
+        <w:rPr>
+          <w:lang w:val="da-DK"/>
+        </w:rPr>
+      </w:pPr>
+    </w:p>
+    <w:p>
+      <w:pPr>
+        <w:rPr>
+          <w:lang w:val="da-DK"/>
+        </w:rPr>
+      </w:pPr>
+      <w:r>
+        <w:rPr>
+          <w:lang w:val="da-DK"/>
+        </w:rPr>
+        <w:t xml:space="preserve">Systemet anvender delvist principper fra </w:t>
+      </w:r>
+      <w:proofErr w:type="spellStart"/>
+      <w:r>
+        <w:rPr>
+          <w:lang w:val="da-DK"/>
+        </w:rPr>
+        <w:t>immutable</w:t>
+      </w:r>
+      <w:proofErr w:type="spellEnd"/>
+      <w:r>
+        <w:rPr>
+          <w:lang w:val="da-DK"/>
+        </w:rPr>
+        <w:t xml:space="preserve"> data gennem brugen af versionsstyring via </w:t>
+      </w:r>
+      <w:proofErr w:type="spellStart"/>
+      <w:r>
+        <w:rPr>
+          <w:lang w:val="da-DK"/>
+        </w:rPr>
+        <w:t>gem’en</w:t>
+      </w:r>
+      <w:proofErr w:type="spellEnd"/>
+      <w:r>
+        <w:rPr>
+          <w:lang w:val="da-DK"/>
+        </w:rPr>
+        <w:t xml:space="preserve"> </w:t>
+      </w:r>
+      <w:proofErr w:type="spellStart"/>
+      <w:r>
+        <w:rPr>
+          <w:lang w:val="da-DK"/>
+        </w:rPr>
+        <w:t>papertrail</w:t>
+      </w:r>
+      <w:proofErr w:type="spellEnd"/>
+      <w:r>
+        <w:rPr>
+          <w:lang w:val="da-DK"/>
+        </w:rPr>
+        <w:t xml:space="preserve">. Selvom de primære entiteter fortsat er mutable, bliver alle ændringer registreret som </w:t>
+      </w:r>
+      <w:proofErr w:type="spellStart"/>
+      <w:r>
+        <w:rPr>
+          <w:lang w:val="da-DK"/>
+        </w:rPr>
+        <w:t>append</w:t>
+      </w:r>
+      <w:proofErr w:type="spellEnd"/>
+      <w:r>
+        <w:rPr>
+          <w:lang w:val="da-DK"/>
+        </w:rPr>
+        <w:t xml:space="preserve"> </w:t>
+      </w:r>
+      <w:proofErr w:type="spellStart"/>
+      <w:r>
+        <w:rPr>
+          <w:lang w:val="da-DK"/>
+        </w:rPr>
+        <w:t>only</w:t>
+      </w:r>
+      <w:proofErr w:type="spellEnd"/>
+      <w:r>
+        <w:rPr>
+          <w:lang w:val="da-DK"/>
+        </w:rPr>
+        <w:t xml:space="preserve"> snapshots, hvilket muliggør historisk sporbarhed og </w:t>
+      </w:r>
+      <w:proofErr w:type="spellStart"/>
+      <w:r>
+        <w:rPr>
+          <w:lang w:val="da-DK"/>
+        </w:rPr>
+        <w:t>rollback</w:t>
+      </w:r>
+      <w:proofErr w:type="spellEnd"/>
+      <w:r>
+        <w:rPr>
+          <w:lang w:val="da-DK"/>
+        </w:rPr>
+        <w:t>. Dette er i tråd med snapshot</w:t>
+      </w:r>
+      <w:r>
+        <w:rPr>
+          <w:lang w:val="da-DK"/>
+        </w:rPr>
+        <w:t xml:space="preserve"> </w:t>
+      </w:r>
+      <w:r>
+        <w:rPr>
+          <w:lang w:val="da-DK"/>
+        </w:rPr>
+        <w:t xml:space="preserve">mønstret og giver egenskaber, der minder om </w:t>
+      </w:r>
+      <w:proofErr w:type="spellStart"/>
+      <w:r>
+        <w:rPr>
+          <w:lang w:val="da-DK"/>
+        </w:rPr>
+        <w:t>immutable</w:t>
+      </w:r>
+      <w:proofErr w:type="spellEnd"/>
+      <w:r>
+        <w:rPr>
+          <w:lang w:val="da-DK"/>
+        </w:rPr>
+        <w:t xml:space="preserve"> datalagring.</w:t>
+      </w:r>
+    </w:p>
+    <w:p>
+      <w:pPr>
+        <w:rPr>
+          <w:lang w:val="da-DK"/>
+        </w:rPr>
+      </w:pPr>
+    </w:p>
+    <w:p>
+      <w:pPr>
+        <w:rPr>
+          <w:lang w:val="da-DK"/>
+        </w:rPr>
+      </w:pPr>
+    </w:p>
+    <w:p>
+      <w:pPr>
+        <w:pStyle w:val="Heading4"/>
+      </w:pPr>
+      <w:r>
+        <w:t>Idempotence</w:t>
+      </w:r>
+    </w:p>
+    <w:p>
+      <w:pPr>
+        <w:rPr>
+          <w:lang w:val="da-DK"/>
+        </w:rPr>
+      </w:pPr>
+    </w:p>
+    <w:p>
+      <w:pPr>
+        <w:pStyle w:val="Heading4"/>
+        <w:rPr>
+          <w:lang w:val="da-DK"/>
+        </w:rPr>
+      </w:pPr>
+      <w:r>
+        <w:rPr>
+          <w:lang w:val="da-DK"/>
+        </w:rPr>
+        <w:t>Caching</w:t>
+      </w:r>
+    </w:p>
+    <w:p>
+      <w:proofErr w:type="spellStart"/>
+      <w:r>
+        <w:t>Tanstack</w:t>
+      </w:r>
+      <w:proofErr w:type="spellEnd"/>
+      <w:r>
+        <w:t xml:space="preserve"> query caching client side</w:t>
       </w:r>
     </w:p>
     <w:p/>
@@ -3605,50 +4290,82 @@
         <w:pStyle w:val="Heading4"/>
       </w:pPr>
       <w:r>
-        <w:t>notifications</w:t>
-      </w:r>
-      <w:r>
-        <w:t>-service</w:t>
-      </w:r>
-    </w:p>
-    <w:p/>
+        <w:t>Asynchronous Messaging Pattern</w:t>
+      </w:r>
+    </w:p>
+    <w:p>
+      <w:pPr>
+        <w:rPr>
+          <w:lang w:val="da-DK"/>
+        </w:rPr>
+      </w:pPr>
+      <w:proofErr w:type="spellStart"/>
+      <w:r>
+        <w:rPr>
+          <w:lang w:val="da-DK"/>
+        </w:rPr>
+        <w:t>Sidekiq</w:t>
+      </w:r>
+      <w:proofErr w:type="spellEnd"/>
+    </w:p>
     <w:p>
       <w:pPr>
         <w:pStyle w:val="Heading3"/>
-      </w:pPr>
-      <w:bookmarkStart w:id="5" w:name="_Toc224464552"/>
-      <w:r>
-        <w:t>2.</w:t>
-      </w:r>
-      <w:r>
-        <w:t>1.</w:t>
-      </w:r>
-      <w:r>
-        <w:t>2</w:t>
-      </w:r>
-      <w:r>
+        <w:rPr>
+          <w:lang w:val="da-DK"/>
+        </w:rPr>
+      </w:pPr>
+      <w:bookmarkStart w:id="7" w:name="_Toc224764710"/>
+      <w:r>
+        <w:rPr>
+          <w:lang w:val="da-DK"/>
+        </w:rPr>
+        <w:t>2.1</w:t>
+      </w:r>
+      <w:r>
+        <w:rPr>
+          <w:lang w:val="da-DK"/>
+        </w:rPr>
+        <w:t>.</w:t>
+      </w:r>
+      <w:r>
+        <w:rPr>
+          <w:lang w:val="da-DK"/>
+        </w:rPr>
+        <w:t>4</w:t>
+      </w:r>
+      <w:r>
+        <w:rPr>
+          <w:lang w:val="da-DK"/>
+        </w:rPr>
         <w:t xml:space="preserve"> </w:t>
       </w:r>
       <w:r>
-        <w:t xml:space="preserve">Request </w:t>
-      </w:r>
-      <w:r>
-        <w:t>Routing</w:t>
-      </w:r>
-      <w:bookmarkEnd w:id="5"/>
-    </w:p>
-    <w:p>
-      <w:pPr>
-        <w:rPr>
-          <w:lang w:val="da-DK"/>
-        </w:rPr>
-      </w:pPr>
+        <w:rPr>
+          <w:lang w:val="da-DK"/>
+        </w:rPr>
+        <w:t>Service til service kommunikation</w:t>
+      </w:r>
+      <w:bookmarkEnd w:id="7"/>
+    </w:p>
+    <w:p>
+      <w:pPr>
+        <w:rPr>
+          <w:lang w:val="da-DK"/>
+        </w:rPr>
+      </w:pPr>
+      <w:r>
+        <w:rPr>
+          <w:lang w:val="da-DK"/>
+        </w:rPr>
+        <w:t xml:space="preserve">Kommunikationen </w:t>
+      </w:r>
       <w:proofErr w:type="spellStart"/>
       <w:r>
         <w:rPr>
           <w:lang w:val="da-DK"/>
         </w:rPr>
-        <w:t>Nginx</w:t>
+        <w:t>RabbitMQ</w:t>
       </w:r>
       <w:proofErr w:type="spellEnd"/>
     </w:p>
@@ -3663,149 +4380,9 @@
       <w:pPr>
         <w:pStyle w:val="Heading3"/>
       </w:pPr>
-      <w:bookmarkStart w:id="6" w:name="_Toc224464553"/>
-      <w:r>
-        <w:t>2.1.3 DLS Patterns</w:t>
-      </w:r>
-      <w:bookmarkEnd w:id="6"/>
-    </w:p>
-    <w:p>
-      <w:pPr>
-        <w:pStyle w:val="Heading4"/>
-      </w:pPr>
-      <w:r>
-        <w:t>Immutable data (Tombstone and snapshot pattern)</w:t>
-      </w:r>
-    </w:p>
-    <w:p>
-      <w:proofErr w:type="spellStart"/>
-      <w:r>
-        <w:t>Papertrails</w:t>
-      </w:r>
-      <w:proofErr w:type="spellEnd"/>
-      <w:r>
-        <w:t xml:space="preserve"> gem for ruby</w:t>
-      </w:r>
-    </w:p>
-    <w:p/>
-    <w:p>
-      <w:pPr>
-        <w:pStyle w:val="Heading4"/>
-      </w:pPr>
-      <w:r>
-        <w:t>Idempotence</w:t>
-      </w:r>
-    </w:p>
-    <w:p/>
-    <w:p>
-      <w:pPr>
-        <w:pStyle w:val="Heading4"/>
-      </w:pPr>
-      <w:r>
-        <w:t>Caching</w:t>
-      </w:r>
-    </w:p>
-    <w:p>
-      <w:proofErr w:type="spellStart"/>
-      <w:r>
-        <w:t>Tanstack</w:t>
-      </w:r>
-      <w:proofErr w:type="spellEnd"/>
-      <w:r>
-        <w:t xml:space="preserve"> query caching client side</w:t>
-      </w:r>
-    </w:p>
-    <w:p/>
-    <w:p>
-      <w:pPr>
-        <w:pStyle w:val="Heading4"/>
-      </w:pPr>
-      <w:r>
-        <w:t>Asynchronous Messaging Pattern</w:t>
-      </w:r>
-    </w:p>
-    <w:p>
-      <w:proofErr w:type="spellStart"/>
-      <w:r>
-        <w:t>Sidekiq</w:t>
-      </w:r>
-      <w:proofErr w:type="spellEnd"/>
-    </w:p>
-    <w:p>
-      <w:pPr>
-        <w:pStyle w:val="Heading3"/>
-        <w:rPr>
-          <w:lang w:val="da-DK"/>
-        </w:rPr>
-      </w:pPr>
-      <w:bookmarkStart w:id="7" w:name="_Toc224464554"/>
-      <w:r>
-        <w:rPr>
-          <w:lang w:val="da-DK"/>
-        </w:rPr>
+      <w:bookmarkStart w:id="8" w:name="_Toc224764711"/>
+      <w:r>
         <w:lastRenderedPageBreak/>
-        <w:t>2.1</w:t>
-      </w:r>
-      <w:r>
-        <w:rPr>
-          <w:lang w:val="da-DK"/>
-        </w:rPr>
-        <w:t>.</w:t>
-      </w:r>
-      <w:r>
-        <w:rPr>
-          <w:lang w:val="da-DK"/>
-        </w:rPr>
-        <w:t>4</w:t>
-      </w:r>
-      <w:r>
-        <w:rPr>
-          <w:lang w:val="da-DK"/>
-        </w:rPr>
-        <w:t xml:space="preserve"> </w:t>
-      </w:r>
-      <w:r>
-        <w:rPr>
-          <w:lang w:val="da-DK"/>
-        </w:rPr>
-        <w:t>Service til service kommunikation</w:t>
-      </w:r>
-      <w:bookmarkEnd w:id="7"/>
-    </w:p>
-    <w:p>
-      <w:pPr>
-        <w:rPr>
-          <w:lang w:val="da-DK"/>
-        </w:rPr>
-      </w:pPr>
-      <w:r>
-        <w:rPr>
-          <w:lang w:val="da-DK"/>
-        </w:rPr>
-        <w:t xml:space="preserve">Kommunikationen </w:t>
-      </w:r>
-      <w:proofErr w:type="spellStart"/>
-      <w:r>
-        <w:rPr>
-          <w:lang w:val="da-DK"/>
-        </w:rPr>
-        <w:t>RabbitMQ</w:t>
-      </w:r>
-      <w:proofErr w:type="spellEnd"/>
-    </w:p>
-    <w:p>
-      <w:pPr>
-        <w:rPr>
-          <w:lang w:val="da-DK"/>
-        </w:rPr>
-      </w:pPr>
-    </w:p>
-    <w:p>
-      <w:pPr>
-        <w:pStyle w:val="Heading3"/>
-      </w:pPr>
-      <w:bookmarkStart w:id="8" w:name="_Toc224464555"/>
-      <w:r>
         <w:t>2.1.</w:t>
       </w:r>
       <w:r>
@@ -3846,555 +4423,513 @@
     <w:p>
       <w:pPr>
         <w:pStyle w:val="Heading3"/>
-      </w:pPr>
-      <w:bookmarkStart w:id="9" w:name="_Toc224464556"/>
-      <w:r>
+        <w:rPr>
+          <w:lang w:val="da-DK"/>
+        </w:rPr>
+      </w:pPr>
+      <w:bookmarkStart w:id="9" w:name="_Toc224764712"/>
+      <w:r>
+        <w:rPr>
+          <w:lang w:val="da-DK"/>
+        </w:rPr>
         <w:t>2.1.</w:t>
       </w:r>
       <w:r>
+        <w:rPr>
+          <w:lang w:val="da-DK"/>
+        </w:rPr>
         <w:t>6</w:t>
       </w:r>
       <w:r>
-        <w:t xml:space="preserve"> Frontend</w:t>
+        <w:rPr>
+          <w:lang w:val="da-DK"/>
+        </w:rPr>
+        <w:t xml:space="preserve"> </w:t>
+      </w:r>
+      <w:proofErr w:type="spellStart"/>
+      <w:r>
+        <w:rPr>
+          <w:lang w:val="da-DK"/>
+        </w:rPr>
+        <w:t>Frontend</w:t>
       </w:r>
       <w:bookmarkEnd w:id="9"/>
+      <w:proofErr w:type="spellEnd"/>
+    </w:p>
+    <w:p>
+      <w:pPr>
+        <w:rPr>
+          <w:lang w:val="da-DK"/>
+        </w:rPr>
+      </w:pPr>
+    </w:p>
+    <w:p>
+      <w:pPr>
+        <w:pStyle w:val="Heading2"/>
+        <w:rPr>
+          <w:lang w:val="da-DK"/>
+        </w:rPr>
+      </w:pPr>
+      <w:bookmarkStart w:id="10" w:name="_Toc224764713"/>
+      <w:r>
+        <w:rPr>
+          <w:lang w:val="da-DK"/>
+        </w:rPr>
+        <w:t>2.</w:t>
+      </w:r>
+      <w:r>
+        <w:rPr>
+          <w:lang w:val="da-DK"/>
+        </w:rPr>
+        <w:t>2</w:t>
+      </w:r>
+      <w:r>
+        <w:rPr>
+          <w:lang w:val="da-DK"/>
+        </w:rPr>
+        <w:t xml:space="preserve"> </w:t>
+      </w:r>
+      <w:r>
+        <w:rPr>
+          <w:lang w:val="da-DK"/>
+        </w:rPr>
+        <w:t>Environments</w:t>
+      </w:r>
+      <w:bookmarkEnd w:id="10"/>
+    </w:p>
+    <w:p>
+      <w:pPr>
+        <w:rPr>
+          <w:lang w:val="da-DK"/>
+        </w:rPr>
+      </w:pPr>
+      <w:r>
+        <w:rPr>
+          <w:lang w:val="da-DK"/>
+        </w:rPr>
+        <w:t xml:space="preserve">Munchora er hostet på en virtuel maskine hos </w:t>
+      </w:r>
+      <w:proofErr w:type="spellStart"/>
+      <w:r>
+        <w:rPr>
+          <w:lang w:val="da-DK"/>
+        </w:rPr>
+        <w:t>Linode</w:t>
+      </w:r>
+      <w:proofErr w:type="spellEnd"/>
+      <w:r>
+        <w:rPr>
+          <w:lang w:val="da-DK"/>
+        </w:rPr>
+        <w:t xml:space="preserve"> (Akamai Cloud). Jeg har valgt den mest minimalistiske konfiguration med 1 CPU-core, 1 GB RAM og 25 GB hukommelse, hvilket er rigeligt til applikationens nuværende behov. Jeg anvender Docker til mit produktionsmiljø, hvor der bygges separate images til både </w:t>
+      </w:r>
+      <w:proofErr w:type="spellStart"/>
+      <w:r>
+        <w:rPr>
+          <w:lang w:val="da-DK"/>
+        </w:rPr>
+        <w:t>backend</w:t>
+      </w:r>
+      <w:proofErr w:type="spellEnd"/>
+      <w:r>
+        <w:rPr>
+          <w:lang w:val="da-DK"/>
+        </w:rPr>
+        <w:t xml:space="preserve"> (Ruby on </w:t>
+      </w:r>
+      <w:proofErr w:type="spellStart"/>
+      <w:r>
+        <w:rPr>
+          <w:lang w:val="da-DK"/>
+        </w:rPr>
+        <w:t>Rails</w:t>
+      </w:r>
+      <w:proofErr w:type="spellEnd"/>
+      <w:r>
+        <w:rPr>
+          <w:lang w:val="da-DK"/>
+        </w:rPr>
+        <w:t xml:space="preserve">) og </w:t>
+      </w:r>
+      <w:proofErr w:type="spellStart"/>
+      <w:r>
+        <w:rPr>
+          <w:lang w:val="da-DK"/>
+        </w:rPr>
+        <w:t>frontend</w:t>
+      </w:r>
+      <w:proofErr w:type="spellEnd"/>
+      <w:r>
+        <w:rPr>
+          <w:lang w:val="da-DK"/>
+        </w:rPr>
+        <w:t xml:space="preserve"> (React Router v7), som publiceres til GitHub Container Registry (GHCR). På serveren hentes og startes disse images automatisk ved hjælp af </w:t>
+      </w:r>
+      <w:proofErr w:type="spellStart"/>
+      <w:r>
+        <w:rPr>
+          <w:lang w:val="da-DK"/>
+        </w:rPr>
+        <w:t>docker</w:t>
+      </w:r>
+      <w:proofErr w:type="spellEnd"/>
+      <w:r>
+        <w:rPr>
+          <w:lang w:val="da-DK"/>
+        </w:rPr>
+        <w:t xml:space="preserve">-compose, hvor dette simple </w:t>
+      </w:r>
+      <w:proofErr w:type="spellStart"/>
+      <w:r>
+        <w:rPr>
+          <w:lang w:val="da-DK"/>
+        </w:rPr>
+        <w:t>setup</w:t>
+      </w:r>
+      <w:proofErr w:type="spellEnd"/>
+      <w:r>
+        <w:rPr>
+          <w:lang w:val="da-DK"/>
+        </w:rPr>
+        <w:t xml:space="preserve"> gør det nemt at administrere og genstarte systemet som en samlet enhed. Applikationerne har jeg gjort tilgængelige udefra ved en opsat </w:t>
+      </w:r>
+      <w:proofErr w:type="spellStart"/>
+      <w:r>
+        <w:rPr>
+          <w:lang w:val="da-DK"/>
+        </w:rPr>
+        <w:t>Nginx</w:t>
+      </w:r>
+      <w:proofErr w:type="spellEnd"/>
+      <w:r>
+        <w:rPr>
+          <w:lang w:val="da-DK"/>
+        </w:rPr>
+        <w:t xml:space="preserve"> </w:t>
+      </w:r>
+      <w:proofErr w:type="spellStart"/>
+      <w:r>
+        <w:rPr>
+          <w:lang w:val="da-DK"/>
+        </w:rPr>
+        <w:t>reverse</w:t>
+      </w:r>
+      <w:proofErr w:type="spellEnd"/>
+      <w:r>
+        <w:rPr>
+          <w:lang w:val="da-DK"/>
+        </w:rPr>
+        <w:t xml:space="preserve"> proxy, der håndterer indgående trafik på mit domæne munchora.pro. Proxyen dirigerer forespørgsler videre til enten klient eller </w:t>
+      </w:r>
+      <w:proofErr w:type="spellStart"/>
+      <w:r>
+        <w:rPr>
+          <w:lang w:val="da-DK"/>
+        </w:rPr>
+        <w:t>backend</w:t>
+      </w:r>
+      <w:proofErr w:type="spellEnd"/>
+      <w:r>
+        <w:rPr>
+          <w:lang w:val="da-DK"/>
+        </w:rPr>
+        <w:t xml:space="preserve"> containeren afhængigt af URL-strukturen. </w:t>
+      </w:r>
+      <w:proofErr w:type="spellStart"/>
+      <w:r>
+        <w:rPr>
+          <w:lang w:val="da-DK"/>
+        </w:rPr>
+        <w:t>Requests</w:t>
+      </w:r>
+      <w:proofErr w:type="spellEnd"/>
+      <w:r>
+        <w:rPr>
+          <w:lang w:val="da-DK"/>
+        </w:rPr>
+        <w:t xml:space="preserve"> med præfikset </w:t>
+      </w:r>
+      <w:r>
+        <w:rPr>
+          <w:highlight w:val="lightGray"/>
+          <w:lang w:val="da-DK"/>
+        </w:rPr>
+        <w:t>/</w:t>
+      </w:r>
+      <w:proofErr w:type="spellStart"/>
+      <w:r>
+        <w:rPr>
+          <w:highlight w:val="lightGray"/>
+          <w:lang w:val="da-DK"/>
+        </w:rPr>
+        <w:t>api</w:t>
+      </w:r>
+      <w:proofErr w:type="spellEnd"/>
+      <w:r>
+        <w:rPr>
+          <w:highlight w:val="lightGray"/>
+          <w:lang w:val="da-DK"/>
+        </w:rPr>
+        <w:t>/v1/*</w:t>
+      </w:r>
+      <w:r>
+        <w:rPr>
+          <w:lang w:val="da-DK"/>
+        </w:rPr>
+        <w:t xml:space="preserve"> sendes til </w:t>
+      </w:r>
+      <w:proofErr w:type="spellStart"/>
+      <w:r>
+        <w:rPr>
+          <w:lang w:val="da-DK"/>
+        </w:rPr>
+        <w:t>Rails-backenden</w:t>
+      </w:r>
+      <w:proofErr w:type="spellEnd"/>
+      <w:r>
+        <w:rPr>
+          <w:lang w:val="da-DK"/>
+        </w:rPr>
+        <w:t xml:space="preserve">, mens alle andre ruter leveres fra React-klienten. Denne struktur sikrer, at både </w:t>
+      </w:r>
+      <w:proofErr w:type="spellStart"/>
+      <w:r>
+        <w:rPr>
+          <w:lang w:val="da-DK"/>
+        </w:rPr>
+        <w:t>frontend</w:t>
+      </w:r>
+      <w:proofErr w:type="spellEnd"/>
+      <w:r>
+        <w:rPr>
+          <w:lang w:val="da-DK"/>
+        </w:rPr>
+        <w:t xml:space="preserve"> og mit REST-API kan køre gnidningsfrit på samme domæne. Derudover har jeg konfigureret HTTPS ved hjælp af </w:t>
+      </w:r>
+      <w:proofErr w:type="spellStart"/>
+      <w:r>
+        <w:rPr>
+          <w:lang w:val="da-DK"/>
+        </w:rPr>
+        <w:t>Certbot</w:t>
+      </w:r>
+      <w:proofErr w:type="spellEnd"/>
+      <w:r>
+        <w:rPr>
+          <w:lang w:val="da-DK"/>
+        </w:rPr>
+        <w:t xml:space="preserve"> og </w:t>
+      </w:r>
+      <w:proofErr w:type="spellStart"/>
+      <w:r>
+        <w:rPr>
+          <w:lang w:val="da-DK"/>
+        </w:rPr>
+        <w:t>Let’s</w:t>
+      </w:r>
+      <w:proofErr w:type="spellEnd"/>
+      <w:r>
+        <w:rPr>
+          <w:lang w:val="da-DK"/>
+        </w:rPr>
+        <w:t xml:space="preserve"> </w:t>
+      </w:r>
+      <w:proofErr w:type="spellStart"/>
+      <w:r>
+        <w:rPr>
+          <w:lang w:val="da-DK"/>
+        </w:rPr>
+        <w:t>Encrypt</w:t>
+      </w:r>
+      <w:proofErr w:type="spellEnd"/>
+      <w:r>
+        <w:rPr>
+          <w:lang w:val="da-DK"/>
+        </w:rPr>
+        <w:t>, så kommunikationen mellem brugere og server er krypteret i transit. Det beskytter mod man-in-the-</w:t>
+      </w:r>
+      <w:proofErr w:type="spellStart"/>
+      <w:r>
+        <w:rPr>
+          <w:lang w:val="da-DK"/>
+        </w:rPr>
+        <w:t>middle</w:t>
+      </w:r>
+      <w:proofErr w:type="spellEnd"/>
+      <w:r>
+        <w:rPr>
+          <w:lang w:val="da-DK"/>
+        </w:rPr>
+        <w:t xml:space="preserve"> angreb</w:t>
+      </w:r>
+      <w:r>
+        <w:rPr>
+          <w:rStyle w:val="FootnoteReference"/>
+          <w:lang w:val="da-DK"/>
+        </w:rPr>
+        <w:footnoteReference w:id="1"/>
+      </w:r>
+      <w:r>
+        <w:rPr>
+          <w:lang w:val="da-DK"/>
+        </w:rPr>
+        <w:t xml:space="preserve"> og sikrer, at følsomme data, såsom loginoplysninger og API </w:t>
+      </w:r>
+      <w:proofErr w:type="spellStart"/>
+      <w:r>
+        <w:rPr>
+          <w:lang w:val="da-DK"/>
+        </w:rPr>
+        <w:t>requests</w:t>
+      </w:r>
+      <w:proofErr w:type="spellEnd"/>
+      <w:r>
+        <w:rPr>
+          <w:lang w:val="da-DK"/>
+        </w:rPr>
+        <w:t xml:space="preserve"> ikke opsnappes. Samlet set giver denne opsætning en stabil, sikker og vedligeholdelsesbar </w:t>
+      </w:r>
+      <w:proofErr w:type="spellStart"/>
+      <w:r>
+        <w:rPr>
+          <w:lang w:val="da-DK"/>
+        </w:rPr>
+        <w:t>hosting</w:t>
+      </w:r>
+      <w:proofErr w:type="spellEnd"/>
+      <w:r>
+        <w:rPr>
+          <w:lang w:val="da-DK"/>
+        </w:rPr>
+        <w:t xml:space="preserve"> løsning, hvor både </w:t>
+      </w:r>
+      <w:proofErr w:type="spellStart"/>
+      <w:r>
+        <w:rPr>
+          <w:lang w:val="da-DK"/>
+        </w:rPr>
+        <w:t>deployment</w:t>
+      </w:r>
+      <w:proofErr w:type="spellEnd"/>
+      <w:r>
+        <w:rPr>
+          <w:lang w:val="da-DK"/>
+        </w:rPr>
+        <w:t xml:space="preserve"> og drift kan </w:t>
+      </w:r>
+      <w:r>
+        <w:rPr>
+          <w:lang w:val="da-DK"/>
+        </w:rPr>
+        <w:lastRenderedPageBreak/>
+        <w:t>håndteres effektivt med få kommandoer. Det gør det nemt for mig at fortsætte udviklingen af Munchora, uden at driftsdelen bliver en flaskehals.</w:t>
+      </w:r>
+    </w:p>
+    <w:p>
+      <w:pPr>
+        <w:rPr>
+          <w:lang w:val="da-DK"/>
+        </w:rPr>
+      </w:pPr>
+    </w:p>
+    <w:p>
+      <w:pPr>
+        <w:pStyle w:val="Heading3"/>
+      </w:pPr>
+      <w:bookmarkStart w:id="11" w:name="_Toc224764714"/>
+      <w:r>
+        <w:t>2.2.1 Development</w:t>
+      </w:r>
+      <w:bookmarkEnd w:id="11"/>
+    </w:p>
+    <w:p>
+      <w:r>
+        <w:t>Docker-compose</w:t>
+      </w:r>
+    </w:p>
+    <w:p>
+      <w:proofErr w:type="spellStart"/>
+      <w:r>
+        <w:t>Minikube</w:t>
+      </w:r>
+      <w:proofErr w:type="spellEnd"/>
+      <w:r>
+        <w:t xml:space="preserve"> </w:t>
+      </w:r>
+      <w:proofErr w:type="spellStart"/>
+      <w:r>
+        <w:t>kubectl</w:t>
+      </w:r>
+      <w:proofErr w:type="spellEnd"/>
+      <w:r>
+        <w:t>, k9s</w:t>
+      </w:r>
     </w:p>
     <w:p/>
     <w:p>
       <w:pPr>
+        <w:pStyle w:val="Heading3"/>
+      </w:pPr>
+      <w:bookmarkStart w:id="12" w:name="_Toc224764715"/>
+      <w:r>
+        <w:t>2.2.2 Production</w:t>
+      </w:r>
+      <w:bookmarkEnd w:id="12"/>
+    </w:p>
+    <w:p/>
+    <w:p>
+      <w:pPr>
+        <w:pStyle w:val="Heading4"/>
+      </w:pPr>
+      <w:r>
+        <w:t>2.2.2.1 Monitoring, Logging &amp; Tracing</w:t>
+      </w:r>
+    </w:p>
+    <w:p>
+      <w:proofErr w:type="spellStart"/>
+      <w:r>
+        <w:t>Newrelic</w:t>
+      </w:r>
+      <w:proofErr w:type="spellEnd"/>
+    </w:p>
+    <w:p/>
+    <w:p>
+      <w:pPr>
+        <w:pStyle w:val="Heading1"/>
+        <w:rPr>
+          <w:lang w:val="da-DK"/>
+        </w:rPr>
+      </w:pPr>
+      <w:bookmarkStart w:id="13" w:name="_Toc224764716"/>
+      <w:r>
+        <w:rPr>
+          <w:lang w:val="da-DK"/>
+        </w:rPr>
+        <w:t>3.0</w:t>
+      </w:r>
+      <w:r>
+        <w:rPr>
+          <w:lang w:val="da-DK"/>
+        </w:rPr>
+        <w:t xml:space="preserve"> Udviklingsproces</w:t>
+      </w:r>
+      <w:bookmarkEnd w:id="13"/>
+    </w:p>
+    <w:p>
+      <w:pPr>
+        <w:rPr>
+          <w:lang w:val="da-DK"/>
+        </w:rPr>
+      </w:pPr>
+    </w:p>
+    <w:p>
+      <w:pPr>
         <w:pStyle w:val="Heading2"/>
-      </w:pPr>
-      <w:bookmarkStart w:id="10" w:name="_Toc224464557"/>
-      <w:r>
-        <w:t>2.</w:t>
-      </w:r>
-      <w:r>
-        <w:t>2</w:t>
-      </w:r>
-      <w:r>
-        <w:t xml:space="preserve"> </w:t>
-      </w:r>
-      <w:r>
-        <w:t>Environments</w:t>
-      </w:r>
-      <w:bookmarkEnd w:id="10"/>
-    </w:p>
-    <w:p>
-      <w:pPr>
-        <w:rPr>
-          <w:lang w:val="da-DK"/>
-        </w:rPr>
-      </w:pPr>
-      <w:r>
-        <w:rPr>
-          <w:lang w:val="da-DK"/>
-        </w:rPr>
-        <w:t xml:space="preserve">Munchora er hostet på en virtuel maskine hos </w:t>
-      </w:r>
-      <w:proofErr w:type="spellStart"/>
-      <w:r>
-        <w:rPr>
-          <w:lang w:val="da-DK"/>
-        </w:rPr>
-        <w:t>Linode</w:t>
-      </w:r>
-      <w:proofErr w:type="spellEnd"/>
-      <w:r>
-        <w:rPr>
-          <w:lang w:val="da-DK"/>
-        </w:rPr>
-        <w:t xml:space="preserve"> (Akamai Cloud). Jeg har valgt den mest minimalistiske konfiguration med 1 CPU-core, 1 GB RAM og 25 GB hukommelse, hvilket er rigeligt til applikationens nuværende behov. Jeg anvender Docker til mit produktionsmiljø, hvor der bygges separate images til både </w:t>
-      </w:r>
-      <w:proofErr w:type="spellStart"/>
-      <w:r>
-        <w:rPr>
-          <w:lang w:val="da-DK"/>
-        </w:rPr>
-        <w:t>backend</w:t>
-      </w:r>
-      <w:proofErr w:type="spellEnd"/>
-      <w:r>
-        <w:rPr>
-          <w:lang w:val="da-DK"/>
-        </w:rPr>
-        <w:t xml:space="preserve"> (Ruby on </w:t>
-      </w:r>
-      <w:proofErr w:type="spellStart"/>
-      <w:r>
-        <w:rPr>
-          <w:lang w:val="da-DK"/>
-        </w:rPr>
-        <w:t>Rails</w:t>
-      </w:r>
-      <w:proofErr w:type="spellEnd"/>
-      <w:r>
-        <w:rPr>
-          <w:lang w:val="da-DK"/>
-        </w:rPr>
-        <w:t xml:space="preserve">) og </w:t>
-      </w:r>
-      <w:proofErr w:type="spellStart"/>
-      <w:r>
-        <w:rPr>
-          <w:lang w:val="da-DK"/>
-        </w:rPr>
-        <w:t>frontend</w:t>
-      </w:r>
-      <w:proofErr w:type="spellEnd"/>
-      <w:r>
-        <w:rPr>
-          <w:lang w:val="da-DK"/>
-        </w:rPr>
-        <w:t xml:space="preserve"> (React Router v7), som publiceres til GitHub Container Registry (GHCR). På serveren hentes og startes disse images automatisk ved hjælp af </w:t>
-      </w:r>
-      <w:proofErr w:type="spellStart"/>
-      <w:r>
-        <w:rPr>
-          <w:lang w:val="da-DK"/>
-        </w:rPr>
-        <w:t>docker</w:t>
-      </w:r>
-      <w:proofErr w:type="spellEnd"/>
-      <w:r>
-        <w:rPr>
-          <w:lang w:val="da-DK"/>
-        </w:rPr>
-        <w:t xml:space="preserve">-compose, hvor dette simple </w:t>
-      </w:r>
-      <w:proofErr w:type="spellStart"/>
-      <w:r>
-        <w:rPr>
-          <w:lang w:val="da-DK"/>
-        </w:rPr>
-        <w:t>setup</w:t>
-      </w:r>
-      <w:proofErr w:type="spellEnd"/>
-      <w:r>
-        <w:rPr>
-          <w:lang w:val="da-DK"/>
-        </w:rPr>
-        <w:t xml:space="preserve"> gør det nemt at administrere og genstarte systemet som en samlet enhed. Applikationerne har jeg gjort tilgængelige udefra ved en opsat </w:t>
-      </w:r>
-      <w:proofErr w:type="spellStart"/>
-      <w:r>
-        <w:rPr>
-          <w:lang w:val="da-DK"/>
-        </w:rPr>
-        <w:t>Nginx</w:t>
-      </w:r>
-      <w:proofErr w:type="spellEnd"/>
-      <w:r>
-        <w:rPr>
-          <w:lang w:val="da-DK"/>
-        </w:rPr>
-        <w:t xml:space="preserve"> </w:t>
-      </w:r>
-      <w:proofErr w:type="spellStart"/>
-      <w:r>
-        <w:rPr>
-          <w:lang w:val="da-DK"/>
-        </w:rPr>
-        <w:t>reverse</w:t>
-      </w:r>
-      <w:proofErr w:type="spellEnd"/>
-      <w:r>
-        <w:rPr>
-          <w:lang w:val="da-DK"/>
-        </w:rPr>
-        <w:t xml:space="preserve"> proxy, der håndterer indgående trafik på mit domæne munchora.pro. Proxyen dirigerer forespørgsler videre til enten klient eller </w:t>
-      </w:r>
-      <w:proofErr w:type="spellStart"/>
-      <w:r>
-        <w:rPr>
-          <w:lang w:val="da-DK"/>
-        </w:rPr>
-        <w:t>backend</w:t>
-      </w:r>
-      <w:proofErr w:type="spellEnd"/>
-      <w:r>
-        <w:rPr>
-          <w:lang w:val="da-DK"/>
-        </w:rPr>
-        <w:t xml:space="preserve"> containeren afhængigt af URL-strukturen. </w:t>
-      </w:r>
-      <w:proofErr w:type="spellStart"/>
-      <w:r>
-        <w:rPr>
-          <w:lang w:val="da-DK"/>
-        </w:rPr>
-        <w:t>Requests</w:t>
-      </w:r>
-      <w:proofErr w:type="spellEnd"/>
-      <w:r>
-        <w:rPr>
-          <w:lang w:val="da-DK"/>
-        </w:rPr>
-        <w:t xml:space="preserve"> med præfikset </w:t>
-      </w:r>
-      <w:r>
-        <w:rPr>
-          <w:highlight w:val="lightGray"/>
-          <w:lang w:val="da-DK"/>
-        </w:rPr>
-        <w:t>/</w:t>
-      </w:r>
-      <w:proofErr w:type="spellStart"/>
-      <w:r>
-        <w:rPr>
-          <w:highlight w:val="lightGray"/>
-          <w:lang w:val="da-DK"/>
-        </w:rPr>
-        <w:t>api</w:t>
-      </w:r>
-      <w:proofErr w:type="spellEnd"/>
-      <w:r>
-        <w:rPr>
-          <w:highlight w:val="lightGray"/>
-          <w:lang w:val="da-DK"/>
-        </w:rPr>
-        <w:t>/v1/*</w:t>
-      </w:r>
-      <w:r>
-        <w:rPr>
-          <w:lang w:val="da-DK"/>
-        </w:rPr>
-        <w:t xml:space="preserve"> sendes til </w:t>
-      </w:r>
-      <w:proofErr w:type="spellStart"/>
-      <w:r>
-        <w:rPr>
-          <w:lang w:val="da-DK"/>
-        </w:rPr>
-        <w:t>Rails-backenden</w:t>
-      </w:r>
-      <w:proofErr w:type="spellEnd"/>
-      <w:r>
-        <w:rPr>
-          <w:lang w:val="da-DK"/>
-        </w:rPr>
-        <w:t xml:space="preserve">, mens alle andre ruter leveres fra React-klienten. Denne struktur sikrer, at både </w:t>
-      </w:r>
-      <w:proofErr w:type="spellStart"/>
-      <w:r>
-        <w:rPr>
-          <w:lang w:val="da-DK"/>
-        </w:rPr>
-        <w:t>frontend</w:t>
-      </w:r>
-      <w:proofErr w:type="spellEnd"/>
-      <w:r>
-        <w:rPr>
-          <w:lang w:val="da-DK"/>
-        </w:rPr>
-        <w:t xml:space="preserve"> og mit REST-API kan køre gnidningsfrit på samme domæne. Derudover har jeg konfigureret HTTPS ved hjælp af </w:t>
-      </w:r>
-      <w:proofErr w:type="spellStart"/>
-      <w:r>
-        <w:rPr>
-          <w:lang w:val="da-DK"/>
-        </w:rPr>
-        <w:t>Certbot</w:t>
-      </w:r>
-      <w:proofErr w:type="spellEnd"/>
-      <w:r>
-        <w:rPr>
-          <w:lang w:val="da-DK"/>
-        </w:rPr>
-        <w:t xml:space="preserve"> og </w:t>
-      </w:r>
-      <w:proofErr w:type="spellStart"/>
-      <w:r>
-        <w:rPr>
-          <w:lang w:val="da-DK"/>
-        </w:rPr>
-        <w:t>Let’s</w:t>
-      </w:r>
-      <w:proofErr w:type="spellEnd"/>
-      <w:r>
-        <w:rPr>
-          <w:lang w:val="da-DK"/>
-        </w:rPr>
-        <w:t xml:space="preserve"> </w:t>
-      </w:r>
-      <w:proofErr w:type="spellStart"/>
-      <w:r>
-        <w:rPr>
-          <w:lang w:val="da-DK"/>
-        </w:rPr>
-        <w:t>Encrypt</w:t>
-      </w:r>
-      <w:proofErr w:type="spellEnd"/>
-      <w:r>
-        <w:rPr>
-          <w:lang w:val="da-DK"/>
-        </w:rPr>
-        <w:t>, så kommunikationen mellem brugere og server er krypteret i transit. Det beskytter mod man-in-the-</w:t>
-      </w:r>
-      <w:proofErr w:type="spellStart"/>
-      <w:r>
-        <w:rPr>
-          <w:lang w:val="da-DK"/>
-        </w:rPr>
-        <w:t>middle</w:t>
-      </w:r>
-      <w:proofErr w:type="spellEnd"/>
-      <w:r>
-        <w:rPr>
-          <w:lang w:val="da-DK"/>
-        </w:rPr>
-        <w:t xml:space="preserve"> angreb</w:t>
-      </w:r>
-      <w:r>
-        <w:rPr>
-          <w:rStyle w:val="FootnoteReference"/>
-          <w:lang w:val="da-DK"/>
-        </w:rPr>
-        <w:footnoteReference w:id="1"/>
-      </w:r>
-      <w:r>
-        <w:rPr>
-          <w:lang w:val="da-DK"/>
-        </w:rPr>
-        <w:t xml:space="preserve"> og sikrer, at følsomme data, såsom </w:t>
-      </w:r>
-      <w:r>
-        <w:rPr>
-          <w:lang w:val="da-DK"/>
-        </w:rPr>
-        <w:lastRenderedPageBreak/>
-        <w:t xml:space="preserve">loginoplysninger og API </w:t>
-      </w:r>
-      <w:proofErr w:type="spellStart"/>
-      <w:r>
-        <w:rPr>
-          <w:lang w:val="da-DK"/>
-        </w:rPr>
-        <w:t>requests</w:t>
-      </w:r>
-      <w:proofErr w:type="spellEnd"/>
-      <w:r>
-        <w:rPr>
-          <w:lang w:val="da-DK"/>
-        </w:rPr>
-        <w:t xml:space="preserve"> ikke opsnappes. Samlet set giver denne opsætning en stabil, sikker og vedligeholdelsesbar </w:t>
-      </w:r>
-      <w:proofErr w:type="spellStart"/>
-      <w:r>
-        <w:rPr>
-          <w:lang w:val="da-DK"/>
-        </w:rPr>
-        <w:t>hosting</w:t>
-      </w:r>
-      <w:proofErr w:type="spellEnd"/>
-      <w:r>
-        <w:rPr>
-          <w:lang w:val="da-DK"/>
-        </w:rPr>
-        <w:t xml:space="preserve"> løsning, hvor både </w:t>
-      </w:r>
-      <w:proofErr w:type="spellStart"/>
-      <w:r>
-        <w:rPr>
-          <w:lang w:val="da-DK"/>
-        </w:rPr>
-        <w:t>deployment</w:t>
-      </w:r>
-      <w:proofErr w:type="spellEnd"/>
-      <w:r>
-        <w:rPr>
-          <w:lang w:val="da-DK"/>
-        </w:rPr>
-        <w:t xml:space="preserve"> og drift kan håndteres effektivt med få kommandoer. Det gør det nemt for mig at fortsætte udviklingen af Munchora, uden at driftsdelen bliver en flaskehals.</w:t>
-      </w:r>
-    </w:p>
-    <w:p>
-      <w:pPr>
-        <w:rPr>
-          <w:lang w:val="da-DK"/>
-        </w:rPr>
-      </w:pPr>
-    </w:p>
-    <w:p>
-      <w:pPr>
-        <w:pStyle w:val="Heading3"/>
-        <w:rPr>
-          <w:lang w:val="da-DK"/>
-        </w:rPr>
-      </w:pPr>
-      <w:bookmarkStart w:id="11" w:name="_Toc224464558"/>
-      <w:r>
-        <w:rPr>
-          <w:lang w:val="da-DK"/>
-        </w:rPr>
-        <w:t>2.2.1 Development</w:t>
-      </w:r>
-      <w:bookmarkEnd w:id="11"/>
-    </w:p>
-    <w:p>
-      <w:pPr>
-        <w:rPr>
-          <w:lang w:val="da-DK"/>
-        </w:rPr>
-      </w:pPr>
-    </w:p>
-    <w:p>
-      <w:pPr>
-        <w:pStyle w:val="Heading3"/>
-        <w:rPr>
-          <w:lang w:val="da-DK"/>
-        </w:rPr>
-      </w:pPr>
-      <w:bookmarkStart w:id="12" w:name="_Toc224464559"/>
-      <w:r>
-        <w:rPr>
-          <w:lang w:val="da-DK"/>
-        </w:rPr>
-        <w:t xml:space="preserve">2.2.2 </w:t>
-      </w:r>
-      <w:proofErr w:type="spellStart"/>
-      <w:r>
-        <w:rPr>
-          <w:lang w:val="da-DK"/>
-        </w:rPr>
-        <w:t>Production</w:t>
-      </w:r>
-      <w:bookmarkEnd w:id="12"/>
-      <w:proofErr w:type="spellEnd"/>
-    </w:p>
-    <w:p>
-      <w:pPr>
-        <w:rPr>
-          <w:lang w:val="da-DK"/>
-        </w:rPr>
-      </w:pPr>
-    </w:p>
-    <w:p>
-      <w:pPr>
-        <w:pStyle w:val="Heading4"/>
-        <w:rPr>
-          <w:lang w:val="da-DK"/>
-        </w:rPr>
-      </w:pPr>
-      <w:r>
-        <w:rPr>
-          <w:lang w:val="da-DK"/>
-        </w:rPr>
-        <w:t>2.</w:t>
-      </w:r>
-      <w:r>
-        <w:rPr>
-          <w:lang w:val="da-DK"/>
-        </w:rPr>
-        <w:t>2.2.1</w:t>
-      </w:r>
-      <w:r>
-        <w:rPr>
-          <w:lang w:val="da-DK"/>
-        </w:rPr>
-        <w:t xml:space="preserve"> </w:t>
-      </w:r>
-      <w:proofErr w:type="spellStart"/>
-      <w:r>
-        <w:rPr>
-          <w:lang w:val="da-DK"/>
-        </w:rPr>
-        <w:t>Monitoring</w:t>
-      </w:r>
-      <w:proofErr w:type="spellEnd"/>
-      <w:r>
-        <w:rPr>
-          <w:lang w:val="da-DK"/>
-        </w:rPr>
-        <w:t xml:space="preserve">, </w:t>
-      </w:r>
-      <w:proofErr w:type="spellStart"/>
-      <w:r>
-        <w:rPr>
-          <w:lang w:val="da-DK"/>
-        </w:rPr>
-        <w:t>Logging</w:t>
-      </w:r>
-      <w:proofErr w:type="spellEnd"/>
-      <w:r>
-        <w:rPr>
-          <w:lang w:val="da-DK"/>
-        </w:rPr>
-        <w:t xml:space="preserve"> &amp; </w:t>
-      </w:r>
-      <w:proofErr w:type="spellStart"/>
-      <w:r>
-        <w:rPr>
-          <w:lang w:val="da-DK"/>
-        </w:rPr>
-        <w:t>Tracing</w:t>
-      </w:r>
-      <w:proofErr w:type="spellEnd"/>
-    </w:p>
-    <w:p>
-      <w:pPr>
-        <w:rPr>
-          <w:lang w:val="da-DK"/>
-        </w:rPr>
-      </w:pPr>
-      <w:proofErr w:type="spellStart"/>
-      <w:r>
-        <w:rPr>
-          <w:lang w:val="da-DK"/>
-        </w:rPr>
-        <w:t>Newreli</w:t>
-      </w:r>
-      <w:r>
-        <w:rPr>
-          <w:lang w:val="da-DK"/>
-        </w:rPr>
-        <w:t>c</w:t>
-      </w:r>
-      <w:proofErr w:type="spellEnd"/>
-    </w:p>
-    <w:p>
-      <w:pPr>
-        <w:rPr>
-          <w:lang w:val="da-DK"/>
-        </w:rPr>
-      </w:pPr>
-    </w:p>
-    <w:p>
-      <w:pPr>
-        <w:pStyle w:val="Heading1"/>
-        <w:rPr>
-          <w:lang w:val="da-DK"/>
-        </w:rPr>
-      </w:pPr>
-      <w:bookmarkStart w:id="13" w:name="_Toc224464560"/>
-      <w:r>
-        <w:rPr>
-          <w:lang w:val="da-DK"/>
-        </w:rPr>
-        <w:t>3.0</w:t>
-      </w:r>
-      <w:r>
-        <w:rPr>
-          <w:lang w:val="da-DK"/>
-        </w:rPr>
-        <w:t xml:space="preserve"> Udviklingsproces</w:t>
-      </w:r>
-      <w:bookmarkEnd w:id="13"/>
-    </w:p>
-    <w:p>
-      <w:pPr>
-        <w:rPr>
-          <w:lang w:val="da-DK"/>
-        </w:rPr>
-      </w:pPr>
-    </w:p>
-    <w:p>
-      <w:pPr>
-        <w:pStyle w:val="Heading2"/>
-        <w:rPr>
-          <w:lang w:val="da-DK"/>
-        </w:rPr>
-      </w:pPr>
-      <w:bookmarkStart w:id="14" w:name="_Toc224464561"/>
+        <w:rPr>
+          <w:lang w:val="da-DK"/>
+        </w:rPr>
+      </w:pPr>
+      <w:bookmarkStart w:id="14" w:name="_Toc224764717"/>
       <w:r>
         <w:rPr>
           <w:lang w:val="da-DK"/>
@@ -4424,7 +4959,7 @@
           <w:lang w:val="da-DK"/>
         </w:rPr>
       </w:pPr>
-      <w:bookmarkStart w:id="15" w:name="_Toc224464562"/>
+      <w:bookmarkStart w:id="15" w:name="_Toc224764718"/>
       <w:r>
         <w:rPr>
           <w:lang w:val="da-DK"/>
@@ -4465,7 +5000,7 @@
           <w:lang w:val="da-DK"/>
         </w:rPr>
       </w:pPr>
-      <w:bookmarkStart w:id="16" w:name="_Toc224464563"/>
+      <w:bookmarkStart w:id="16" w:name="_Toc224764719"/>
       <w:r>
         <w:rPr>
           <w:lang w:val="da-DK"/>
@@ -4482,25 +5017,7 @@
         <w:rPr>
           <w:lang w:val="da-DK"/>
         </w:rPr>
-        <w:t>.</w:t>
-      </w:r>
-      <w:r>
-        <w:rPr>
-          <w:lang w:val="da-DK"/>
-        </w:rPr>
-        <w:t>2</w:t>
-      </w:r>
-      <w:r>
-        <w:rPr>
-          <w:lang w:val="da-DK"/>
-        </w:rPr>
-        <w:t xml:space="preserve"> </w:t>
-      </w:r>
-      <w:r>
-        <w:rPr>
-          <w:lang w:val="da-DK"/>
-        </w:rPr>
-        <w:t>Ikke funktionel</w:t>
+        <w:t>.2 Ikke funktionel</w:t>
       </w:r>
       <w:bookmarkEnd w:id="16"/>
     </w:p>
@@ -4654,7 +5171,7 @@
       <w:pPr>
         <w:pStyle w:val="Heading2"/>
       </w:pPr>
-      <w:bookmarkStart w:id="17" w:name="_Toc224464564"/>
+      <w:bookmarkStart w:id="17" w:name="_Toc224764720"/>
       <w:r>
         <w:t>3</w:t>
       </w:r>
@@ -4673,7 +5190,7 @@
       <w:pPr>
         <w:pStyle w:val="Heading1"/>
       </w:pPr>
-      <w:bookmarkStart w:id="18" w:name="_Toc224464565"/>
+      <w:bookmarkStart w:id="18" w:name="_Toc224764721"/>
       <w:r>
         <w:t>4</w:t>
       </w:r>
@@ -4690,7 +5207,7 @@
       <w:pPr>
         <w:pStyle w:val="Heading2"/>
       </w:pPr>
-      <w:bookmarkStart w:id="19" w:name="_Toc224464566"/>
+      <w:bookmarkStart w:id="19" w:name="_Toc224764722"/>
       <w:r>
         <w:t>4</w:t>
       </w:r>
@@ -4704,24 +5221,12 @@
       <w:pPr>
         <w:pStyle w:val="Heading2"/>
       </w:pPr>
-      <w:bookmarkStart w:id="20" w:name="_Toc224464567"/>
+      <w:bookmarkStart w:id="20" w:name="_Toc224764723"/>
       <w:r>
         <w:t>4</w:t>
       </w:r>
       <w:r>
-        <w:t>.</w:t>
-      </w:r>
-      <w:r>
-        <w:t>2</w:t>
-      </w:r>
-      <w:r>
-        <w:t xml:space="preserve"> </w:t>
-      </w:r>
-      <w:r>
-        <w:t>Integration</w:t>
-      </w:r>
-      <w:r>
-        <w:t xml:space="preserve"> Tests</w:t>
+        <w:t>.2 Integration Tests</w:t>
       </w:r>
       <w:bookmarkEnd w:id="20"/>
     </w:p>
@@ -4730,21 +5235,12 @@
       <w:pPr>
         <w:pStyle w:val="Heading2"/>
       </w:pPr>
-      <w:bookmarkStart w:id="21" w:name="_Toc224464568"/>
+      <w:bookmarkStart w:id="21" w:name="_Toc224764724"/>
       <w:r>
         <w:t>4</w:t>
       </w:r>
       <w:r>
-        <w:t>.</w:t>
-      </w:r>
-      <w:r>
-        <w:t>3</w:t>
-      </w:r>
-      <w:r>
-        <w:t xml:space="preserve"> </w:t>
-      </w:r>
-      <w:r>
-        <w:t>API Tests</w:t>
+        <w:t>.3 API Tests</w:t>
       </w:r>
       <w:bookmarkEnd w:id="21"/>
     </w:p>
@@ -4753,68 +5249,35 @@
       <w:pPr>
         <w:pStyle w:val="Heading2"/>
       </w:pPr>
-      <w:bookmarkStart w:id="22" w:name="_Toc224464569"/>
+      <w:bookmarkStart w:id="22" w:name="_Toc224764725"/>
       <w:r>
         <w:t>4</w:t>
       </w:r>
       <w:r>
-        <w:t>.</w:t>
-      </w:r>
-      <w:r>
+        <w:t>.4 End to end tests</w:t>
+      </w:r>
+      <w:bookmarkEnd w:id="22"/>
+    </w:p>
+    <w:p/>
+    <w:p>
+      <w:pPr>
+        <w:pStyle w:val="Heading2"/>
+        <w:rPr>
+          <w:lang w:val="da-DK"/>
+        </w:rPr>
+      </w:pPr>
+      <w:bookmarkStart w:id="23" w:name="_Toc224764726"/>
+      <w:r>
+        <w:rPr>
+          <w:lang w:val="da-DK"/>
+        </w:rPr>
         <w:t>4</w:t>
       </w:r>
       <w:r>
-        <w:t xml:space="preserve"> </w:t>
-      </w:r>
-      <w:r>
-        <w:t>End to end tests</w:t>
-      </w:r>
-      <w:bookmarkEnd w:id="22"/>
-    </w:p>
-    <w:p/>
-    <w:p>
-      <w:pPr>
-        <w:pStyle w:val="Heading2"/>
-        <w:rPr>
-          <w:lang w:val="da-DK"/>
-        </w:rPr>
-      </w:pPr>
-      <w:bookmarkStart w:id="23" w:name="_Toc224464570"/>
-      <w:r>
-        <w:rPr>
-          <w:lang w:val="da-DK"/>
-        </w:rPr>
-        <w:t>4</w:t>
-      </w:r>
-      <w:r>
-        <w:rPr>
-          <w:lang w:val="da-DK"/>
-        </w:rPr>
-        <w:t>.</w:t>
-      </w:r>
-      <w:r>
-        <w:rPr>
-          <w:lang w:val="da-DK"/>
-        </w:rPr>
-        <w:t>5</w:t>
-      </w:r>
-      <w:r>
-        <w:rPr>
-          <w:lang w:val="da-DK"/>
-        </w:rPr>
-        <w:t xml:space="preserve"> </w:t>
-      </w:r>
-      <w:r>
-        <w:rPr>
-          <w:lang w:val="da-DK"/>
-        </w:rPr>
-        <w:t>Performance</w:t>
-      </w:r>
-      <w:r>
-        <w:rPr>
-          <w:lang w:val="da-DK"/>
-        </w:rPr>
-        <w:t xml:space="preserve"> Tests</w:t>
+        <w:rPr>
+          <w:lang w:val="da-DK"/>
+        </w:rPr>
+        <w:t>.5 Performance Tests</w:t>
       </w:r>
       <w:bookmarkEnd w:id="23"/>
     </w:p>
@@ -4832,7 +5295,7 @@
           <w:lang w:val="da-DK"/>
         </w:rPr>
       </w:pPr>
-      <w:bookmarkStart w:id="24" w:name="_Toc224464571"/>
+      <w:bookmarkStart w:id="24" w:name="_Toc224764727"/>
       <w:r>
         <w:rPr>
           <w:lang w:val="da-DK"/>
@@ -4856,7 +5319,7 @@
           <w:lang w:val="da-DK"/>
         </w:rPr>
       </w:pPr>
-      <w:bookmarkStart w:id="25" w:name="_Toc224464572"/>
+      <w:bookmarkStart w:id="25" w:name="_Toc224764728"/>
       <w:r>
         <w:rPr>
           <w:lang w:val="da-DK"/>
@@ -4891,7 +5354,7 @@
           <w:lang w:val="da-DK"/>
         </w:rPr>
       </w:pPr>
-      <w:bookmarkStart w:id="26" w:name="_Toc224464573"/>
+      <w:bookmarkStart w:id="26" w:name="_Toc224764729"/>
       <w:r>
         <w:rPr>
           <w:lang w:val="da-DK"/>

</xml_diff>

<commit_message>
fix port for local dev env
</commit_message>
<xml_diff>
--- a/bachelor-projekt-rapport-munchora.docx
+++ b/bachelor-projekt-rapport-munchora.docx
@@ -754,109 +754,64 @@
               <w:szCs w:val="24"/>
             </w:rPr>
           </w:pPr>
-          <w:r>
-            <w:rPr>
-              <w:rStyle w:val="Hyperlink"/>
-              <w:noProof/>
-            </w:rPr>
-            <w:fldChar w:fldCharType="begin"/>
-          </w:r>
-          <w:r>
-            <w:rPr>
-              <w:rStyle w:val="Hyperlink"/>
-              <w:noProof/>
-            </w:rPr>
-            <w:instrText xml:space="preserve"> </w:instrText>
-          </w:r>
-          <w:r>
-            <w:rPr>
-              <w:noProof/>
-            </w:rPr>
-            <w:instrText>HYPERLINK \l "_Toc225456209"</w:instrText>
-          </w:r>
-          <w:r>
-            <w:rPr>
-              <w:rStyle w:val="Hyperlink"/>
-              <w:noProof/>
-            </w:rPr>
-            <w:instrText xml:space="preserve"> </w:instrText>
-          </w:r>
-          <w:r>
-            <w:rPr>
-              <w:rStyle w:val="Hyperlink"/>
-              <w:noProof/>
-            </w:rPr>
-          </w:r>
-          <w:r>
-            <w:rPr>
-              <w:rStyle w:val="Hyperlink"/>
-              <w:noProof/>
-            </w:rPr>
-            <w:fldChar w:fldCharType="separate"/>
-          </w:r>
-          <w:r>
-            <w:rPr>
-              <w:rStyle w:val="Hyperlink"/>
-              <w:noProof/>
-              <w:lang w:val="da-DK"/>
-            </w:rPr>
-            <w:t>1.1 Problemformulering</w:t>
-          </w:r>
-          <w:r>
-            <w:rPr>
-              <w:noProof/>
-              <w:webHidden/>
-            </w:rPr>
-            <w:tab/>
-          </w:r>
-          <w:r>
-            <w:rPr>
-              <w:noProof/>
-              <w:webHidden/>
-            </w:rPr>
-            <w:fldChar w:fldCharType="begin"/>
-          </w:r>
-          <w:r>
-            <w:rPr>
-              <w:noProof/>
-              <w:webHidden/>
-            </w:rPr>
-            <w:instrText xml:space="preserve"> PAGEREF _Toc225456209 \h </w:instrText>
-          </w:r>
-          <w:r>
-            <w:rPr>
-              <w:noProof/>
-              <w:webHidden/>
-            </w:rPr>
-          </w:r>
-          <w:r>
-            <w:rPr>
-              <w:noProof/>
-              <w:webHidden/>
-            </w:rPr>
-            <w:fldChar w:fldCharType="separate"/>
-          </w:r>
-          <w:r>
-            <w:rPr>
-              <w:noProof/>
-              <w:webHidden/>
-            </w:rPr>
-            <w:t>3</w:t>
-          </w:r>
-          <w:r>
-            <w:rPr>
-              <w:noProof/>
-              <w:webHidden/>
-            </w:rPr>
-            <w:fldChar w:fldCharType="end"/>
-          </w:r>
-          <w:r>
-            <w:rPr>
-              <w:rStyle w:val="Hyperlink"/>
-              <w:noProof/>
-            </w:rPr>
-            <w:fldChar w:fldCharType="end"/>
-          </w:r>
+          <w:hyperlink w:anchor="_Toc225456209" w:history="1">
+            <w:r>
+              <w:rPr>
+                <w:rStyle w:val="Hyperlink"/>
+                <w:noProof/>
+                <w:lang w:val="da-DK"/>
+              </w:rPr>
+              <w:t>1.1 Problemformulering</w:t>
+            </w:r>
+            <w:r>
+              <w:rPr>
+                <w:noProof/>
+                <w:webHidden/>
+              </w:rPr>
+              <w:tab/>
+            </w:r>
+            <w:r>
+              <w:rPr>
+                <w:noProof/>
+                <w:webHidden/>
+              </w:rPr>
+              <w:fldChar w:fldCharType="begin"/>
+            </w:r>
+            <w:r>
+              <w:rPr>
+                <w:noProof/>
+                <w:webHidden/>
+              </w:rPr>
+              <w:instrText xml:space="preserve"> PAGEREF _Toc225456209 \h </w:instrText>
+            </w:r>
+            <w:r>
+              <w:rPr>
+                <w:noProof/>
+                <w:webHidden/>
+              </w:rPr>
+            </w:r>
+            <w:r>
+              <w:rPr>
+                <w:noProof/>
+                <w:webHidden/>
+              </w:rPr>
+              <w:fldChar w:fldCharType="separate"/>
+            </w:r>
+            <w:r>
+              <w:rPr>
+                <w:noProof/>
+                <w:webHidden/>
+              </w:rPr>
+              <w:t>3</w:t>
+            </w:r>
+            <w:r>
+              <w:rPr>
+                <w:noProof/>
+                <w:webHidden/>
+              </w:rPr>
+              <w:fldChar w:fldCharType="end"/>
+            </w:r>
+          </w:hyperlink>
         </w:p>
         <w:p>
           <w:pPr>
@@ -2681,7 +2636,13 @@
         <w:rPr>
           <w:lang w:val="da-DK"/>
         </w:rPr>
-        <w:t xml:space="preserve"> Min a</w:t>
+        <w:t xml:space="preserve"> </w:t>
+      </w:r>
+      <w:r>
+        <w:rPr>
+          <w:lang w:val="da-DK"/>
+        </w:rPr>
+        <w:t>A</w:t>
       </w:r>
       <w:r>
         <w:rPr>
@@ -2693,25 +2654,43 @@
         <w:rPr>
           <w:lang w:val="da-DK"/>
         </w:rPr>
+        <w:t>en</w:t>
+      </w:r>
+      <w:r>
+        <w:rPr>
+          <w:lang w:val="da-DK"/>
+        </w:rPr>
         <w:t xml:space="preserve"> </w:t>
       </w:r>
       <w:r>
         <w:rPr>
           <w:lang w:val="da-DK"/>
         </w:rPr>
-        <w:t xml:space="preserve">giver brugerne mulighed for at oprette en </w:t>
-      </w:r>
-      <w:r>
-        <w:rPr>
-          <w:lang w:val="da-DK"/>
-        </w:rPr>
-        <w:t>bruger</w:t>
-      </w:r>
-      <w:r>
-        <w:rPr>
-          <w:lang w:val="da-DK"/>
-        </w:rPr>
-        <w:t xml:space="preserve"> enten manuelt eller via Google Single </w:t>
+        <w:t>giver brugerne mulighed for</w:t>
+      </w:r>
+      <w:r>
+        <w:rPr>
+          <w:lang w:val="da-DK"/>
+        </w:rPr>
+        <w:t xml:space="preserve"> </w:t>
+      </w:r>
+      <w:r>
+        <w:rPr>
+          <w:lang w:val="da-DK"/>
+        </w:rPr>
+        <w:t>at oprette sig</w:t>
+      </w:r>
+      <w:r>
+        <w:rPr>
+          <w:lang w:val="da-DK"/>
+        </w:rPr>
+        <w:t xml:space="preserve"> </w:t>
+      </w:r>
+      <w:r>
+        <w:rPr>
+          <w:lang w:val="da-DK"/>
+        </w:rPr>
+        <w:t xml:space="preserve">enten manuelt eller via Google Single </w:t>
       </w:r>
       <w:proofErr w:type="spellStart"/>
       <w:r>
@@ -2848,7 +2827,25 @@
         <w:rPr>
           <w:lang w:val="da-DK"/>
         </w:rPr>
-        <w:t>på både udvikling af en skalerbar og brugervenlig applikation samt integration af moderne teknologier, herunder webudvikling, autentifikation og anvendelse af kunstig intelligens. Samtidig danner projektet grundlag for refleksion over designvalg, arkitektur og brugeroplevelse i udviklingen af moderne softwareløsninger.</w:t>
+        <w:t xml:space="preserve">både </w:t>
+      </w:r>
+      <w:r>
+        <w:rPr>
+          <w:lang w:val="da-DK"/>
+        </w:rPr>
+        <w:t>på udvikling</w:t>
+      </w:r>
+      <w:r>
+        <w:rPr>
+          <w:lang w:val="da-DK"/>
+        </w:rPr>
+        <w:t>en</w:t>
+      </w:r>
+      <w:r>
+        <w:rPr>
+          <w:lang w:val="da-DK"/>
+        </w:rPr>
+        <w:t xml:space="preserve"> af en skalerbar og brugervenlig applikation samt integration af moderne teknologier, herunder webudvikling, autentifikation og anvendelse af kunstig intelligens. Samtidig danner projektet grundlag for refleksion over designvalg, arkitektur og brugeroplevelse i udviklingen af moderne softwareløsninger.</w:t>
       </w:r>
     </w:p>
     <w:p>
@@ -2883,32 +2880,152 @@
     <w:p>
       <w:pPr>
         <w:rPr>
-          <w:lang w:val="da-DK"/>
-        </w:rPr>
-      </w:pPr>
-      <w:r>
-        <w:rPr>
-          <w:lang w:val="da-DK"/>
-        </w:rPr>
-        <w:t>Udvikle en skalerbar digital platform</w:t>
-      </w:r>
-      <w:r>
-        <w:rPr>
-          <w:lang w:val="da-DK"/>
-        </w:rPr>
-        <w:t xml:space="preserve"> til generering af opskrifter og håndtering af indkøbsliste</w:t>
-      </w:r>
-      <w:r>
-        <w:rPr>
-          <w:lang w:val="da-DK"/>
-        </w:rPr>
-        <w:t>r</w:t>
-      </w:r>
-      <w:r>
-        <w:rPr>
-          <w:lang w:val="da-DK"/>
-        </w:rPr>
-        <w:t>, baseret på en mikroservice</w:t>
+          <w:i/>
+          <w:iCs/>
+          <w:lang w:val="da-DK"/>
+        </w:rPr>
+      </w:pPr>
+      <w:r>
+        <w:rPr>
+          <w:i/>
+          <w:iCs/>
+          <w:lang w:val="da-DK"/>
+        </w:rPr>
+        <w:t xml:space="preserve">Hvordan udvikles en robust og skalerbar webapplikation til </w:t>
+      </w:r>
+      <w:r>
+        <w:rPr>
+          <w:i/>
+          <w:iCs/>
+          <w:lang w:val="da-DK"/>
+        </w:rPr>
+        <w:t xml:space="preserve">generering af opskrifter og håndtering af indkøbslister </w:t>
+      </w:r>
+      <w:r>
+        <w:rPr>
+          <w:i/>
+          <w:iCs/>
+          <w:lang w:val="da-DK"/>
+        </w:rPr>
+        <w:t xml:space="preserve">ved brug af </w:t>
+      </w:r>
+      <w:r>
+        <w:rPr>
+          <w:i/>
+          <w:iCs/>
+          <w:lang w:val="da-DK"/>
+        </w:rPr>
+        <w:t xml:space="preserve">en </w:t>
+      </w:r>
+      <w:r>
+        <w:rPr>
+          <w:i/>
+          <w:iCs/>
+          <w:lang w:val="da-DK"/>
+        </w:rPr>
+        <w:t>mikroservice</w:t>
+      </w:r>
+      <w:r>
+        <w:rPr>
+          <w:i/>
+          <w:iCs/>
+          <w:lang w:val="da-DK"/>
+        </w:rPr>
+        <w:t xml:space="preserve"> arkitektur</w:t>
+      </w:r>
+      <w:r>
+        <w:rPr>
+          <w:i/>
+          <w:iCs/>
+          <w:lang w:val="da-DK"/>
+        </w:rPr>
+        <w:t xml:space="preserve">, så systemet forbliver fejlresistent </w:t>
+      </w:r>
+      <w:r>
+        <w:rPr>
+          <w:i/>
+          <w:iCs/>
+          <w:lang w:val="da-DK"/>
+        </w:rPr>
+        <w:t>under høj belastning</w:t>
+      </w:r>
+      <w:r>
+        <w:rPr>
+          <w:i/>
+          <w:iCs/>
+          <w:lang w:val="da-DK"/>
+        </w:rPr>
+        <w:t>?</w:t>
+      </w:r>
+    </w:p>
+    <w:p>
+      <w:pPr>
+        <w:rPr>
+          <w:lang w:val="da-DK"/>
+        </w:rPr>
+      </w:pPr>
+      <w:r>
+        <w:rPr>
+          <w:lang w:val="da-DK"/>
+        </w:rPr>
+        <w:t xml:space="preserve">Med fokus på udviklingen af en skalerbar platform undersøges det, hvordan de enkelte services interagerer, samt hvordan uafhængig skalering og </w:t>
+      </w:r>
+      <w:proofErr w:type="spellStart"/>
+      <w:r>
+        <w:rPr>
+          <w:lang w:val="da-DK"/>
+        </w:rPr>
+        <w:t>deployment</w:t>
+      </w:r>
+      <w:proofErr w:type="spellEnd"/>
+      <w:r>
+        <w:rPr>
+          <w:lang w:val="da-DK"/>
+        </w:rPr>
+        <w:t xml:space="preserve"> optimerer systemets pålidelighed </w:t>
+      </w:r>
+      <w:r>
+        <w:rPr>
+          <w:lang w:val="da-DK"/>
+        </w:rPr>
+        <w:t>for at</w:t>
+      </w:r>
+      <w:r>
+        <w:rPr>
+          <w:lang w:val="da-DK"/>
+        </w:rPr>
+        <w:t xml:space="preserve"> understøtte en bruger</w:t>
+      </w:r>
+      <w:r>
+        <w:rPr>
+          <w:lang w:val="da-DK"/>
+        </w:rPr>
+        <w:t xml:space="preserve">venlig </w:t>
+      </w:r>
+      <w:r>
+        <w:rPr>
+          <w:lang w:val="da-DK"/>
+        </w:rPr>
+        <w:t>oplevelse</w:t>
+      </w:r>
+      <w:r>
+        <w:rPr>
+          <w:lang w:val="da-DK"/>
+        </w:rPr>
+        <w:t>.</w:t>
+      </w:r>
+    </w:p>
+    <w:p>
+      <w:pPr>
+        <w:rPr>
+          <w:lang w:val="da-DK"/>
+        </w:rPr>
+      </w:pPr>
+      <w:r>
+        <w:rPr>
+          <w:lang w:val="da-DK"/>
+        </w:rPr>
+        <w:t>Platformen skal understøtte funktioner som brugerhåndtering, opskrifts</w:t>
       </w:r>
       <w:r>
         <w:rPr>
@@ -2920,13 +3037,13 @@
         <w:rPr>
           <w:lang w:val="da-DK"/>
         </w:rPr>
-        <w:t>orienteret arkitektur. Platformen skal understøtte funktioner som brugerhåndtering, opskriftssøgning</w:t>
-      </w:r>
-      <w:r>
-        <w:rPr>
-          <w:lang w:val="da-DK"/>
-        </w:rPr>
-        <w:t xml:space="preserve">, </w:t>
+        <w:t>søgning</w:t>
+      </w:r>
+      <w:r>
+        <w:rPr>
+          <w:lang w:val="da-DK"/>
+        </w:rPr>
+        <w:t xml:space="preserve"> og </w:t>
       </w:r>
       <w:r>
         <w:rPr>
@@ -2944,19 +3061,55 @@
         <w:rPr>
           <w:lang w:val="da-DK"/>
         </w:rPr>
-        <w:t xml:space="preserve"> håndtering af indkøbslister samt en brugervenlig og sammenhængende oplevelse for brugeren. Systemet skal være pålideligt og kunne håndtere mange samtidige brugere. </w:t>
-      </w:r>
-      <w:r>
-        <w:rPr>
-          <w:lang w:val="da-DK"/>
-        </w:rPr>
-        <w:t xml:space="preserve">Microservice </w:t>
-      </w:r>
-      <w:r>
-        <w:rPr>
-          <w:lang w:val="da-DK"/>
-        </w:rPr>
-        <w:t>arkitektur</w:t>
+        <w:t xml:space="preserve"> </w:t>
+      </w:r>
+      <w:r>
+        <w:rPr>
+          <w:lang w:val="da-DK"/>
+        </w:rPr>
+        <w:t xml:space="preserve">deling </w:t>
+      </w:r>
+      <w:r>
+        <w:rPr>
+          <w:lang w:val="da-DK"/>
+        </w:rPr>
+        <w:t xml:space="preserve">af indkøbslister. Systemet skal være pålideligt og </w:t>
+      </w:r>
+      <w:r>
+        <w:rPr>
+          <w:lang w:val="da-DK"/>
+        </w:rPr>
+        <w:t>potentielt være i stand til at</w:t>
+      </w:r>
+      <w:r>
+        <w:rPr>
+          <w:lang w:val="da-DK"/>
+        </w:rPr>
+        <w:t xml:space="preserve"> håndtere </w:t>
+      </w:r>
+      <w:r>
+        <w:rPr>
+          <w:lang w:val="da-DK"/>
+        </w:rPr>
+        <w:t xml:space="preserve">flere tusinde </w:t>
+      </w:r>
+      <w:r>
+        <w:rPr>
+          <w:lang w:val="da-DK"/>
+        </w:rPr>
+        <w:t xml:space="preserve">samtidige brugere. </w:t>
+      </w:r>
+      <w:r>
+        <w:rPr>
+          <w:lang w:val="da-DK"/>
+        </w:rPr>
+        <w:t>A</w:t>
+      </w:r>
+      <w:r>
+        <w:rPr>
+          <w:lang w:val="da-DK"/>
+        </w:rPr>
+        <w:t>rkitektur</w:t>
       </w:r>
       <w:r>
         <w:rPr>
@@ -2970,19 +3123,11 @@
         </w:rPr>
         <w:t xml:space="preserve"> </w:t>
       </w:r>
-      <w:proofErr w:type="gramStart"/>
-      <w:r>
-        <w:rPr>
-          <w:lang w:val="da-DK"/>
-        </w:rPr>
-        <w:t>sikrer</w:t>
-      </w:r>
-      <w:proofErr w:type="gramEnd"/>
-      <w:r>
-        <w:rPr>
-          <w:lang w:val="da-DK"/>
-        </w:rPr>
-        <w:t xml:space="preserve"> </w:t>
+      <w:r>
+        <w:rPr>
+          <w:lang w:val="da-DK"/>
+        </w:rPr>
+        <w:t xml:space="preserve">sikre </w:t>
       </w:r>
       <w:r>
         <w:rPr>
@@ -3050,31 +3195,7 @@
         <w:rPr>
           <w:lang w:val="da-DK"/>
         </w:rPr>
-        <w:t xml:space="preserve"> og skaleres uafhængigt. Samtidig </w:t>
-      </w:r>
-      <w:r>
-        <w:rPr>
-          <w:lang w:val="da-DK"/>
-        </w:rPr>
-        <w:t xml:space="preserve">kræves et </w:t>
-      </w:r>
-      <w:r>
-        <w:rPr>
-          <w:lang w:val="da-DK"/>
-        </w:rPr>
-        <w:t>fokus</w:t>
-      </w:r>
-      <w:r>
-        <w:rPr>
-          <w:lang w:val="da-DK"/>
-        </w:rPr>
-        <w:t xml:space="preserve"> </w:t>
-      </w:r>
-      <w:r>
-        <w:rPr>
-          <w:lang w:val="da-DK"/>
-        </w:rPr>
-        <w:t>på brugervenlighed, tilgængelighed og høj oppetid for at sikre en stabil platform.</w:t>
+        <w:t xml:space="preserve"> og skaleres uafhængigt.</w:t>
       </w:r>
     </w:p>
     <w:p>
@@ -3135,7 +3256,13 @@
         <w:rPr>
           <w:lang w:val="da-DK"/>
         </w:rPr>
-        <w:t xml:space="preserve">Dette afsnit vil redegøre for den </w:t>
+        <w:t xml:space="preserve">Følgende afsnit vil </w:t>
+      </w:r>
+      <w:r>
+        <w:rPr>
+          <w:lang w:val="da-DK"/>
+        </w:rPr>
+        <w:t xml:space="preserve">redegøre for den </w:t>
       </w:r>
       <w:r>
         <w:rPr>
@@ -3191,6 +3318,12 @@
         </w:rPr>
         <w:t xml:space="preserve">. Applikationen er opbygget med en klar opdeling mellem </w:t>
       </w:r>
+      <w:r>
+        <w:rPr>
+          <w:lang w:val="da-DK"/>
+        </w:rPr>
+        <w:t xml:space="preserve">en </w:t>
+      </w:r>
       <w:proofErr w:type="spellStart"/>
       <w:r>
         <w:rPr>
@@ -3203,7 +3336,13 @@
         <w:rPr>
           <w:lang w:val="da-DK"/>
         </w:rPr>
-        <w:t xml:space="preserve">, </w:t>
+        <w:t xml:space="preserve"> og flere</w:t>
+      </w:r>
+      <w:r>
+        <w:rPr>
+          <w:lang w:val="da-DK"/>
+        </w:rPr>
+        <w:t xml:space="preserve"> </w:t>
       </w:r>
       <w:proofErr w:type="spellStart"/>
       <w:r>
@@ -3223,7 +3362,19 @@
         <w:rPr>
           <w:lang w:val="da-DK"/>
         </w:rPr>
-        <w:t xml:space="preserve"> og datalagring </w:t>
+        <w:t xml:space="preserve"> </w:t>
+      </w:r>
+      <w:r>
+        <w:rPr>
+          <w:lang w:val="da-DK"/>
+        </w:rPr>
+        <w:t xml:space="preserve">samt </w:t>
+      </w:r>
+      <w:r>
+        <w:rPr>
+          <w:lang w:val="da-DK"/>
+        </w:rPr>
+        <w:t xml:space="preserve">datalagring </w:t>
       </w:r>
       <w:r>
         <w:rPr>
@@ -3281,9 +3432,9 @@
           <w:lang w:val="da-DK"/>
         </w:rPr>
         <w:drawing>
-          <wp:inline distT="0" distB="0" distL="0" distR="0" wp14:anchorId="7ADA719C" wp14:editId="2EE7BAA2">
-            <wp:extent cx="6586758" cy="4474210"/>
-            <wp:effectExtent l="0" t="0" r="5080" b="0"/>
+          <wp:inline distT="0" distB="0" distL="0" distR="0" wp14:anchorId="7ADA719C" wp14:editId="7D20CE7B">
+            <wp:extent cx="6536344" cy="4439966"/>
+            <wp:effectExtent l="0" t="0" r="4445" b="5080"/>
             <wp:docPr id="1739710769" name="Picture 2" descr="A diagram of a company&#10;&#10;AI-generated content may be incorrect."/>
             <wp:cNvGraphicFramePr>
               <a:graphicFrameLocks xmlns:a="http://schemas.openxmlformats.org/drawingml/2006/main" noChangeAspect="1"/>
@@ -3310,7 +3461,7 @@
                   <pic:spPr>
                     <a:xfrm>
                       <a:off x="0" y="0"/>
-                      <a:ext cx="6620055" cy="4496828"/>
+                      <a:ext cx="6607023" cy="4487976"/>
                     </a:xfrm>
                     <a:prstGeom prst="rect">
                       <a:avLst/>
@@ -5046,7 +5197,13 @@
         <w:t>-service men for at gøre det robust …</w:t>
       </w:r>
     </w:p>
-    <w:p/>
+    <w:p>
+      <w:pPr>
+        <w:rPr>
+          <w:lang w:val="da-DK"/>
+        </w:rPr>
+      </w:pPr>
+    </w:p>
     <w:p>
       <w:pPr>
         <w:pStyle w:val="Heading3"/>
@@ -5242,416 +5399,862 @@
     <w:p>
       <w:pPr>
         <w:pStyle w:val="Heading4"/>
-      </w:pPr>
-      <w:r>
+        <w:rPr>
+          <w:lang w:val="da-DK"/>
+        </w:rPr>
+      </w:pPr>
+      <w:proofErr w:type="spellStart"/>
+      <w:r>
+        <w:rPr>
+          <w:lang w:val="da-DK"/>
+        </w:rPr>
         <w:t>Idempotence</w:t>
       </w:r>
+      <w:proofErr w:type="spellEnd"/>
+    </w:p>
+    <w:p>
+      <w:pPr>
+        <w:rPr>
+          <w:lang w:val="da-DK"/>
+        </w:rPr>
+      </w:pPr>
+      <w:r>
+        <w:rPr>
+          <w:lang w:val="da-DK"/>
+        </w:rPr>
+        <w:t xml:space="preserve">Sikrer at samtidige </w:t>
+      </w:r>
+      <w:r>
+        <w:rPr>
+          <w:lang w:val="da-DK"/>
+        </w:rPr>
+        <w:t xml:space="preserve">kald ikke tillader flere </w:t>
+      </w:r>
+      <w:proofErr w:type="spellStart"/>
+      <w:r>
+        <w:rPr>
+          <w:lang w:val="da-DK"/>
+        </w:rPr>
+        <w:t>samtidiger</w:t>
+      </w:r>
+      <w:proofErr w:type="spellEnd"/>
+      <w:r>
+        <w:rPr>
+          <w:lang w:val="da-DK"/>
+        </w:rPr>
+        <w:t xml:space="preserve"> processeringer kunne være </w:t>
+      </w:r>
+      <w:proofErr w:type="spellStart"/>
+      <w:r>
+        <w:rPr>
+          <w:lang w:val="da-DK"/>
+        </w:rPr>
+        <w:t>generareing</w:t>
+      </w:r>
+      <w:proofErr w:type="spellEnd"/>
+      <w:r>
+        <w:rPr>
+          <w:lang w:val="da-DK"/>
+        </w:rPr>
+        <w:t xml:space="preserve"> af ny </w:t>
+      </w:r>
+      <w:proofErr w:type="spellStart"/>
+      <w:r>
+        <w:rPr>
+          <w:lang w:val="da-DK"/>
+        </w:rPr>
+        <w:t>recipe</w:t>
+      </w:r>
+      <w:proofErr w:type="spellEnd"/>
+      <w:r>
+        <w:rPr>
+          <w:lang w:val="da-DK"/>
+        </w:rPr>
+        <w:t xml:space="preserve">? </w:t>
+      </w:r>
+    </w:p>
+    <w:p>
+      <w:pPr>
+        <w:rPr>
+          <w:lang w:val="da-DK"/>
+        </w:rPr>
+      </w:pPr>
+    </w:p>
+    <w:p>
+      <w:pPr>
+        <w:pStyle w:val="Heading4"/>
+      </w:pPr>
+      <w:r>
+        <w:t>Caching</w:t>
+      </w:r>
+    </w:p>
+    <w:p>
+      <w:proofErr w:type="spellStart"/>
+      <w:r>
+        <w:t>Tanstack</w:t>
+      </w:r>
+      <w:proofErr w:type="spellEnd"/>
+      <w:r>
+        <w:t xml:space="preserve"> query caching client side</w:t>
+      </w:r>
     </w:p>
     <w:p/>
     <w:p>
       <w:pPr>
         <w:pStyle w:val="Heading4"/>
-      </w:pPr>
-      <w:r>
-        <w:t>Caching</w:t>
-      </w:r>
-    </w:p>
-    <w:p>
-      <w:proofErr w:type="spellStart"/>
-      <w:r>
-        <w:t>Tanstack</w:t>
-      </w:r>
-      <w:proofErr w:type="spellEnd"/>
-      <w:r>
-        <w:t xml:space="preserve"> query caching client side</w:t>
-      </w:r>
+        <w:rPr>
+          <w:lang w:val="da-DK"/>
+        </w:rPr>
+      </w:pPr>
+      <w:r>
+        <w:rPr>
+          <w:lang w:val="da-DK"/>
+        </w:rPr>
+        <w:t>Asynchronous Messaging Pattern</w:t>
+      </w:r>
+    </w:p>
+    <w:p>
+      <w:pPr>
+        <w:rPr>
+          <w:lang w:val="da-DK"/>
+        </w:rPr>
+      </w:pPr>
+      <w:proofErr w:type="spellStart"/>
+      <w:r>
+        <w:rPr>
+          <w:lang w:val="da-DK"/>
+        </w:rPr>
+        <w:t>Sidekiq</w:t>
+      </w:r>
+      <w:proofErr w:type="spellEnd"/>
+    </w:p>
+    <w:p>
+      <w:pPr>
+        <w:rPr>
+          <w:lang w:val="da-DK"/>
+        </w:rPr>
+      </w:pPr>
+    </w:p>
+    <w:p>
+      <w:pPr>
+        <w:pStyle w:val="Heading4"/>
+        <w:rPr>
+          <w:lang w:val="da-DK"/>
+        </w:rPr>
+      </w:pPr>
+      <w:r>
+        <w:rPr>
+          <w:lang w:val="da-DK"/>
+        </w:rPr>
+        <w:t>Service til service kommunikation</w:t>
+      </w:r>
+    </w:p>
+    <w:p>
+      <w:pPr>
+        <w:rPr>
+          <w:lang w:val="da-DK"/>
+        </w:rPr>
+      </w:pPr>
+      <w:r>
+        <w:rPr>
+          <w:lang w:val="da-DK"/>
+        </w:rPr>
+        <w:t xml:space="preserve">Kommunikationen </w:t>
+      </w:r>
+      <w:proofErr w:type="spellStart"/>
+      <w:r>
+        <w:rPr>
+          <w:lang w:val="da-DK"/>
+        </w:rPr>
+        <w:t>RabbitMQ</w:t>
+      </w:r>
+      <w:proofErr w:type="spellEnd"/>
+    </w:p>
+    <w:p>
+      <w:pPr>
+        <w:rPr>
+          <w:lang w:val="da-DK"/>
+        </w:rPr>
+      </w:pPr>
+    </w:p>
+    <w:p>
+      <w:pPr>
+        <w:pStyle w:val="Heading3"/>
+        <w:rPr>
+          <w:lang w:val="da-DK"/>
+        </w:rPr>
+      </w:pPr>
+      <w:bookmarkStart w:id="7" w:name="_Toc225456215"/>
+      <w:r>
+        <w:rPr>
+          <w:lang w:val="da-DK"/>
+        </w:rPr>
+        <w:t>2.1.</w:t>
+      </w:r>
+      <w:r>
+        <w:rPr>
+          <w:lang w:val="da-DK"/>
+        </w:rPr>
+        <w:t>4</w:t>
+      </w:r>
+      <w:r>
+        <w:rPr>
+          <w:lang w:val="da-DK"/>
+        </w:rPr>
+        <w:t xml:space="preserve"> Databases</w:t>
+      </w:r>
+      <w:bookmarkEnd w:id="7"/>
+    </w:p>
+    <w:p>
+      <w:pPr>
+        <w:rPr>
+          <w:lang w:val="da-DK"/>
+        </w:rPr>
+      </w:pPr>
+      <w:r>
+        <w:rPr>
+          <w:lang w:val="da-DK"/>
+        </w:rPr>
+        <w:t xml:space="preserve">Databasen er </w:t>
+      </w:r>
+      <w:proofErr w:type="spellStart"/>
+      <w:r>
+        <w:rPr>
+          <w:lang w:val="da-DK"/>
+        </w:rPr>
+        <w:t>relationsbaseret</w:t>
+      </w:r>
+      <w:proofErr w:type="spellEnd"/>
+      <w:r>
+        <w:rPr>
+          <w:lang w:val="da-DK"/>
+        </w:rPr>
+        <w:t xml:space="preserve"> og implementeret med MySQL, hvilket sikrer konsistens og dataintegritet gennem ACID-principper.</w:t>
+      </w:r>
+    </w:p>
+    <w:p>
+      <w:pPr>
+        <w:rPr>
+          <w:lang w:val="da-DK"/>
+        </w:rPr>
+      </w:pPr>
+      <w:r>
+        <w:rPr>
+          <w:lang w:val="da-DK"/>
+        </w:rPr>
+        <w:t xml:space="preserve">Relationel MySQL, </w:t>
+      </w:r>
+      <w:proofErr w:type="spellStart"/>
+      <w:r>
+        <w:rPr>
+          <w:lang w:val="da-DK"/>
+        </w:rPr>
+        <w:t>Redis</w:t>
+      </w:r>
+      <w:proofErr w:type="spellEnd"/>
+      <w:r>
+        <w:rPr>
+          <w:lang w:val="da-DK"/>
+        </w:rPr>
+        <w:t xml:space="preserve">, man kunne have </w:t>
+      </w:r>
+      <w:r>
+        <w:rPr>
+          <w:lang w:val="da-DK"/>
+        </w:rPr>
+        <w:t xml:space="preserve">gjort brug af </w:t>
+      </w:r>
+      <w:proofErr w:type="spellStart"/>
+      <w:r>
+        <w:rPr>
+          <w:lang w:val="da-DK"/>
+        </w:rPr>
+        <w:t>mongodb</w:t>
+      </w:r>
+      <w:proofErr w:type="spellEnd"/>
+      <w:r>
+        <w:rPr>
+          <w:lang w:val="da-DK"/>
+        </w:rPr>
+        <w:t xml:space="preserve"> og med henblik på muligheden af brugere kan like og kommentere ville det kunne argumenteres for at anvende en grafbaseret database såsom Neo4j, men da projektet er stort nok i forvejen blev det ikke implementeret, men på sigt og ved skalering giver det mere mening da </w:t>
+      </w:r>
+      <w:proofErr w:type="spellStart"/>
+      <w:r>
+        <w:rPr>
+          <w:lang w:val="da-DK"/>
+        </w:rPr>
+        <w:t>graphbasret</w:t>
+      </w:r>
+      <w:proofErr w:type="spellEnd"/>
+      <w:r>
+        <w:rPr>
+          <w:lang w:val="da-DK"/>
+        </w:rPr>
+        <w:t xml:space="preserve"> </w:t>
+      </w:r>
+      <w:proofErr w:type="spellStart"/>
+      <w:r>
+        <w:rPr>
+          <w:lang w:val="da-DK"/>
+        </w:rPr>
+        <w:t>db</w:t>
+      </w:r>
+      <w:proofErr w:type="spellEnd"/>
+      <w:r>
+        <w:rPr>
+          <w:lang w:val="da-DK"/>
+        </w:rPr>
+        <w:t xml:space="preserve"> er lavet til denne type af databinding hvor brugere kan like opskrifter og </w:t>
+      </w:r>
+      <w:r>
+        <w:rPr>
+          <w:lang w:val="da-DK"/>
+        </w:rPr>
+        <w:lastRenderedPageBreak/>
+        <w:t xml:space="preserve">kommentere og på den måde har en masse nodes til andre objekter, hvor relationel </w:t>
+      </w:r>
+      <w:proofErr w:type="spellStart"/>
+      <w:r>
+        <w:rPr>
+          <w:lang w:val="da-DK"/>
+        </w:rPr>
+        <w:t>db</w:t>
+      </w:r>
+      <w:proofErr w:type="spellEnd"/>
+      <w:r>
+        <w:rPr>
+          <w:lang w:val="da-DK"/>
+        </w:rPr>
+        <w:t xml:space="preserve"> skal have mere indviklede </w:t>
+      </w:r>
+      <w:proofErr w:type="spellStart"/>
+      <w:r>
+        <w:rPr>
+          <w:lang w:val="da-DK"/>
+        </w:rPr>
+        <w:t>joins</w:t>
+      </w:r>
+      <w:proofErr w:type="spellEnd"/>
+      <w:r>
+        <w:rPr>
+          <w:lang w:val="da-DK"/>
+        </w:rPr>
+        <w:t xml:space="preserve"> og …</w:t>
+      </w:r>
+    </w:p>
+    <w:p>
+      <w:pPr>
+        <w:rPr>
+          <w:lang w:val="da-DK"/>
+        </w:rPr>
+      </w:pPr>
+    </w:p>
+    <w:p>
+      <w:pPr>
+        <w:pStyle w:val="Heading4"/>
+      </w:pPr>
+      <w:r>
+        <w:t>2.1.</w:t>
+      </w:r>
+      <w:r>
+        <w:t>4</w:t>
+      </w:r>
+      <w:r>
+        <w:t>.1 SQL Injections</w:t>
+      </w:r>
+    </w:p>
+    <w:p>
+      <w:r>
+        <w:t xml:space="preserve">Prepared statements, </w:t>
+      </w:r>
+      <w:proofErr w:type="spellStart"/>
+      <w:r>
+        <w:t>sanitering</w:t>
+      </w:r>
+      <w:proofErr w:type="spellEnd"/>
+      <w:r>
+        <w:t>/</w:t>
+      </w:r>
+      <w:proofErr w:type="spellStart"/>
+      <w:r>
+        <w:t>validering</w:t>
+      </w:r>
+      <w:proofErr w:type="spellEnd"/>
+      <w:r>
+        <w:t xml:space="preserve">, max length </w:t>
+      </w:r>
+      <w:proofErr w:type="spellStart"/>
+      <w:r>
+        <w:t>etc</w:t>
+      </w:r>
+      <w:proofErr w:type="spellEnd"/>
     </w:p>
     <w:p/>
     <w:p>
       <w:pPr>
+        <w:pStyle w:val="Heading2"/>
+        <w:rPr>
+          <w:lang w:val="da-DK"/>
+        </w:rPr>
+      </w:pPr>
+      <w:bookmarkStart w:id="8" w:name="_Toc225456216"/>
+      <w:r>
+        <w:rPr>
+          <w:lang w:val="da-DK"/>
+        </w:rPr>
+        <w:t>2.</w:t>
+      </w:r>
+      <w:r>
+        <w:rPr>
+          <w:lang w:val="da-DK"/>
+        </w:rPr>
+        <w:t>2</w:t>
+      </w:r>
+      <w:r>
+        <w:rPr>
+          <w:lang w:val="da-DK"/>
+        </w:rPr>
+        <w:t xml:space="preserve"> </w:t>
+      </w:r>
+      <w:r>
+        <w:rPr>
+          <w:lang w:val="da-DK"/>
+        </w:rPr>
+        <w:t>Environments</w:t>
+      </w:r>
+      <w:bookmarkEnd w:id="8"/>
+    </w:p>
+    <w:p>
+      <w:pPr>
+        <w:rPr>
+          <w:lang w:val="da-DK"/>
+        </w:rPr>
+      </w:pPr>
+      <w:r>
+        <w:rPr>
+          <w:lang w:val="da-DK"/>
+        </w:rPr>
+        <w:t xml:space="preserve">Munchora er hostet på en virtuel maskine hos </w:t>
+      </w:r>
+      <w:proofErr w:type="spellStart"/>
+      <w:r>
+        <w:rPr>
+          <w:lang w:val="da-DK"/>
+        </w:rPr>
+        <w:t>Linode</w:t>
+      </w:r>
+      <w:proofErr w:type="spellEnd"/>
+      <w:r>
+        <w:rPr>
+          <w:lang w:val="da-DK"/>
+        </w:rPr>
+        <w:t xml:space="preserve"> (Akamai Cloud). Jeg har valgt den mest minimalistiske konfiguration med 1 CPU-core, 1 GB RAM og 25 GB hukommelse, hvilket er rigeligt til applikationens nuværende behov. Jeg anvender Docker til mit produktionsmiljø, hvor der bygges separate images til både </w:t>
+      </w:r>
+      <w:proofErr w:type="spellStart"/>
+      <w:r>
+        <w:rPr>
+          <w:lang w:val="da-DK"/>
+        </w:rPr>
+        <w:t>backend</w:t>
+      </w:r>
+      <w:proofErr w:type="spellEnd"/>
+      <w:r>
+        <w:rPr>
+          <w:lang w:val="da-DK"/>
+        </w:rPr>
+        <w:t xml:space="preserve"> (Ruby on </w:t>
+      </w:r>
+      <w:proofErr w:type="spellStart"/>
+      <w:r>
+        <w:rPr>
+          <w:lang w:val="da-DK"/>
+        </w:rPr>
+        <w:t>Rails</w:t>
+      </w:r>
+      <w:proofErr w:type="spellEnd"/>
+      <w:r>
+        <w:rPr>
+          <w:lang w:val="da-DK"/>
+        </w:rPr>
+        <w:t xml:space="preserve">) og </w:t>
+      </w:r>
+      <w:proofErr w:type="spellStart"/>
+      <w:r>
+        <w:rPr>
+          <w:lang w:val="da-DK"/>
+        </w:rPr>
+        <w:t>frontend</w:t>
+      </w:r>
+      <w:proofErr w:type="spellEnd"/>
+      <w:r>
+        <w:rPr>
+          <w:lang w:val="da-DK"/>
+        </w:rPr>
+        <w:t xml:space="preserve"> (React Router v7), som publiceres til GitHub Container Registry (GHCR). På serveren hentes og startes disse images automatisk ved hjælp af </w:t>
+      </w:r>
+      <w:proofErr w:type="spellStart"/>
+      <w:r>
+        <w:rPr>
+          <w:lang w:val="da-DK"/>
+        </w:rPr>
+        <w:t>docker</w:t>
+      </w:r>
+      <w:proofErr w:type="spellEnd"/>
+      <w:r>
+        <w:rPr>
+          <w:lang w:val="da-DK"/>
+        </w:rPr>
+        <w:t xml:space="preserve">-compose, hvor dette simple </w:t>
+      </w:r>
+      <w:proofErr w:type="spellStart"/>
+      <w:r>
+        <w:rPr>
+          <w:lang w:val="da-DK"/>
+        </w:rPr>
+        <w:t>setup</w:t>
+      </w:r>
+      <w:proofErr w:type="spellEnd"/>
+      <w:r>
+        <w:rPr>
+          <w:lang w:val="da-DK"/>
+        </w:rPr>
+        <w:t xml:space="preserve"> gør det nemt at administrere og genstarte systemet som en samlet enhed. Applikationerne har jeg gjort tilgængelige udefra ved en opsat </w:t>
+      </w:r>
+      <w:proofErr w:type="spellStart"/>
+      <w:r>
+        <w:rPr>
+          <w:lang w:val="da-DK"/>
+        </w:rPr>
+        <w:t>Nginx</w:t>
+      </w:r>
+      <w:proofErr w:type="spellEnd"/>
+      <w:r>
+        <w:rPr>
+          <w:lang w:val="da-DK"/>
+        </w:rPr>
+        <w:t xml:space="preserve"> </w:t>
+      </w:r>
+      <w:proofErr w:type="spellStart"/>
+      <w:r>
+        <w:rPr>
+          <w:lang w:val="da-DK"/>
+        </w:rPr>
+        <w:t>reverse</w:t>
+      </w:r>
+      <w:proofErr w:type="spellEnd"/>
+      <w:r>
+        <w:rPr>
+          <w:lang w:val="da-DK"/>
+        </w:rPr>
+        <w:t xml:space="preserve"> proxy, der håndterer indgående trafik på mit domæne munchora.pro. Proxyen dirigerer forespørgsler videre til enten klient eller </w:t>
+      </w:r>
+      <w:proofErr w:type="spellStart"/>
+      <w:r>
+        <w:rPr>
+          <w:lang w:val="da-DK"/>
+        </w:rPr>
+        <w:t>backend</w:t>
+      </w:r>
+      <w:proofErr w:type="spellEnd"/>
+      <w:r>
+        <w:rPr>
+          <w:lang w:val="da-DK"/>
+        </w:rPr>
+        <w:t xml:space="preserve"> containeren afhængigt af URL-strukturen. </w:t>
+      </w:r>
+      <w:proofErr w:type="spellStart"/>
+      <w:r>
+        <w:rPr>
+          <w:lang w:val="da-DK"/>
+        </w:rPr>
+        <w:t>Requests</w:t>
+      </w:r>
+      <w:proofErr w:type="spellEnd"/>
+      <w:r>
+        <w:rPr>
+          <w:lang w:val="da-DK"/>
+        </w:rPr>
+        <w:t xml:space="preserve"> med præfikset </w:t>
+      </w:r>
+      <w:r>
+        <w:rPr>
+          <w:highlight w:val="lightGray"/>
+          <w:lang w:val="da-DK"/>
+        </w:rPr>
+        <w:t>/</w:t>
+      </w:r>
+      <w:proofErr w:type="spellStart"/>
+      <w:r>
+        <w:rPr>
+          <w:highlight w:val="lightGray"/>
+          <w:lang w:val="da-DK"/>
+        </w:rPr>
+        <w:t>api</w:t>
+      </w:r>
+      <w:proofErr w:type="spellEnd"/>
+      <w:r>
+        <w:rPr>
+          <w:highlight w:val="lightGray"/>
+          <w:lang w:val="da-DK"/>
+        </w:rPr>
+        <w:t>/v1/*</w:t>
+      </w:r>
+      <w:r>
+        <w:rPr>
+          <w:lang w:val="da-DK"/>
+        </w:rPr>
+        <w:t xml:space="preserve"> sendes til </w:t>
+      </w:r>
+      <w:proofErr w:type="spellStart"/>
+      <w:r>
+        <w:rPr>
+          <w:lang w:val="da-DK"/>
+        </w:rPr>
+        <w:t>Rails-backenden</w:t>
+      </w:r>
+      <w:proofErr w:type="spellEnd"/>
+      <w:r>
+        <w:rPr>
+          <w:lang w:val="da-DK"/>
+        </w:rPr>
+        <w:t xml:space="preserve">, mens alle andre ruter leveres fra React-klienten. Denne struktur sikrer, at både </w:t>
+      </w:r>
+      <w:proofErr w:type="spellStart"/>
+      <w:r>
+        <w:rPr>
+          <w:lang w:val="da-DK"/>
+        </w:rPr>
+        <w:t>frontend</w:t>
+      </w:r>
+      <w:proofErr w:type="spellEnd"/>
+      <w:r>
+        <w:rPr>
+          <w:lang w:val="da-DK"/>
+        </w:rPr>
+        <w:t xml:space="preserve"> og mit REST-API kan køre gnidningsfrit på samme domæne. Derudover har jeg konfigureret HTTPS ved hjælp af </w:t>
+      </w:r>
+      <w:proofErr w:type="spellStart"/>
+      <w:r>
+        <w:rPr>
+          <w:lang w:val="da-DK"/>
+        </w:rPr>
+        <w:t>Certbot</w:t>
+      </w:r>
+      <w:proofErr w:type="spellEnd"/>
+      <w:r>
+        <w:rPr>
+          <w:lang w:val="da-DK"/>
+        </w:rPr>
+        <w:t xml:space="preserve"> og </w:t>
+      </w:r>
+      <w:proofErr w:type="spellStart"/>
+      <w:r>
+        <w:rPr>
+          <w:lang w:val="da-DK"/>
+        </w:rPr>
+        <w:t>Let’s</w:t>
+      </w:r>
+      <w:proofErr w:type="spellEnd"/>
+      <w:r>
+        <w:rPr>
+          <w:lang w:val="da-DK"/>
+        </w:rPr>
+        <w:t xml:space="preserve"> </w:t>
+      </w:r>
+      <w:proofErr w:type="spellStart"/>
+      <w:r>
+        <w:rPr>
+          <w:lang w:val="da-DK"/>
+        </w:rPr>
+        <w:t>Encrypt</w:t>
+      </w:r>
+      <w:proofErr w:type="spellEnd"/>
+      <w:r>
+        <w:rPr>
+          <w:lang w:val="da-DK"/>
+        </w:rPr>
+        <w:t>, så kommunikationen mellem brugere og server er krypteret i transit. Det beskytter mod man-in-the-</w:t>
+      </w:r>
+      <w:proofErr w:type="spellStart"/>
+      <w:r>
+        <w:rPr>
+          <w:lang w:val="da-DK"/>
+        </w:rPr>
+        <w:t>middle</w:t>
+      </w:r>
+      <w:proofErr w:type="spellEnd"/>
+      <w:r>
+        <w:rPr>
+          <w:lang w:val="da-DK"/>
+        </w:rPr>
+        <w:t xml:space="preserve"> angreb</w:t>
+      </w:r>
+      <w:r>
+        <w:rPr>
+          <w:rStyle w:val="FootnoteReference"/>
+          <w:lang w:val="da-DK"/>
+        </w:rPr>
+        <w:footnoteReference w:id="1"/>
+      </w:r>
+      <w:r>
+        <w:rPr>
+          <w:lang w:val="da-DK"/>
+        </w:rPr>
+        <w:t xml:space="preserve"> og sikrer, at følsomme data, såsom loginoplysninger og API </w:t>
+      </w:r>
+      <w:proofErr w:type="spellStart"/>
+      <w:r>
+        <w:rPr>
+          <w:lang w:val="da-DK"/>
+        </w:rPr>
+        <w:t>requests</w:t>
+      </w:r>
+      <w:proofErr w:type="spellEnd"/>
+      <w:r>
+        <w:rPr>
+          <w:lang w:val="da-DK"/>
+        </w:rPr>
+        <w:t xml:space="preserve"> ikke opsnappes. Samlet set giver denne opsætning en stabil, sikker og vedligeholdelsesbar </w:t>
+      </w:r>
+      <w:proofErr w:type="spellStart"/>
+      <w:r>
+        <w:rPr>
+          <w:lang w:val="da-DK"/>
+        </w:rPr>
+        <w:t>hosting</w:t>
+      </w:r>
+      <w:proofErr w:type="spellEnd"/>
+      <w:r>
+        <w:rPr>
+          <w:lang w:val="da-DK"/>
+        </w:rPr>
+        <w:t xml:space="preserve"> løsning, hvor både </w:t>
+      </w:r>
+      <w:proofErr w:type="spellStart"/>
+      <w:r>
+        <w:rPr>
+          <w:lang w:val="da-DK"/>
+        </w:rPr>
+        <w:t>deployment</w:t>
+      </w:r>
+      <w:proofErr w:type="spellEnd"/>
+      <w:r>
+        <w:rPr>
+          <w:lang w:val="da-DK"/>
+        </w:rPr>
+        <w:t xml:space="preserve"> og drift kan håndteres effektivt med få kommandoer. Det gør det nemt for mig at fortsætte udviklingen af Munchora, uden at driftsdelen bliver en flaskehals.</w:t>
+      </w:r>
+    </w:p>
+    <w:p>
+      <w:pPr>
+        <w:rPr>
+          <w:lang w:val="da-DK"/>
+        </w:rPr>
+      </w:pPr>
+    </w:p>
+    <w:p>
+      <w:pPr>
+        <w:pStyle w:val="Heading3"/>
+      </w:pPr>
+      <w:bookmarkStart w:id="9" w:name="_Toc225456217"/>
+      <w:r>
+        <w:lastRenderedPageBreak/>
+        <w:t>2.2.1 Development</w:t>
+      </w:r>
+      <w:bookmarkEnd w:id="9"/>
+    </w:p>
+    <w:p>
+      <w:r>
+        <w:t>Docker-compose</w:t>
+      </w:r>
+    </w:p>
+    <w:p>
+      <w:proofErr w:type="spellStart"/>
+      <w:r>
+        <w:t>Minikube</w:t>
+      </w:r>
+      <w:proofErr w:type="spellEnd"/>
+      <w:r>
+        <w:t xml:space="preserve"> </w:t>
+      </w:r>
+      <w:proofErr w:type="spellStart"/>
+      <w:r>
+        <w:t>kubectl</w:t>
+      </w:r>
+      <w:proofErr w:type="spellEnd"/>
+      <w:r>
+        <w:t>, k9s</w:t>
+      </w:r>
+    </w:p>
+    <w:p/>
+    <w:p>
+      <w:pPr>
+        <w:pStyle w:val="Heading3"/>
+      </w:pPr>
+      <w:bookmarkStart w:id="10" w:name="_Toc225456218"/>
+      <w:r>
+        <w:t>2.2.2 Production</w:t>
+      </w:r>
+      <w:bookmarkEnd w:id="10"/>
+    </w:p>
+    <w:p/>
+    <w:p>
+      <w:pPr>
         <w:pStyle w:val="Heading4"/>
-        <w:rPr>
-          <w:lang w:val="da-DK"/>
-        </w:rPr>
-      </w:pPr>
-      <w:r>
-        <w:rPr>
-          <w:lang w:val="da-DK"/>
-        </w:rPr>
-        <w:t>Asynchronous Messaging Pattern</w:t>
-      </w:r>
-    </w:p>
-    <w:p>
-      <w:pPr>
-        <w:rPr>
-          <w:lang w:val="da-DK"/>
-        </w:rPr>
-      </w:pPr>
-      <w:proofErr w:type="spellStart"/>
-      <w:r>
-        <w:rPr>
-          <w:lang w:val="da-DK"/>
-        </w:rPr>
-        <w:t>Sidekiq</w:t>
-      </w:r>
-      <w:proofErr w:type="spellEnd"/>
-    </w:p>
-    <w:p>
-      <w:pPr>
-        <w:rPr>
-          <w:lang w:val="da-DK"/>
-        </w:rPr>
-      </w:pPr>
-    </w:p>
-    <w:p>
-      <w:pPr>
-        <w:pStyle w:val="Heading4"/>
-        <w:rPr>
-          <w:lang w:val="da-DK"/>
-        </w:rPr>
-      </w:pPr>
-      <w:r>
-        <w:rPr>
-          <w:lang w:val="da-DK"/>
-        </w:rPr>
-        <w:t>Service til service kommunikation</w:t>
-      </w:r>
-    </w:p>
-    <w:p>
-      <w:pPr>
-        <w:rPr>
-          <w:lang w:val="da-DK"/>
-        </w:rPr>
-      </w:pPr>
-      <w:r>
-        <w:rPr>
-          <w:lang w:val="da-DK"/>
-        </w:rPr>
-        <w:t xml:space="preserve">Kommunikationen </w:t>
-      </w:r>
-      <w:proofErr w:type="spellStart"/>
-      <w:r>
-        <w:rPr>
-          <w:lang w:val="da-DK"/>
-        </w:rPr>
-        <w:t>RabbitMQ</w:t>
-      </w:r>
-      <w:proofErr w:type="spellEnd"/>
-    </w:p>
-    <w:p>
-      <w:pPr>
-        <w:rPr>
-          <w:lang w:val="da-DK"/>
-        </w:rPr>
-      </w:pPr>
-    </w:p>
-    <w:p>
-      <w:pPr>
-        <w:pStyle w:val="Heading3"/>
-        <w:rPr>
-          <w:lang w:val="da-DK"/>
-        </w:rPr>
-      </w:pPr>
-      <w:bookmarkStart w:id="7" w:name="_Toc225456215"/>
-      <w:r>
-        <w:rPr>
-          <w:lang w:val="da-DK"/>
-        </w:rPr>
-        <w:t>2.1.</w:t>
-      </w:r>
-      <w:r>
-        <w:rPr>
-          <w:lang w:val="da-DK"/>
-        </w:rPr>
-        <w:t>4</w:t>
-      </w:r>
-      <w:r>
-        <w:rPr>
-          <w:lang w:val="da-DK"/>
-        </w:rPr>
-        <w:t xml:space="preserve"> Databases</w:t>
-      </w:r>
-      <w:bookmarkEnd w:id="7"/>
-    </w:p>
-    <w:p>
-      <w:pPr>
-        <w:rPr>
-          <w:lang w:val="da-DK"/>
-        </w:rPr>
-      </w:pPr>
-      <w:r>
-        <w:rPr>
-          <w:lang w:val="da-DK"/>
-        </w:rPr>
-        <w:t xml:space="preserve">Databasen er </w:t>
-      </w:r>
-      <w:proofErr w:type="spellStart"/>
-      <w:r>
-        <w:rPr>
-          <w:lang w:val="da-DK"/>
-        </w:rPr>
-        <w:t>relationsbaseret</w:t>
-      </w:r>
-      <w:proofErr w:type="spellEnd"/>
-      <w:r>
-        <w:rPr>
-          <w:lang w:val="da-DK"/>
-        </w:rPr>
-        <w:t xml:space="preserve"> og implementeret med MySQL, hvilket sikrer konsistens og dataintegritet gennem ACID-principper.</w:t>
-      </w:r>
-    </w:p>
-    <w:p>
-      <w:pPr>
-        <w:rPr>
-          <w:lang w:val="da-DK"/>
-        </w:rPr>
-      </w:pPr>
-      <w:r>
-        <w:rPr>
-          <w:lang w:val="da-DK"/>
-        </w:rPr>
-        <w:t xml:space="preserve">Relationel MySQL, </w:t>
-      </w:r>
-      <w:proofErr w:type="spellStart"/>
-      <w:r>
-        <w:rPr>
-          <w:lang w:val="da-DK"/>
-        </w:rPr>
-        <w:t>Redis</w:t>
-      </w:r>
-      <w:proofErr w:type="spellEnd"/>
-      <w:r>
-        <w:rPr>
-          <w:lang w:val="da-DK"/>
-        </w:rPr>
-        <w:t xml:space="preserve">, man kunne have </w:t>
-      </w:r>
-      <w:r>
-        <w:rPr>
-          <w:lang w:val="da-DK"/>
-        </w:rPr>
-        <w:t xml:space="preserve">gjort brug af </w:t>
-      </w:r>
-      <w:proofErr w:type="spellStart"/>
-      <w:r>
-        <w:rPr>
-          <w:lang w:val="da-DK"/>
-        </w:rPr>
-        <w:t>mongodb</w:t>
-      </w:r>
-      <w:proofErr w:type="spellEnd"/>
-      <w:r>
-        <w:rPr>
-          <w:lang w:val="da-DK"/>
-        </w:rPr>
-        <w:t xml:space="preserve"> og med henblik på muligheden af brugere kan like og kommentere ville det kunne argumenteres for at anvende en grafbaseret database såsom Neo4j, men da projektet er stort nok i forvejen blev det ikke implementeret, men på sigt og ved skalering giver det mere mening da </w:t>
-      </w:r>
-      <w:proofErr w:type="spellStart"/>
-      <w:r>
-        <w:rPr>
-          <w:lang w:val="da-DK"/>
-        </w:rPr>
-        <w:t>graphbasret</w:t>
-      </w:r>
-      <w:proofErr w:type="spellEnd"/>
-      <w:r>
-        <w:rPr>
-          <w:lang w:val="da-DK"/>
-        </w:rPr>
+      </w:pPr>
+      <w:r>
+        <w:t>2.2.2.1 Monitoring, Logging &amp; Tracing</w:t>
+      </w:r>
+    </w:p>
+    <w:p>
+      <w:proofErr w:type="spellStart"/>
+      <w:r>
+        <w:t>Newrelic</w:t>
+      </w:r>
+      <w:proofErr w:type="spellEnd"/>
+    </w:p>
+    <w:p/>
+    <w:p>
+      <w:pPr>
+        <w:pStyle w:val="Heading1"/>
+      </w:pPr>
+      <w:bookmarkStart w:id="11" w:name="_Toc225456219"/>
+      <w:r>
+        <w:t>3.0</w:t>
+      </w:r>
+      <w:r>
         <w:t xml:space="preserve"> </w:t>
       </w:r>
       <w:proofErr w:type="spellStart"/>
       <w:r>
-        <w:rPr>
-          <w:lang w:val="da-DK"/>
-        </w:rPr>
-        <w:t>db</w:t>
-      </w:r>
-      <w:proofErr w:type="spellEnd"/>
-      <w:r>
-        <w:rPr>
-          <w:lang w:val="da-DK"/>
-        </w:rPr>
-        <w:t xml:space="preserve"> er lavet til denne type af databinding hvor brugere kan like opskrifter og kommentere og på den måde har en masse nodes til andre objekter, hvor relationel </w:t>
-      </w:r>
-      <w:proofErr w:type="spellStart"/>
-      <w:r>
-        <w:rPr>
-          <w:lang w:val="da-DK"/>
-        </w:rPr>
-        <w:t>db</w:t>
-      </w:r>
-      <w:proofErr w:type="spellEnd"/>
-      <w:r>
-        <w:rPr>
-          <w:lang w:val="da-DK"/>
-        </w:rPr>
-        <w:t xml:space="preserve"> skal have mere indviklede </w:t>
-      </w:r>
-      <w:proofErr w:type="spellStart"/>
-      <w:r>
-        <w:rPr>
-          <w:lang w:val="da-DK"/>
-        </w:rPr>
-        <w:t>joins</w:t>
-      </w:r>
-      <w:proofErr w:type="spellEnd"/>
-      <w:r>
-        <w:rPr>
-          <w:lang w:val="da-DK"/>
-        </w:rPr>
-        <w:t xml:space="preserve"> og …</w:t>
-      </w:r>
-    </w:p>
-    <w:p>
-      <w:pPr>
-        <w:rPr>
-          <w:lang w:val="da-DK"/>
-        </w:rPr>
-      </w:pPr>
-    </w:p>
-    <w:p>
-      <w:pPr>
-        <w:pStyle w:val="Heading4"/>
-      </w:pPr>
-      <w:r>
-        <w:lastRenderedPageBreak/>
-        <w:t>2.1.</w:t>
-      </w:r>
-      <w:r>
-        <w:t>4</w:t>
-      </w:r>
-      <w:r>
-        <w:t>.1 SQL Injections</w:t>
-      </w:r>
-    </w:p>
-    <w:p>
-      <w:r>
-        <w:t xml:space="preserve">Prepared statements, </w:t>
-      </w:r>
-      <w:proofErr w:type="spellStart"/>
-      <w:r>
-        <w:t>sanitering</w:t>
-      </w:r>
-      <w:proofErr w:type="spellEnd"/>
-      <w:r>
-        <w:t>/</w:t>
-      </w:r>
-      <w:proofErr w:type="spellStart"/>
-      <w:r>
-        <w:t>validering</w:t>
-      </w:r>
-      <w:proofErr w:type="spellEnd"/>
-      <w:r>
-        <w:t xml:space="preserve">, max length </w:t>
-      </w:r>
-      <w:proofErr w:type="spellStart"/>
-      <w:r>
-        <w:t>etc</w:t>
-      </w:r>
-      <w:proofErr w:type="spellEnd"/>
-    </w:p>
-    <w:p/>
-    <w:p>
-      <w:pPr>
-        <w:pStyle w:val="Heading2"/>
-      </w:pPr>
-      <w:bookmarkStart w:id="8" w:name="_Toc225456216"/>
-      <w:r>
-        <w:t>2.</w:t>
-      </w:r>
-      <w:r>
-        <w:t>2</w:t>
-      </w:r>
-      <w:r>
+        <w:t>Udviklingsproces</w:t>
+      </w:r>
+      <w:bookmarkEnd w:id="11"/>
+      <w:proofErr w:type="spellEnd"/>
+    </w:p>
+    <w:p>
+      <w:pPr>
+        <w:rPr>
+          <w:lang w:val="da-DK"/>
+        </w:rPr>
+      </w:pPr>
+      <w:r>
+        <w:rPr>
+          <w:lang w:val="da-DK"/>
+        </w:rPr>
+        <w:t>Dette afsnit beskriver den anvendte udviklingsproces i projektet samt de overvejelser, der ligger bag valget af arbejdsmetode. Der gives et overblik over, hvordan udviklingen er struktureret i praksis, samt hvilke værktøjer der er anvendt til planlægning og opgavestyring. Afslutningsvis perspektiveres der til, hvordan processen kunne have været tilrettelagt i et team</w:t>
+      </w:r>
+      <w:r>
+        <w:rPr>
+          <w:lang w:val="da-DK"/>
+        </w:rPr>
         <w:t xml:space="preserve"> </w:t>
       </w:r>
       <w:r>
-        <w:t>Environments</w:t>
-      </w:r>
-      <w:bookmarkEnd w:id="8"/>
-    </w:p>
-    <w:p>
-      <w:pPr>
-        <w:rPr>
-          <w:lang w:val="da-DK"/>
-        </w:rPr>
-      </w:pPr>
-      <w:r>
-        <w:rPr>
-          <w:lang w:val="da-DK"/>
-        </w:rPr>
-        <w:t xml:space="preserve">Munchora er hostet på en virtuel maskine hos </w:t>
-      </w:r>
-      <w:proofErr w:type="spellStart"/>
-      <w:r>
-        <w:rPr>
-          <w:lang w:val="da-DK"/>
-        </w:rPr>
-        <w:t>Linode</w:t>
-      </w:r>
-      <w:proofErr w:type="spellEnd"/>
-      <w:r>
-        <w:rPr>
-          <w:lang w:val="da-DK"/>
-        </w:rPr>
-        <w:t xml:space="preserve"> (Akamai Cloud). Jeg har valgt den mest minimalistiske konfiguration med 1 CPU-core, 1 GB RAM og 25 GB hukommelse, hvilket er rigeligt til applikationens nuværende behov. Jeg anvender Docker til mit produktionsmiljø, hvor der bygges separate images til både </w:t>
-      </w:r>
-      <w:proofErr w:type="spellStart"/>
-      <w:r>
-        <w:rPr>
-          <w:lang w:val="da-DK"/>
-        </w:rPr>
-        <w:t>backend</w:t>
-      </w:r>
-      <w:proofErr w:type="spellEnd"/>
-      <w:r>
-        <w:rPr>
-          <w:lang w:val="da-DK"/>
-        </w:rPr>
-        <w:t xml:space="preserve"> (Ruby on </w:t>
-      </w:r>
-      <w:proofErr w:type="spellStart"/>
-      <w:r>
-        <w:rPr>
-          <w:lang w:val="da-DK"/>
-        </w:rPr>
-        <w:t>Rails</w:t>
-      </w:r>
-      <w:proofErr w:type="spellEnd"/>
-      <w:r>
-        <w:rPr>
-          <w:lang w:val="da-DK"/>
-        </w:rPr>
-        <w:t xml:space="preserve">) og </w:t>
-      </w:r>
-      <w:proofErr w:type="spellStart"/>
-      <w:r>
-        <w:rPr>
-          <w:lang w:val="da-DK"/>
-        </w:rPr>
-        <w:t>frontend</w:t>
-      </w:r>
-      <w:proofErr w:type="spellEnd"/>
-      <w:r>
-        <w:rPr>
-          <w:lang w:val="da-DK"/>
-        </w:rPr>
-        <w:t xml:space="preserve"> (React Router v7), som publiceres til GitHub Container Registry (GHCR). På serveren hentes og startes disse images automatisk ved hjælp af </w:t>
-      </w:r>
-      <w:proofErr w:type="spellStart"/>
-      <w:r>
-        <w:rPr>
-          <w:lang w:val="da-DK"/>
-        </w:rPr>
-        <w:t>docker</w:t>
-      </w:r>
-      <w:proofErr w:type="spellEnd"/>
-      <w:r>
-        <w:rPr>
-          <w:lang w:val="da-DK"/>
-        </w:rPr>
-        <w:t xml:space="preserve">-compose, hvor dette simple </w:t>
+        <w:rPr>
+          <w:lang w:val="da-DK"/>
+        </w:rPr>
+        <w:t xml:space="preserve">baseret </w:t>
       </w:r>
       <w:proofErr w:type="spellStart"/>
       <w:r>
@@ -5665,321 +6268,16 @@
         <w:rPr>
           <w:lang w:val="da-DK"/>
         </w:rPr>
-        <w:t xml:space="preserve"> gør det nemt at administrere og genstarte systemet som en samlet enhed. Applikationerne har jeg gjort tilgængelige udefra ved en opsat </w:t>
-      </w:r>
-      <w:proofErr w:type="spellStart"/>
-      <w:r>
-        <w:rPr>
-          <w:lang w:val="da-DK"/>
-        </w:rPr>
-        <w:t>Nginx</w:t>
-      </w:r>
-      <w:proofErr w:type="spellEnd"/>
-      <w:r>
-        <w:rPr>
-          <w:lang w:val="da-DK"/>
-        </w:rPr>
-        <w:t xml:space="preserve"> </w:t>
-      </w:r>
-      <w:proofErr w:type="spellStart"/>
-      <w:r>
-        <w:rPr>
-          <w:lang w:val="da-DK"/>
-        </w:rPr>
-        <w:t>reverse</w:t>
-      </w:r>
-      <w:proofErr w:type="spellEnd"/>
-      <w:r>
-        <w:rPr>
-          <w:lang w:val="da-DK"/>
-        </w:rPr>
-        <w:t xml:space="preserve"> proxy, der håndterer indgående trafik på mit domæne munchora.pro. Proxyen dirigerer forespørgsler videre til enten klient eller </w:t>
-      </w:r>
-      <w:proofErr w:type="spellStart"/>
-      <w:r>
-        <w:rPr>
-          <w:lang w:val="da-DK"/>
-        </w:rPr>
-        <w:t>backend</w:t>
-      </w:r>
-      <w:proofErr w:type="spellEnd"/>
-      <w:r>
-        <w:rPr>
-          <w:lang w:val="da-DK"/>
-        </w:rPr>
-        <w:t xml:space="preserve"> containeren afhængigt af URL-strukturen. </w:t>
-      </w:r>
-      <w:proofErr w:type="spellStart"/>
-      <w:r>
-        <w:rPr>
-          <w:lang w:val="da-DK"/>
-        </w:rPr>
-        <w:t>Requests</w:t>
-      </w:r>
-      <w:proofErr w:type="spellEnd"/>
-      <w:r>
-        <w:rPr>
-          <w:lang w:val="da-DK"/>
-        </w:rPr>
-        <w:t xml:space="preserve"> med præfikset </w:t>
-      </w:r>
-      <w:r>
-        <w:rPr>
-          <w:highlight w:val="lightGray"/>
-          <w:lang w:val="da-DK"/>
-        </w:rPr>
-        <w:t>/</w:t>
-      </w:r>
-      <w:proofErr w:type="spellStart"/>
-      <w:r>
-        <w:rPr>
-          <w:highlight w:val="lightGray"/>
-          <w:lang w:val="da-DK"/>
-        </w:rPr>
-        <w:t>api</w:t>
-      </w:r>
-      <w:proofErr w:type="spellEnd"/>
-      <w:r>
-        <w:rPr>
-          <w:highlight w:val="lightGray"/>
-          <w:lang w:val="da-DK"/>
-        </w:rPr>
-        <w:t>/v1/*</w:t>
-      </w:r>
-      <w:r>
-        <w:rPr>
-          <w:lang w:val="da-DK"/>
-        </w:rPr>
-        <w:t xml:space="preserve"> sendes til </w:t>
-      </w:r>
-      <w:proofErr w:type="spellStart"/>
-      <w:r>
-        <w:rPr>
-          <w:lang w:val="da-DK"/>
-        </w:rPr>
-        <w:t>Rails-backenden</w:t>
-      </w:r>
-      <w:proofErr w:type="spellEnd"/>
-      <w:r>
-        <w:rPr>
-          <w:lang w:val="da-DK"/>
-        </w:rPr>
-        <w:t xml:space="preserve">, mens alle andre ruter leveres fra React-klienten. Denne struktur sikrer, at både </w:t>
-      </w:r>
-      <w:proofErr w:type="spellStart"/>
-      <w:r>
-        <w:rPr>
-          <w:lang w:val="da-DK"/>
-        </w:rPr>
-        <w:t>frontend</w:t>
-      </w:r>
-      <w:proofErr w:type="spellEnd"/>
-      <w:r>
-        <w:rPr>
-          <w:lang w:val="da-DK"/>
-        </w:rPr>
-        <w:t xml:space="preserve"> og mit REST-API kan køre gnidningsfrit på samme domæne. Derudover har jeg konfigureret HTTPS ved hjælp af </w:t>
-      </w:r>
-      <w:proofErr w:type="spellStart"/>
-      <w:r>
-        <w:rPr>
-          <w:lang w:val="da-DK"/>
-        </w:rPr>
-        <w:t>Certbot</w:t>
-      </w:r>
-      <w:proofErr w:type="spellEnd"/>
-      <w:r>
-        <w:rPr>
-          <w:lang w:val="da-DK"/>
-        </w:rPr>
-        <w:t xml:space="preserve"> og </w:t>
-      </w:r>
-      <w:proofErr w:type="spellStart"/>
-      <w:r>
-        <w:rPr>
-          <w:lang w:val="da-DK"/>
-        </w:rPr>
-        <w:t>Let’s</w:t>
-      </w:r>
-      <w:proofErr w:type="spellEnd"/>
-      <w:r>
-        <w:rPr>
-          <w:lang w:val="da-DK"/>
-        </w:rPr>
-        <w:t xml:space="preserve"> </w:t>
-      </w:r>
-      <w:proofErr w:type="spellStart"/>
-      <w:r>
-        <w:rPr>
-          <w:lang w:val="da-DK"/>
-        </w:rPr>
-        <w:t>Encrypt</w:t>
-      </w:r>
-      <w:proofErr w:type="spellEnd"/>
-      <w:r>
-        <w:rPr>
-          <w:lang w:val="da-DK"/>
-        </w:rPr>
-        <w:t>, så kommunikationen mellem brugere og server er krypteret i transit. Det beskytter mod man-in-the-</w:t>
-      </w:r>
-      <w:proofErr w:type="spellStart"/>
-      <w:r>
-        <w:rPr>
-          <w:lang w:val="da-DK"/>
-        </w:rPr>
-        <w:t>middle</w:t>
-      </w:r>
-      <w:proofErr w:type="spellEnd"/>
-      <w:r>
-        <w:rPr>
-          <w:lang w:val="da-DK"/>
-        </w:rPr>
-        <w:t xml:space="preserve"> angreb</w:t>
-      </w:r>
-      <w:r>
-        <w:rPr>
-          <w:rStyle w:val="FootnoteReference"/>
-          <w:lang w:val="da-DK"/>
-        </w:rPr>
-        <w:footnoteReference w:id="1"/>
-      </w:r>
-      <w:r>
-        <w:rPr>
-          <w:lang w:val="da-DK"/>
-        </w:rPr>
-        <w:t xml:space="preserve"> og sikrer, at følsomme data, såsom loginoplysninger og API </w:t>
-      </w:r>
-      <w:proofErr w:type="spellStart"/>
-      <w:r>
-        <w:rPr>
-          <w:lang w:val="da-DK"/>
-        </w:rPr>
-        <w:t>requests</w:t>
-      </w:r>
-      <w:proofErr w:type="spellEnd"/>
-      <w:r>
-        <w:rPr>
-          <w:lang w:val="da-DK"/>
-        </w:rPr>
-        <w:t xml:space="preserve"> ikke opsnappes. Samlet set giver denne opsætning en stabil, sikker og vedligeholdelsesbar </w:t>
-      </w:r>
-      <w:proofErr w:type="spellStart"/>
-      <w:r>
-        <w:rPr>
-          <w:lang w:val="da-DK"/>
-        </w:rPr>
-        <w:t>hosting</w:t>
-      </w:r>
-      <w:proofErr w:type="spellEnd"/>
-      <w:r>
-        <w:rPr>
-          <w:lang w:val="da-DK"/>
-        </w:rPr>
-        <w:t xml:space="preserve"> løsning, hvor både </w:t>
-      </w:r>
-      <w:proofErr w:type="spellStart"/>
-      <w:r>
-        <w:rPr>
-          <w:lang w:val="da-DK"/>
-        </w:rPr>
-        <w:t>deployment</w:t>
-      </w:r>
-      <w:proofErr w:type="spellEnd"/>
-      <w:r>
-        <w:rPr>
-          <w:lang w:val="da-DK"/>
-        </w:rPr>
-        <w:t xml:space="preserve"> og drift kan håndteres effektivt med få kommandoer. Det gør det nemt for mig at fortsætte udviklingen af Munchora, uden at driftsdelen bliver en flaskehals.</w:t>
-      </w:r>
-    </w:p>
-    <w:p>
-      <w:pPr>
-        <w:rPr>
-          <w:lang w:val="da-DK"/>
-        </w:rPr>
-      </w:pPr>
-    </w:p>
-    <w:p>
-      <w:pPr>
-        <w:pStyle w:val="Heading3"/>
-      </w:pPr>
-      <w:bookmarkStart w:id="9" w:name="_Toc225456217"/>
-      <w:r>
-        <w:t>2.2.1 Development</w:t>
-      </w:r>
-      <w:bookmarkEnd w:id="9"/>
-    </w:p>
-    <w:p>
-      <w:r>
-        <w:t>Docker-compose</w:t>
-      </w:r>
-    </w:p>
-    <w:p>
-      <w:proofErr w:type="spellStart"/>
-      <w:r>
-        <w:t>Minikube</w:t>
-      </w:r>
-      <w:proofErr w:type="spellEnd"/>
-      <w:r>
-        <w:t xml:space="preserve"> </w:t>
-      </w:r>
-      <w:proofErr w:type="spellStart"/>
-      <w:r>
-        <w:t>kubectl</w:t>
-      </w:r>
-      <w:proofErr w:type="spellEnd"/>
-      <w:r>
-        <w:t>, k9s</w:t>
-      </w:r>
-    </w:p>
-    <w:p/>
-    <w:p>
-      <w:pPr>
-        <w:pStyle w:val="Heading3"/>
-      </w:pPr>
-      <w:bookmarkStart w:id="10" w:name="_Toc225456218"/>
-      <w:r>
-        <w:lastRenderedPageBreak/>
-        <w:t>2.2.2 Production</w:t>
-      </w:r>
-      <w:bookmarkEnd w:id="10"/>
-    </w:p>
-    <w:p/>
-    <w:p>
-      <w:pPr>
-        <w:pStyle w:val="Heading4"/>
-      </w:pPr>
-      <w:r>
-        <w:t>2.2.2.1 Monitoring, Logging &amp; Tracing</w:t>
-      </w:r>
-    </w:p>
-    <w:p>
-      <w:proofErr w:type="spellStart"/>
-      <w:r>
-        <w:t>Newrelic</w:t>
-      </w:r>
-      <w:proofErr w:type="spellEnd"/>
-    </w:p>
-    <w:p/>
-    <w:p>
-      <w:pPr>
-        <w:pStyle w:val="Heading1"/>
-      </w:pPr>
-      <w:bookmarkStart w:id="11" w:name="_Toc225456219"/>
-      <w:r>
-        <w:t>3.0</w:t>
-      </w:r>
-      <w:r>
-        <w:t xml:space="preserve"> </w:t>
-      </w:r>
-      <w:proofErr w:type="spellStart"/>
-      <w:r>
-        <w:t>Udviklingsproces</w:t>
-      </w:r>
-      <w:bookmarkEnd w:id="11"/>
-      <w:proofErr w:type="spellEnd"/>
-    </w:p>
-    <w:p/>
+        <w:t>.</w:t>
+      </w:r>
+    </w:p>
+    <w:p>
+      <w:pPr>
+        <w:rPr>
+          <w:lang w:val="da-DK"/>
+        </w:rPr>
+      </w:pPr>
+    </w:p>
     <w:p>
       <w:pPr>
         <w:pStyle w:val="Heading2"/>
@@ -6132,6 +6430,7 @@
         </w:numPr>
       </w:pPr>
       <w:r>
+        <w:lastRenderedPageBreak/>
         <w:t>Pages should load within 2 seconds under normal conditions.</w:t>
       </w:r>
     </w:p>
@@ -6213,7 +6512,6 @@
       </w:pPr>
       <w:bookmarkStart w:id="15" w:name="_Toc225456223"/>
       <w:r>
-        <w:lastRenderedPageBreak/>
         <w:t>3</w:t>
       </w:r>
       <w:r>
@@ -6226,7 +6524,75 @@
       <w:bookmarkEnd w:id="15"/>
       <w:proofErr w:type="spellEnd"/>
     </w:p>
-    <w:p/>
+    <w:p>
+      <w:pPr>
+        <w:rPr>
+          <w:lang w:val="da-DK"/>
+        </w:rPr>
+      </w:pPr>
+    </w:p>
+    <w:p>
+      <w:pPr>
+        <w:rPr>
+          <w:lang w:val="da-DK"/>
+        </w:rPr>
+      </w:pPr>
+      <w:r>
+        <w:rPr>
+          <w:lang w:val="da-DK"/>
+        </w:rPr>
+        <w:t xml:space="preserve">Jeg har arbejdet individuelt med Munchora, hvilket har gjort, at jeg ikke har fulgt en stramt veldefineret udviklingsproces. Der har ikke været behov for koordinering mellem flere udviklere og derfor er et formelt framework så som Scrum eller Extreme Programming ikkeblevet inddraget. Min udviklingsproces er i stedet blevet tilpasset efter en mere fleksibel og iterativ tilgang, hvor jeg løbende har arbejdet med implementering af features, fejlrettelser og forbedringer baseret på et kontinuerligt overblik over systemets tilstand. Denne tilgang har gjort det muligt for mig hurtigt at skifte fokus mellem forskellige dele af systemet og reagere effektivt på opståede problemstillinger uden faste ceremonier eller sprint-strukturer. Samtidig har det givet en høj grad af kontrol over prioritering og fremdrift i projektet. Hvis projektet var blevet udviklet i samarbejde med andre, ville en mere struktureret udviklingsproces have været nødvendig. I så fald ville elementer fra Scrum være relevante, herunder opdeling af sprints, prioritering af opgaver i en backlog samt afholdelse af sprint </w:t>
+      </w:r>
+      <w:proofErr w:type="spellStart"/>
+      <w:r>
+        <w:rPr>
+          <w:lang w:val="da-DK"/>
+        </w:rPr>
+        <w:t>planning</w:t>
+      </w:r>
+      <w:proofErr w:type="spellEnd"/>
+      <w:r>
+        <w:rPr>
+          <w:lang w:val="da-DK"/>
+        </w:rPr>
+        <w:t xml:space="preserve">, </w:t>
+      </w:r>
+      <w:proofErr w:type="spellStart"/>
+      <w:r>
+        <w:rPr>
+          <w:lang w:val="da-DK"/>
+        </w:rPr>
+        <w:t>review</w:t>
+      </w:r>
+      <w:proofErr w:type="spellEnd"/>
+      <w:r>
+        <w:rPr>
+          <w:lang w:val="da-DK"/>
+        </w:rPr>
+        <w:t xml:space="preserve"> og retrospektiv for at sikre fælles retning og løbende forbedring. Til trods for min fleksible tilgang har jeg anvendt værktøjet </w:t>
+      </w:r>
+      <w:proofErr w:type="spellStart"/>
+      <w:r>
+        <w:rPr>
+          <w:lang w:val="da-DK"/>
+        </w:rPr>
+        <w:t>Linear</w:t>
+      </w:r>
+      <w:proofErr w:type="spellEnd"/>
+      <w:r>
+        <w:rPr>
+          <w:lang w:val="da-DK"/>
+        </w:rPr>
+        <w:t xml:space="preserve"> til at skabe overblik over opgaver og features. Her er tasks blevet defineret og organiseret, hvilket har fungeret som støtte til planlægning og strukturering af mit arbejde. Værktøjet har, med sin AI understøttelse, bidraget til at effektivisere opgavehåndtering og skabe et kontinuerligt overblik over projektets fremdrift.</w:t>
+      </w:r>
+    </w:p>
+    <w:p>
+      <w:pPr>
+        <w:rPr>
+          <w:lang w:val="da-DK"/>
+        </w:rPr>
+      </w:pPr>
+    </w:p>
     <w:p>
       <w:pPr>
         <w:pStyle w:val="Heading1"/>
@@ -8542,7 +8908,6 @@
   <w:style w:type="character" w:default="1" w:styleId="DefaultParagraphFont">
     <w:name w:val="Default Paragraph Font"/>
     <w:uiPriority w:val="1"/>
-    <w:semiHidden/>
     <w:unhideWhenUsed/>
   </w:style>
   <w:style w:type="table" w:default="1" w:styleId="TableNormal">

</xml_diff>

<commit_message>
modification and more tests
</commit_message>
<xml_diff>
--- a/bachelor-projekt-rapport-munchora.docx
+++ b/bachelor-projekt-rapport-munchora.docx
@@ -3428,7 +3428,7 @@
         <w:rPr>
           <w:lang w:val="da-DK"/>
         </w:rPr>
-        <w:t>værktøj. Her er alle opgaver</w:t>
+        <w:t>værktøj. Her er opgaver</w:t>
       </w:r>
       <w:r>
         <w:rPr>
@@ -3440,19 +3440,7 @@
         <w:rPr>
           <w:lang w:val="da-DK"/>
         </w:rPr>
-        <w:t xml:space="preserve"> forbedringer blevet registreret</w:t>
-      </w:r>
-      <w:r>
-        <w:rPr>
-          <w:lang w:val="da-DK"/>
-        </w:rPr>
-        <w:t xml:space="preserve"> og</w:t>
-      </w:r>
-      <w:r>
-        <w:rPr>
-          <w:lang w:val="da-DK"/>
-        </w:rPr>
-        <w:t xml:space="preserve"> prioriteret, hvilket har givet </w:t>
+        <w:t xml:space="preserve"> forbedringer blevet registreret, hvilket har givet </w:t>
       </w:r>
       <w:r>
         <w:rPr>
@@ -3476,7 +3464,19 @@
         <w:rPr>
           <w:lang w:val="da-DK"/>
         </w:rPr>
-        <w:t xml:space="preserve"> fremdrift og sikret en iterativ udviklingsproces. </w:t>
+        <w:t xml:space="preserve"> </w:t>
+      </w:r>
+      <w:r>
+        <w:rPr>
+          <w:lang w:val="da-DK"/>
+        </w:rPr>
+        <w:t>udvikling</w:t>
+      </w:r>
+      <w:r>
+        <w:rPr>
+          <w:lang w:val="da-DK"/>
+        </w:rPr>
+        <w:t xml:space="preserve"> og sikret en iterativ proces. </w:t>
       </w:r>
       <w:r>
         <w:rPr>
@@ -3526,7 +3526,172 @@
         <w:rPr>
           <w:lang w:val="da-DK"/>
         </w:rPr>
-        <w:t>baseret opskriftsgenerering samt mulighed for at oprette og dele handlelister. Disse funktioner understøtter både individuel brug og samarbejde mellem brugere. Det er samtidig et centralt krav, at brugerdata håndteres sikkert og isoleret. Adgang til data på tværs af brugere er strengt kontrolleret og kræver eksplicit tilladelse, hvilket stiller krav til både autentifikation, autorisation og korrekt håndtering af datatilgange i systemets arkitektur.</w:t>
+        <w:t>basere</w:t>
+      </w:r>
+      <w:r>
+        <w:rPr>
+          <w:lang w:val="da-DK"/>
+        </w:rPr>
+        <w:t>t</w:t>
+      </w:r>
+      <w:r>
+        <w:rPr>
+          <w:lang w:val="da-DK"/>
+        </w:rPr>
+        <w:t xml:space="preserve"> opskriftsgenerering samt mulighed for at oprette og dele </w:t>
+      </w:r>
+      <w:r>
+        <w:rPr>
+          <w:lang w:val="da-DK"/>
+        </w:rPr>
+        <w:t>indkøbslister</w:t>
+      </w:r>
+      <w:r>
+        <w:rPr>
+          <w:lang w:val="da-DK"/>
+        </w:rPr>
+        <w:t>. Disse funktioner understøtter både individuel brug og samarbejde mellem brugere. Det er samtidig et centralt krav, at brugerdata håndteres sikkert og isoleret. Adgang til data på tværs af brugere er strengt kontrolleret og kræver eksplicit tilladelse, hvilket stiller krav til både autentifikation, autorisation og korrekt håndtering af datatilgange i systemets arkitektur.</w:t>
+      </w:r>
+    </w:p>
+    <w:p>
+      <w:pPr>
+        <w:rPr>
+          <w:color w:val="000000" w:themeColor="text1"/>
+          <w:lang w:val="da-DK"/>
+        </w:rPr>
+      </w:pPr>
+      <w:r>
+        <w:rPr>
+          <w:color w:val="000000" w:themeColor="text1"/>
+          <w:lang w:val="da-DK"/>
+        </w:rPr>
+        <w:t>Derudover kan veldefinerede user stories og acceptance criteria anvendes direkte som udgangspunkt for test, herunder Behavior-Driven Development (BDD), hvor kravene omsættes til konkrete scenarier. Dette skaber en stærk kobling mellem krav, implementering og validering og reducerer risikoen for misforståelser i udviklingsprocessen</w:t>
+      </w:r>
+      <w:r>
+        <w:rPr>
+          <w:color w:val="000000" w:themeColor="text1"/>
+          <w:lang w:val="da-DK"/>
+        </w:rPr>
+        <w:t>.</w:t>
+      </w:r>
+    </w:p>
+    <w:p>
+      <w:pPr>
+        <w:rPr>
+          <w:color w:val="000000" w:themeColor="text1"/>
+          <w:lang w:val="da-DK"/>
+        </w:rPr>
+      </w:pPr>
+    </w:p>
+    <w:p>
+      <w:pPr>
+        <w:rPr>
+          <w:sz w:val="20"/>
+          <w:szCs w:val="20"/>
+        </w:rPr>
+      </w:pPr>
+      <w:r>
+        <w:rPr>
+          <w:i/>
+          <w:iCs/>
+          <w:sz w:val="20"/>
+          <w:szCs w:val="20"/>
+        </w:rPr>
+        <w:lastRenderedPageBreak/>
+        <w:t>munchora/backend/shopping-lists-service/spec/requests/api/v1/shopping-lists/manage_lists_spec.rb</w:t>
+      </w:r>
+    </w:p>
+    <w:bookmarkStart w:id="4" w:name="_MON_1839066254"/>
+    <w:bookmarkEnd w:id="4"/>
+    <w:p>
+      <w:pPr>
+        <w:rPr>
+          <w:color w:val="000000" w:themeColor="text1"/>
+          <w:lang w:val="da-DK"/>
+        </w:rPr>
+      </w:pPr>
+      <w:r>
+        <w:rPr>
+          <w:noProof/>
+          <w:color w:val="000000" w:themeColor="text1"/>
+          <w:lang w:val="da-DK"/>
+        </w:rPr>
+        <w:object w:dxaOrig="9360" w:dyaOrig="9260" w14:anchorId="61CE7A0A">
+          <v:shapetype id="_x0000_t75" coordsize="21600,21600" o:spt="75" o:preferrelative="t" path="m@4@5l@4@11@9@11@9@5xe" filled="f" stroked="f">
+            <v:stroke joinstyle="miter"/>
+            <v:formulas>
+              <v:f eqn="if lineDrawn pixelLineWidth 0"/>
+              <v:f eqn="sum @0 1 0"/>
+              <v:f eqn="sum 0 0 @1"/>
+              <v:f eqn="prod @2 1 2"/>
+              <v:f eqn="prod @3 21600 pixelWidth"/>
+              <v:f eqn="prod @3 21600 pixelHeight"/>
+              <v:f eqn="sum @0 0 1"/>
+              <v:f eqn="prod @6 1 2"/>
+              <v:f eqn="prod @7 21600 pixelWidth"/>
+              <v:f eqn="sum @8 21600 0"/>
+              <v:f eqn="prod @7 21600 pixelHeight"/>
+              <v:f eqn="sum @10 21600 0"/>
+            </v:formulas>
+            <v:path o:extrusionok="f" gradientshapeok="t" o:connecttype="rect"/>
+            <o:lock v:ext="edit" aspectratio="t"/>
+          </v:shapetype>
+          <v:shape id="_x0000_i1026" type="#_x0000_t75" alt="" style="width:468.4pt;height:462.85pt;mso-width-percent:0;mso-height-percent:0;mso-width-percent:0;mso-height-percent:0" o:ole="">
+            <v:imagedata r:id="rId12" o:title=""/>
+          </v:shape>
+          <o:OLEObject Type="Embed" ProgID="Word.Document.12" ShapeID="_x0000_i1026" DrawAspect="Content" ObjectID="_1839087547" r:id="rId13">
+            <o:FieldCodes>\s</o:FieldCodes>
+          </o:OLEObject>
+        </w:object>
+      </w:r>
+    </w:p>
+    <w:p>
+      <w:pPr>
+        <w:rPr>
+          <w:i/>
+          <w:iCs/>
+          <w:lang w:val="da-DK"/>
+        </w:rPr>
+      </w:pPr>
+      <w:r>
+        <w:rPr>
+          <w:i/>
+          <w:iCs/>
+          <w:lang w:val="da-DK"/>
+        </w:rPr>
+        <w:t xml:space="preserve">Her ses skelettet </w:t>
+      </w:r>
+      <w:r>
+        <w:rPr>
+          <w:i/>
+          <w:iCs/>
+          <w:lang w:val="da-DK"/>
+        </w:rPr>
+        <w:t xml:space="preserve">for </w:t>
+      </w:r>
+      <w:r>
+        <w:rPr>
+          <w:i/>
+          <w:iCs/>
+          <w:lang w:val="da-DK"/>
+        </w:rPr>
+        <w:t xml:space="preserve">tilhørende tests </w:t>
+      </w:r>
+      <w:r>
+        <w:rPr>
+          <w:i/>
+          <w:iCs/>
+          <w:lang w:val="da-DK"/>
+        </w:rPr>
+        <w:t xml:space="preserve">for </w:t>
+      </w:r>
+      <w:r>
+        <w:rPr>
+          <w:i/>
+          <w:iCs/>
+          <w:lang w:val="da-DK"/>
+        </w:rPr>
+        <w:t>shopping-list funktionaliteten defineret i Linear</w:t>
       </w:r>
     </w:p>
     <w:p>
@@ -3543,7 +3708,7 @@
           <w:lang w:val="da-DK"/>
         </w:rPr>
       </w:pPr>
-      <w:bookmarkStart w:id="4" w:name="_Toc228117603"/>
+      <w:bookmarkStart w:id="5" w:name="_Toc228117603"/>
       <w:r>
         <w:rPr>
           <w:lang w:val="da-DK"/>
@@ -3556,7 +3721,7 @@
         </w:rPr>
         <w:t>le</w:t>
       </w:r>
-      <w:bookmarkEnd w:id="4"/>
+      <w:bookmarkEnd w:id="5"/>
     </w:p>
     <w:p>
       <w:pPr>
@@ -3574,50 +3739,56 @@
         <w:rPr>
           <w:lang w:val="da-DK"/>
         </w:rPr>
+        <w:t>egenskaber</w:t>
+      </w:r>
+      <w:r>
+        <w:rPr>
+          <w:lang w:val="da-DK"/>
+        </w:rPr>
+        <w:t xml:space="preserve"> set fra et bruger- og forretningsperspektiv. Hver feature </w:t>
+      </w:r>
+      <w:r>
+        <w:rPr>
+          <w:lang w:val="da-DK"/>
+        </w:rPr>
+        <w:t xml:space="preserve">kan </w:t>
+      </w:r>
+      <w:r>
+        <w:rPr>
+          <w:lang w:val="da-DK"/>
+        </w:rPr>
+        <w:t xml:space="preserve">nedbrydes efterfølgende i mindre, konkrete opgaver og </w:t>
+      </w:r>
+      <w:r>
+        <w:rPr>
+          <w:lang w:val="da-DK"/>
+        </w:rPr>
+        <w:t>u</w:t>
+      </w:r>
+      <w:r>
+        <w:rPr>
+          <w:lang w:val="da-DK"/>
+        </w:rPr>
+        <w:t>ser stor</w:t>
+      </w:r>
+      <w:r>
+        <w:rPr>
+          <w:lang w:val="da-DK"/>
+        </w:rPr>
+        <w:t>ies</w:t>
+      </w:r>
+      <w:r>
+        <w:rPr>
+          <w:lang w:val="da-DK"/>
+        </w:rPr>
+        <w:t xml:space="preserve">, som gør det muligt at planlægge, </w:t>
+      </w:r>
+      <w:r>
+        <w:rPr>
+          <w:lang w:val="da-DK"/>
+        </w:rPr>
         <w:lastRenderedPageBreak/>
-        <w:t>egenskaber</w:t>
-      </w:r>
-      <w:r>
-        <w:rPr>
-          <w:lang w:val="da-DK"/>
-        </w:rPr>
-        <w:t xml:space="preserve"> set fra et bruger- og forretningsperspektiv. Hver feature </w:t>
-      </w:r>
-      <w:r>
-        <w:rPr>
-          <w:lang w:val="da-DK"/>
-        </w:rPr>
-        <w:t xml:space="preserve">kan </w:t>
-      </w:r>
-      <w:r>
-        <w:rPr>
-          <w:lang w:val="da-DK"/>
-        </w:rPr>
-        <w:t xml:space="preserve">nedbrydes efterfølgende i mindre, konkrete opgaver og </w:t>
-      </w:r>
-      <w:r>
-        <w:rPr>
-          <w:lang w:val="da-DK"/>
-        </w:rPr>
-        <w:t>u</w:t>
-      </w:r>
-      <w:r>
-        <w:rPr>
-          <w:lang w:val="da-DK"/>
-        </w:rPr>
-        <w:t>ser stor</w:t>
-      </w:r>
-      <w:r>
-        <w:rPr>
-          <w:lang w:val="da-DK"/>
-        </w:rPr>
-        <w:t>ies</w:t>
-      </w:r>
-      <w:r>
-        <w:rPr>
-          <w:lang w:val="da-DK"/>
-        </w:rPr>
-        <w:t>, som gør det muligt at planlægge, implementere og validere funktionaliteten iterativt. Denne opdeling sikrer, at komplekse funktioner bliver håndterbare og kan udvikles trinvis, samtidig med at der bevares en klar kobling mellem overordnede krav og den faktiske implementering.</w:t>
+        <w:t>implementere og validere funktionaliteten iterativt. Denne opdeling sikrer, at komplekse funktioner bliver håndterbare og kan udvikles trinvis, samtidig med at der bevares en klar kobling mellem overordnede krav og den faktiske implementering.</w:t>
       </w:r>
     </w:p>
     <w:p>
@@ -3979,7 +4150,7 @@
           <w:lang w:val="da-DK"/>
         </w:rPr>
       </w:pPr>
-      <w:bookmarkStart w:id="5" w:name="_Toc228117604"/>
+      <w:bookmarkStart w:id="6" w:name="_Toc228117604"/>
       <w:r>
         <w:rPr>
           <w:lang w:val="da-DK"/>
@@ -3992,7 +4163,7 @@
         </w:rPr>
         <w:t>le</w:t>
       </w:r>
-      <w:bookmarkEnd w:id="5"/>
+      <w:bookmarkEnd w:id="6"/>
     </w:p>
     <w:p>
       <w:pPr>
@@ -4044,28 +4215,28 @@
         <w:rPr>
           <w:lang w:val="da-DK"/>
         </w:rPr>
+        <w:t xml:space="preserve">Sikre høj tilgængelighed med minimal nedetid ideelt 99,0% </w:t>
+      </w:r>
+      <w:r>
+        <w:rPr>
+          <w:lang w:val="da-DK"/>
+        </w:rPr>
+        <w:t>oppetid.</w:t>
+      </w:r>
+    </w:p>
+    <w:p>
+      <w:pPr>
+        <w:rPr>
+          <w:lang w:val="da-DK"/>
+        </w:rPr>
+      </w:pPr>
+    </w:p>
+    <w:p>
+      <w:pPr>
+        <w:pStyle w:val="Heading4"/>
+      </w:pPr>
+      <w:r>
         <w:lastRenderedPageBreak/>
-        <w:t xml:space="preserve">Sikre høj tilgængelighed med minimal nedetid ideelt 99,0% </w:t>
-      </w:r>
-      <w:r>
-        <w:rPr>
-          <w:lang w:val="da-DK"/>
-        </w:rPr>
-        <w:t>oppetid.</w:t>
-      </w:r>
-    </w:p>
-    <w:p>
-      <w:pPr>
-        <w:rPr>
-          <w:lang w:val="da-DK"/>
-        </w:rPr>
-      </w:pPr>
-    </w:p>
-    <w:p>
-      <w:pPr>
-        <w:pStyle w:val="Heading4"/>
-      </w:pPr>
-      <w:r>
         <w:t>2.1.2.</w:t>
       </w:r>
       <w:r>
@@ -4242,7 +4413,7 @@
           <w:lang w:val="da-DK"/>
         </w:rPr>
       </w:pPr>
-      <w:bookmarkStart w:id="6" w:name="_Toc228117605"/>
+      <w:bookmarkStart w:id="7" w:name="_Toc228117605"/>
       <w:r>
         <w:rPr>
           <w:lang w:val="da-DK"/>
@@ -4255,7 +4426,7 @@
         </w:rPr>
         <w:t>.2 Agil udvikling</w:t>
       </w:r>
-      <w:bookmarkEnd w:id="6"/>
+      <w:bookmarkEnd w:id="7"/>
     </w:p>
     <w:p>
       <w:pPr>
@@ -4381,14 +4552,14 @@
         <w:rPr>
           <w:lang w:val="da-DK"/>
         </w:rPr>
-        <w:t xml:space="preserve">opdeling af sprints, prioritering af opgaver i en backlog samt afholdelse af sprint planning, review og </w:t>
+        <w:t xml:space="preserve">opdeling af sprints, prioritering af opgaver i en backlog samt afholdelse af sprint planning, review og retrospektiv for at sikre fælles retning og løbende forbedring. Til trods for min fleksible tilgang har jeg anvendt værktøjet Linear til at skabe overblik over opgaver og features. </w:t>
       </w:r>
       <w:r>
         <w:rPr>
           <w:lang w:val="da-DK"/>
         </w:rPr>
         <w:lastRenderedPageBreak/>
-        <w:t>retrospektiv for at sikre fælles retning og løbende forbedring. Til trods for min fleksible tilgang har jeg anvendt værktøjet Linear til at skabe overblik over opgaver og features. Her er tasks blevet defineret og organiseret, hvilket har fungeret som støtte til planlægning og strukturering af mit arbejde. Værktøjet har, med sin AI understøttelse, bidraget til at effektivisere opgavehåndtering og skabe et kontinuerligt overblik over projektets fremdrift.</w:t>
+        <w:t>Her er tasks blevet defineret og organiseret, hvilket har fungeret som støtte til planlægning og strukturering af mit arbejde. Værktøjet har, med sin AI understøttelse, bidraget til at effektivisere opgavehåndtering og skabe et kontinuerligt overblik over projektets fremdrift.</w:t>
       </w:r>
     </w:p>
     <w:p>
@@ -4405,7 +4576,7 @@
           <w:lang w:val="da-DK"/>
         </w:rPr>
       </w:pPr>
-      <w:bookmarkStart w:id="7" w:name="_Toc228117606"/>
+      <w:bookmarkStart w:id="8" w:name="_Toc228117606"/>
       <w:r>
         <w:rPr>
           <w:lang w:val="da-DK"/>
@@ -4436,7 +4607,7 @@
         </w:rPr>
         <w:t>Systemets arkitektur</w:t>
       </w:r>
-      <w:bookmarkEnd w:id="7"/>
+      <w:bookmarkEnd w:id="8"/>
     </w:p>
     <w:p>
       <w:pPr>
@@ -4630,7 +4801,7 @@
                     <pic:cNvPicPr/>
                   </pic:nvPicPr>
                   <pic:blipFill>
-                    <a:blip r:embed="rId12">
+                    <a:blip r:embed="rId14">
                       <a:extLst>
                         <a:ext uri="{28A0092B-C50C-407E-A947-70E740481C1C}">
                           <a14:useLocalDpi xmlns:a14="http://schemas.microsoft.com/office/drawing/2010/main" val="0"/>
@@ -4671,7 +4842,7 @@
           <w:lang w:val="da-DK"/>
         </w:rPr>
       </w:pPr>
-      <w:bookmarkStart w:id="8" w:name="_Toc228117607"/>
+      <w:bookmarkStart w:id="9" w:name="_Toc228117607"/>
       <w:r>
         <w:rPr>
           <w:lang w:val="da-DK"/>
@@ -4696,7 +4867,7 @@
         </w:rPr>
         <w:t>Microservices</w:t>
       </w:r>
-      <w:bookmarkEnd w:id="8"/>
+      <w:bookmarkEnd w:id="9"/>
     </w:p>
     <w:p>
       <w:pPr>
@@ -4870,7 +5041,7 @@
           <w:lang w:val="da-DK"/>
         </w:rPr>
       </w:pPr>
-      <w:bookmarkStart w:id="9" w:name="_Toc228117608"/>
+      <w:bookmarkStart w:id="10" w:name="_Toc228117608"/>
       <w:r>
         <w:rPr>
           <w:lang w:val="da-DK"/>
@@ -4884,7 +5055,7 @@
         </w:rPr>
         <w:t>.1.1 Frontend</w:t>
       </w:r>
-      <w:bookmarkEnd w:id="9"/>
+      <w:bookmarkEnd w:id="10"/>
     </w:p>
     <w:p>
       <w:pPr>
@@ -5298,7 +5469,7 @@
           <w:lang w:val="da-DK"/>
         </w:rPr>
       </w:pPr>
-      <w:bookmarkStart w:id="10" w:name="_Toc228117609"/>
+      <w:bookmarkStart w:id="11" w:name="_Toc228117609"/>
       <w:r>
         <w:rPr>
           <w:lang w:val="da-DK"/>
@@ -5329,7 +5500,7 @@
         </w:rPr>
         <w:t>Backend Services</w:t>
       </w:r>
-      <w:bookmarkEnd w:id="10"/>
+      <w:bookmarkEnd w:id="11"/>
     </w:p>
     <w:p>
       <w:pPr>
@@ -6721,14 +6892,14 @@
       <w:pPr>
         <w:pStyle w:val="Heading3"/>
       </w:pPr>
-      <w:bookmarkStart w:id="11" w:name="_Toc228117610"/>
+      <w:bookmarkStart w:id="12" w:name="_Toc228117610"/>
       <w:r>
         <w:t>3</w:t>
       </w:r>
       <w:r>
         <w:t>.1.3 DLS Patterns</w:t>
       </w:r>
-      <w:bookmarkEnd w:id="11"/>
+      <w:bookmarkEnd w:id="12"/>
     </w:p>
     <w:p>
       <w:pPr>
@@ -6955,7 +7126,7 @@
           <w:lang w:val="da-DK"/>
         </w:rPr>
       </w:pPr>
-      <w:bookmarkStart w:id="12" w:name="_Toc228117611"/>
+      <w:bookmarkStart w:id="13" w:name="_Toc228117611"/>
       <w:r>
         <w:rPr>
           <w:lang w:val="da-DK"/>
@@ -6981,7 +7152,7 @@
         </w:rPr>
         <w:t xml:space="preserve"> Databases</w:t>
       </w:r>
-      <w:bookmarkEnd w:id="12"/>
+      <w:bookmarkEnd w:id="13"/>
     </w:p>
     <w:p>
       <w:pPr>
@@ -7078,7 +7249,7 @@
           <w:lang w:val="da-DK"/>
         </w:rPr>
       </w:pPr>
-      <w:bookmarkStart w:id="13" w:name="_Toc228117612"/>
+      <w:bookmarkStart w:id="14" w:name="_Toc228117612"/>
       <w:r>
         <w:rPr>
           <w:lang w:val="da-DK"/>
@@ -7109,7 +7280,7 @@
         </w:rPr>
         <w:t>Environments</w:t>
       </w:r>
-      <w:bookmarkEnd w:id="13"/>
+      <w:bookmarkEnd w:id="14"/>
     </w:p>
     <w:p>
       <w:pPr>
@@ -7166,28 +7337,124 @@
     </w:p>
     <w:p>
       <w:pPr>
+        <w:rPr>
+          <w:lang w:val="da-DK"/>
+        </w:rPr>
+      </w:pPr>
+      <w:r>
+        <w:rPr>
+          <w:lang w:val="da-DK"/>
+        </w:rPr>
+        <w:t xml:space="preserve">Github Container Registry (GHCR) til docker images for hver service – githubaction trigger for hver gang der skubbes kode ud </w:t>
+      </w:r>
+      <w:r>
+        <w:rPr>
+          <w:i/>
+          <w:iCs/>
+          <w:lang w:val="da-DK"/>
+        </w:rPr>
+        <w:t>.github/workflows/docker-registry.yml</w:t>
+      </w:r>
+      <w:r>
+        <w:rPr>
+          <w:lang w:val="da-DK"/>
+        </w:rPr>
+        <w:t xml:space="preserve"> dette gør det nemmere hvis der var flere udviklere sikre source of trhuth… Dette burde også gøres for produktionen sådan der var en ensartet tilgang til generering af images som hver service </w:t>
+      </w:r>
+      <w:r>
+        <w:rPr>
+          <w:lang w:val="da-DK"/>
+        </w:rPr>
+        <w:t>består af i kubernetes miljøet…</w:t>
+      </w:r>
+    </w:p>
+    <w:p>
+      <w:pPr>
+        <w:rPr>
+          <w:lang w:val="da-DK"/>
+        </w:rPr>
+      </w:pPr>
+    </w:p>
+    <w:p>
+      <w:pPr>
         <w:pStyle w:val="Heading3"/>
-      </w:pPr>
-      <w:bookmarkStart w:id="14" w:name="_Toc228117613"/>
-      <w:r>
+        <w:rPr>
+          <w:lang w:val="da-DK"/>
+        </w:rPr>
+      </w:pPr>
+      <w:bookmarkStart w:id="15" w:name="_Toc228117613"/>
+      <w:r>
+        <w:rPr>
+          <w:lang w:val="da-DK"/>
+        </w:rPr>
         <w:t>3</w:t>
       </w:r>
       <w:r>
-        <w:t>.2.1 Development</w:t>
-      </w:r>
-      <w:bookmarkEnd w:id="14"/>
-    </w:p>
-    <w:p>
-      <w:r>
+        <w:rPr>
+          <w:lang w:val="da-DK"/>
+        </w:rPr>
+        <w:t xml:space="preserve">.2.1 </w:t>
+      </w:r>
+      <w:bookmarkEnd w:id="15"/>
+      <w:r>
+        <w:rPr>
+          <w:lang w:val="da-DK"/>
+        </w:rPr>
+        <w:t>Udviklingsmiljø</w:t>
+      </w:r>
+    </w:p>
+    <w:p>
+      <w:pPr>
+        <w:rPr>
+          <w:lang w:val="da-DK"/>
+        </w:rPr>
+      </w:pPr>
+      <w:r>
+        <w:rPr>
+          <w:lang w:val="da-DK"/>
+        </w:rPr>
         <w:t>Docker-compose</w:t>
       </w:r>
     </w:p>
     <w:p>
-      <w:r>
+      <w:pPr>
+        <w:rPr>
+          <w:lang w:val="da-DK"/>
+        </w:rPr>
+      </w:pPr>
+      <w:r>
+        <w:rPr>
+          <w:lang w:val="da-DK"/>
+        </w:rPr>
         <w:t>Minikube kubectl, k9s</w:t>
       </w:r>
-    </w:p>
-    <w:p/>
+      <w:r>
+        <w:rPr>
+          <w:lang w:val="da-DK"/>
+        </w:rPr>
+        <w:t xml:space="preserve">, k8s/scripts folder med scripts til at oprette og slette </w:t>
+      </w:r>
+      <w:r>
+        <w:rPr>
+          <w:lang w:val="da-DK"/>
+        </w:rPr>
+        <w:t>secrets, script til at tilføje og opsætte configs kubectl add… og ligeledes til at fjerne igen. Automatisere og fjerner behovet for at køre manuelle kommandoer ved ændring i pods/deployemnet services etc</w:t>
+      </w:r>
+    </w:p>
+    <w:p>
+      <w:pPr>
+        <w:rPr>
+          <w:lang w:val="da-DK"/>
+        </w:rPr>
+      </w:pPr>
+    </w:p>
+    <w:p>
+      <w:pPr>
+        <w:rPr>
+          <w:lang w:val="da-DK"/>
+        </w:rPr>
+      </w:pPr>
+    </w:p>
     <w:p>
       <w:pPr>
         <w:pStyle w:val="Heading3"/>
@@ -7195,7 +7462,7 @@
           <w:lang w:val="da-DK"/>
         </w:rPr>
       </w:pPr>
-      <w:bookmarkStart w:id="15" w:name="_Toc228117614"/>
+      <w:bookmarkStart w:id="16" w:name="_Toc228117614"/>
       <w:r>
         <w:rPr>
           <w:lang w:val="da-DK"/>
@@ -7206,16 +7473,28 @@
         <w:rPr>
           <w:lang w:val="da-DK"/>
         </w:rPr>
-        <w:t>.2.2 Production</w:t>
-      </w:r>
-      <w:bookmarkEnd w:id="15"/>
-    </w:p>
-    <w:p>
-      <w:pPr>
-        <w:rPr>
-          <w:lang w:val="da-DK"/>
-        </w:rPr>
-      </w:pPr>
+        <w:t>.2.2 Produ</w:t>
+      </w:r>
+      <w:bookmarkEnd w:id="16"/>
+      <w:r>
+        <w:rPr>
+          <w:lang w:val="da-DK"/>
+        </w:rPr>
+        <w:t>ktion</w:t>
+      </w:r>
+    </w:p>
+    <w:p>
+      <w:pPr>
+        <w:rPr>
+          <w:lang w:val="da-DK"/>
+        </w:rPr>
+      </w:pPr>
+      <w:r>
+        <w:rPr>
+          <w:lang w:val="da-DK"/>
+        </w:rPr>
+        <w:t>Lige nu simpel monolit docker-compose bseret nginx forwarding mellem klient og backend – burde være kubernetes AWS7Azure/Google etc.. det er dyrt…</w:t>
+      </w:r>
     </w:p>
     <w:p>
       <w:pPr>
@@ -7283,7 +7562,7 @@
           <w:lang w:val="da-DK"/>
         </w:rPr>
       </w:pPr>
-      <w:bookmarkStart w:id="16" w:name="_Toc228117615"/>
+      <w:bookmarkStart w:id="17" w:name="_Toc228117615"/>
       <w:r>
         <w:rPr>
           <w:lang w:val="da-DK"/>
@@ -7302,7 +7581,7 @@
         </w:rPr>
         <w:t xml:space="preserve"> Testing</w:t>
       </w:r>
-      <w:bookmarkEnd w:id="16"/>
+      <w:bookmarkEnd w:id="17"/>
     </w:p>
     <w:p>
       <w:pPr>
@@ -7358,7 +7637,6 @@
         <w:rPr>
           <w:lang w:val="da-DK"/>
         </w:rPr>
-        <w:lastRenderedPageBreak/>
         <w:t>Skeleton programming – start med mindste enhed i klasse / det som kompilerer med mindst muligt output. Typisk vil det være klasse navn indeholdende en tom simpel parameterløs metode der er void</w:t>
       </w:r>
     </w:p>
@@ -7681,7 +7959,14 @@
         <w:rPr>
           <w:lang w:val="da-DK"/>
         </w:rPr>
-        <w:t xml:space="preserve"> En høj test coverage kan skabe en falsk tryghed, hvis kvaliteten af testene ikke er i orden, hvor koden derfor vil fremstå korrekt verificeret af de kørte succesfulde tests, selvom den i realiteten indeholder fejl</w:t>
+        <w:t xml:space="preserve"> En høj test coverage kan skabe en falsk tryghed, hvis kvaliteten af testene ikke er i orden, hvor koden derfor vil fremstå korrekt </w:t>
+      </w:r>
+      <w:r>
+        <w:rPr>
+          <w:lang w:val="da-DK"/>
+        </w:rPr>
+        <w:lastRenderedPageBreak/>
+        <w:t>verificeret af de kørte succesfulde tests, selvom den i realiteten indeholder fejl</w:t>
       </w:r>
       <w:sdt>
         <w:sdtPr>
@@ -7798,30 +8083,11 @@
           <w:noProof/>
           <w:lang w:val="da-DK"/>
         </w:rPr>
-        <w:object w:dxaOrig="9360" w:dyaOrig="280" w14:anchorId="279F168C">
-          <v:shapetype id="_x0000_t75" coordsize="21600,21600" o:spt="75" o:preferrelative="t" path="m@4@5l@4@11@9@11@9@5xe" filled="f" stroked="f">
-            <v:stroke joinstyle="miter"/>
-            <v:formulas>
-              <v:f eqn="if lineDrawn pixelLineWidth 0"/>
-              <v:f eqn="sum @0 1 0"/>
-              <v:f eqn="sum 0 0 @1"/>
-              <v:f eqn="prod @2 1 2"/>
-              <v:f eqn="prod @3 21600 pixelWidth"/>
-              <v:f eqn="prod @3 21600 pixelHeight"/>
-              <v:f eqn="sum @0 0 1"/>
-              <v:f eqn="prod @6 1 2"/>
-              <v:f eqn="prod @7 21600 pixelWidth"/>
-              <v:f eqn="sum @8 21600 0"/>
-              <v:f eqn="prod @7 21600 pixelHeight"/>
-              <v:f eqn="sum @10 21600 0"/>
-            </v:formulas>
-            <v:path o:extrusionok="f" gradientshapeok="t" o:connecttype="rect"/>
-            <o:lock v:ext="edit" aspectratio="t"/>
-          </v:shapetype>
-          <v:shape id="_x0000_i1025" type="#_x0000_t75" alt="" style="width:468pt;height:13.8pt;mso-width-percent:0;mso-height-percent:0;mso-width-percent:0;mso-height-percent:0" o:ole="">
-            <v:imagedata r:id="rId13" o:title=""/>
+        <w:object w:dxaOrig="9360" w:dyaOrig="280" w14:anchorId="33B435A6">
+          <v:shape id="_x0000_i1025" type="#_x0000_t75" alt="" style="width:468.4pt;height:13.45pt;mso-width-percent:0;mso-height-percent:0;mso-width-percent:0;mso-height-percent:0" o:ole="">
+            <v:imagedata r:id="rId15" o:title=""/>
           </v:shape>
-          <o:OLEObject Type="Embed" ProgID="Word.Document.12" ShapeID="_x0000_i1025" DrawAspect="Content" ObjectID="_1838875477" r:id="rId14">
+          <o:OLEObject Type="Embed" ProgID="Word.Document.12" ShapeID="_x0000_i1025" DrawAspect="Content" ObjectID="_1839087548" r:id="rId16">
             <o:FieldCodes>\s</o:FieldCodes>
           </o:OLEObject>
         </w:object>
@@ -7838,7 +8104,6 @@
           <w:noProof/>
           <w:lang w:val="da-DK"/>
         </w:rPr>
-        <w:lastRenderedPageBreak/>
         <w:drawing>
           <wp:anchor distT="0" distB="0" distL="114300" distR="114300" simplePos="0" relativeHeight="251668480" behindDoc="0" locked="0" layoutInCell="1" allowOverlap="1" wp14:anchorId="33EF6AB3" wp14:editId="1DD9355F">
             <wp:simplePos x="0" y="0"/>
@@ -7863,7 +8128,7 @@
                     <pic:cNvPicPr/>
                   </pic:nvPicPr>
                   <pic:blipFill>
-                    <a:blip r:embed="rId15" cstate="print">
+                    <a:blip r:embed="rId17" cstate="print">
                       <a:extLst>
                         <a:ext uri="{28A0092B-C50C-407E-A947-70E740481C1C}">
                           <a14:useLocalDpi xmlns:a14="http://schemas.microsoft.com/office/drawing/2010/main" val="0"/>
@@ -8003,49 +8268,7 @@
           <w:lang w:val="da-DK"/>
         </w:rPr>
       </w:pPr>
-      <w:bookmarkStart w:id="17" w:name="_Toc228117616"/>
-      <w:r>
-        <w:rPr>
-          <w:lang w:val="da-DK"/>
-        </w:rPr>
-        <w:t>4</w:t>
-      </w:r>
-      <w:r>
-        <w:rPr>
-          <w:lang w:val="da-DK"/>
-        </w:rPr>
-        <w:t>.1 Unit Tests</w:t>
-      </w:r>
-      <w:bookmarkEnd w:id="17"/>
-    </w:p>
-    <w:p>
-      <w:pPr>
-        <w:rPr>
-          <w:lang w:val="da-DK"/>
-        </w:rPr>
-      </w:pPr>
-      <w:r>
-        <w:rPr>
-          <w:lang w:val="da-DK"/>
-        </w:rPr>
-        <w:t>Har forsøgt at implementere fuldstændige unit tests med høj coverage for kerne funktioner såsom user model, recipe, shoppinglists hvor der her er anvendt principper fra både white box og black box 3 point boundary value analysis… test coverage og branch coverage for at afdække mulige eksekverings flows….</w:t>
-      </w:r>
-    </w:p>
-    <w:p>
-      <w:pPr>
-        <w:rPr>
-          <w:lang w:val="da-DK"/>
-        </w:rPr>
-      </w:pPr>
-    </w:p>
-    <w:p>
-      <w:pPr>
-        <w:pStyle w:val="Heading2"/>
-        <w:rPr>
-          <w:lang w:val="da-DK"/>
-        </w:rPr>
-      </w:pPr>
-      <w:bookmarkStart w:id="18" w:name="_Toc228117617"/>
+      <w:bookmarkStart w:id="18" w:name="_Toc228117616"/>
       <w:r>
         <w:rPr>
           <w:lang w:val="da-DK"/>
@@ -8057,9 +8280,51 @@
         <w:rPr>
           <w:lang w:val="da-DK"/>
         </w:rPr>
+        <w:t>.1 Unit Tests</w:t>
+      </w:r>
+      <w:bookmarkEnd w:id="18"/>
+    </w:p>
+    <w:p>
+      <w:pPr>
+        <w:rPr>
+          <w:lang w:val="da-DK"/>
+        </w:rPr>
+      </w:pPr>
+      <w:r>
+        <w:rPr>
+          <w:lang w:val="da-DK"/>
+        </w:rPr>
+        <w:t>Har forsøgt at implementere fuldstændige unit tests med høj coverage for kerne funktioner såsom user model, recipe, shoppinglists hvor der her er anvendt principper fra både white box og black box 3 point boundary value analysis… test coverage og branch coverage for at afdække mulige eksekverings flows….</w:t>
+      </w:r>
+    </w:p>
+    <w:p>
+      <w:pPr>
+        <w:rPr>
+          <w:lang w:val="da-DK"/>
+        </w:rPr>
+      </w:pPr>
+    </w:p>
+    <w:p>
+      <w:pPr>
+        <w:pStyle w:val="Heading2"/>
+        <w:rPr>
+          <w:lang w:val="da-DK"/>
+        </w:rPr>
+      </w:pPr>
+      <w:bookmarkStart w:id="19" w:name="_Toc228117617"/>
+      <w:r>
+        <w:rPr>
+          <w:lang w:val="da-DK"/>
+        </w:rPr>
+        <w:t>4</w:t>
+      </w:r>
+      <w:r>
+        <w:rPr>
+          <w:lang w:val="da-DK"/>
+        </w:rPr>
         <w:t>.2 Integration Tests</w:t>
       </w:r>
-      <w:bookmarkEnd w:id="18"/>
+      <w:bookmarkEnd w:id="19"/>
     </w:p>
     <w:p>
       <w:pPr>
@@ -8082,7 +8347,7 @@
           <w:lang w:val="da-DK"/>
         </w:rPr>
       </w:pPr>
-      <w:bookmarkStart w:id="19" w:name="_Toc228117618"/>
+      <w:bookmarkStart w:id="20" w:name="_Toc228117618"/>
       <w:r>
         <w:rPr>
           <w:lang w:val="da-DK"/>
@@ -8095,7 +8360,7 @@
         </w:rPr>
         <w:t>.3 API Tests</w:t>
       </w:r>
-      <w:bookmarkEnd w:id="19"/>
+      <w:bookmarkEnd w:id="20"/>
     </w:p>
     <w:p>
       <w:pPr>
@@ -8130,7 +8395,7 @@
           <w:lang w:val="da-DK"/>
         </w:rPr>
       </w:pPr>
-      <w:bookmarkStart w:id="20" w:name="_Toc228117619"/>
+      <w:bookmarkStart w:id="21" w:name="_Toc228117619"/>
       <w:r>
         <w:rPr>
           <w:lang w:val="da-DK"/>
@@ -8143,7 +8408,7 @@
         </w:rPr>
         <w:t>.4 End to end tests</w:t>
       </w:r>
-      <w:bookmarkEnd w:id="20"/>
+      <w:bookmarkEnd w:id="21"/>
     </w:p>
     <w:p>
       <w:pPr>
@@ -8180,7 +8445,43 @@
         <w:rPr>
           <w:lang w:val="da-DK"/>
         </w:rPr>
-        <w:t>test fuld flow services imellem. Kan evt sættes op til at køre mod staging som target, hvor fuld app funktionalitet burde være ekisterende men et lukket og test sikkert miljø som ikke intefere med produktions miljø. Det giver indisgt i intended behaviour fra et bruger perspekcti…</w:t>
+        <w:t>test fuld flow services imellem. Kan evt sættes op til at køre mod staging som target, hvor fuld app funktionalitet burde være ekisterende men et lukket og test sikkert miljø som ikke intefere med produktions miljø. Det giver inds</w:t>
+      </w:r>
+      <w:r>
+        <w:rPr>
+          <w:lang w:val="da-DK"/>
+        </w:rPr>
+        <w:t>i</w:t>
+      </w:r>
+      <w:r>
+        <w:rPr>
+          <w:lang w:val="da-DK"/>
+        </w:rPr>
+        <w:t>gt i intended behaviour fra et bruger perspek</w:t>
+      </w:r>
+      <w:r>
+        <w:rPr>
+          <w:lang w:val="da-DK"/>
+        </w:rPr>
+        <w:t>t</w:t>
+      </w:r>
+      <w:r>
+        <w:rPr>
+          <w:lang w:val="da-DK"/>
+        </w:rPr>
+        <w:t>i</w:t>
+      </w:r>
+      <w:r>
+        <w:rPr>
+          <w:lang w:val="da-DK"/>
+        </w:rPr>
+        <w:t>v</w:t>
+      </w:r>
+      <w:r>
+        <w:rPr>
+          <w:lang w:val="da-DK"/>
+        </w:rPr>
+        <w:t>…</w:t>
       </w:r>
     </w:p>
     <w:p>
@@ -8197,7 +8498,7 @@
           <w:lang w:val="da-DK"/>
         </w:rPr>
       </w:pPr>
-      <w:bookmarkStart w:id="21" w:name="_Toc228117620"/>
+      <w:bookmarkStart w:id="22" w:name="_Toc228117620"/>
       <w:r>
         <w:rPr>
           <w:lang w:val="da-DK"/>
@@ -8210,7 +8511,20 @@
         </w:rPr>
         <w:t>.5 Performance Tests</w:t>
       </w:r>
-      <w:bookmarkEnd w:id="21"/>
+      <w:bookmarkEnd w:id="22"/>
+    </w:p>
+    <w:p>
+      <w:pPr>
+        <w:rPr>
+          <w:lang w:val="da-DK"/>
+        </w:rPr>
+      </w:pPr>
+      <w:r>
+        <w:rPr>
+          <w:lang w:val="da-DK"/>
+        </w:rPr>
+        <w:t>Hvad faen gør vi her – det kan sagtens testes lokalt både i docker-compose eller minikube, men ej særlig brugbart da systemet skal testes på rigtig infrastruktur som vil være kubernetes miljø enten AWS/Azure/Google... det ville være interessant at køre både spike, load, stress test og evt over en længere periode med spikes og loads for at se, om de forskellige target services vil blive skaleret yderligere op for at sikre den nødvendige skalering håndteres.</w:t>
+      </w:r>
     </w:p>
     <w:p>
       <w:pPr>
@@ -8226,7 +8540,7 @@
           <w:lang w:val="da-DK"/>
         </w:rPr>
       </w:pPr>
-      <w:bookmarkStart w:id="22" w:name="_Toc228117621"/>
+      <w:bookmarkStart w:id="23" w:name="_Toc228117621"/>
       <w:r>
         <w:rPr>
           <w:lang w:val="da-DK"/>
@@ -8239,7 +8553,7 @@
         </w:rPr>
         <w:t>.0 Konklusion</w:t>
       </w:r>
-      <w:bookmarkEnd w:id="22"/>
+      <w:bookmarkEnd w:id="23"/>
     </w:p>
     <w:p>
       <w:pPr>
@@ -8290,18 +8604,29 @@
         <w:rPr>
           <w:lang w:val="da-DK"/>
         </w:rPr>
-        <w:lastRenderedPageBreak/>
-        <w:t>Samspillet meellem services, maintainability, flere udviklere kan hurtigt hjælpe og nemmere at udvikle en sådan applikation med et klart defineret domæne og adskillelse af afhængigheder i hele systemet??</w:t>
-      </w:r>
-    </w:p>
-    <w:p>
-      <w:pPr>
-        <w:rPr>
-          <w:lang w:val="da-DK"/>
-        </w:rPr>
-      </w:pPr>
-    </w:p>
-    <w:bookmarkStart w:id="23" w:name="_Toc228117622" w:displacedByCustomXml="next"/>
+        <w:t>Samspillet</w:t>
+      </w:r>
+      <w:r>
+        <w:rPr>
+          <w:lang w:val="da-DK"/>
+        </w:rPr>
+        <w:t xml:space="preserve"> </w:t>
+      </w:r>
+      <w:r>
+        <w:rPr>
+          <w:lang w:val="da-DK"/>
+        </w:rPr>
+        <w:t>mellem services, maintainability, flere udviklere kan hurtigt hjælpe og nemmere at udvikle en sådan applikation med et klart defineret domæne og adskillelse af afhængigheder i hele systemet??</w:t>
+      </w:r>
+    </w:p>
+    <w:p>
+      <w:pPr>
+        <w:rPr>
+          <w:lang w:val="da-DK"/>
+        </w:rPr>
+      </w:pPr>
+    </w:p>
+    <w:bookmarkStart w:id="24" w:name="_Toc228117622" w:displacedByCustomXml="next"/>
     <w:sdt>
       <w:sdtPr>
         <w:rPr>
@@ -8327,7 +8652,7 @@
           <w:r>
             <w:t>.0 Litteraturliste</w:t>
           </w:r>
-          <w:bookmarkEnd w:id="23"/>
+          <w:bookmarkEnd w:id="24"/>
         </w:p>
         <w:sdt>
           <w:sdtPr>
@@ -8508,11 +8833,12 @@
           <w:lang w:val="da-DK"/>
         </w:rPr>
       </w:pPr>
-      <w:bookmarkStart w:id="24" w:name="_Toc228117623"/>
-      <w:r>
-        <w:rPr>
-          <w:lang w:val="da-DK"/>
-        </w:rPr>
+      <w:bookmarkStart w:id="25" w:name="_Toc228117623"/>
+      <w:r>
+        <w:rPr>
+          <w:lang w:val="da-DK"/>
+        </w:rPr>
+        <w:lastRenderedPageBreak/>
         <w:t>7</w:t>
       </w:r>
       <w:r>
@@ -8521,7 +8847,7 @@
         </w:rPr>
         <w:t>.0 Bilag</w:t>
       </w:r>
-      <w:bookmarkEnd w:id="24"/>
+      <w:bookmarkEnd w:id="25"/>
     </w:p>
     <w:p>
       <w:pPr>
@@ -8531,9 +8857,9 @@
       </w:pPr>
     </w:p>
     <w:sectPr>
-      <w:headerReference w:type="default" r:id="rId16"/>
-      <w:footerReference w:type="even" r:id="rId17"/>
-      <w:footerReference w:type="default" r:id="rId18"/>
+      <w:headerReference w:type="default" r:id="rId18"/>
+      <w:footerReference w:type="even" r:id="rId19"/>
+      <w:footerReference w:type="default" r:id="rId20"/>
       <w:pgSz w:w="12240" w:h="15840"/>
       <w:pgMar w:top="1440" w:right="1440" w:bottom="1440" w:left="1440" w:header="720" w:footer="720" w:gutter="0"/>
       <w:cols w:space="720"/>

</xml_diff>